<commit_message>
Consolidated models into  one notebook, updates model tests
</commit_message>
<xml_diff>
--- a/draft report/Final Project - Draft Report.docx
+++ b/draft report/Final Project - Draft Report.docx
@@ -8454,7 +8454,6 @@
         <w:t>Installation instruction, requirements.txt installation</w:t>
       </w:r>
     </w:p>
-    <w:p/>
     <w:p>
       <w:pPr>
         <w:rPr>
@@ -8465,15 +8464,151 @@
         <w:rPr>
           <w:color w:val="EE0000"/>
         </w:rPr>
-        <w:t>Testing Plan</w:t>
-      </w:r>
-    </w:p>
-    <w:p>
-      <w:pPr>
+        <w:t xml:space="preserve">Testing </w:t>
+      </w:r>
+      <w:r>
         <w:rPr>
           <w:color w:val="EE0000"/>
         </w:rPr>
-      </w:pPr>
+        <w:t>Plan</w:t>
+      </w:r>
+      <w:r>
+        <w:rPr>
+          <w:color w:val="EE0000"/>
+        </w:rPr>
+        <w:t xml:space="preserve"> </w:t>
+      </w:r>
+      <w:proofErr w:type="gramStart"/>
+      <w:r>
+        <w:rPr>
+          <w:color w:val="EE0000"/>
+        </w:rPr>
+        <w:t>-  Jupyter</w:t>
+      </w:r>
+      <w:proofErr w:type="gramEnd"/>
+      <w:r>
+        <w:rPr>
+          <w:color w:val="EE0000"/>
+        </w:rPr>
+        <w:t xml:space="preserve"> Notebook</w:t>
+      </w:r>
+    </w:p>
+    <w:p>
+      <w:pPr>
+        <w:pStyle w:val="ListParagraph"/>
+        <w:numPr>
+          <w:ilvl w:val="0"/>
+          <w:numId w:val="21"/>
+        </w:numPr>
+        <w:rPr>
+          <w:color w:val="EE0000"/>
+        </w:rPr>
+      </w:pPr>
+      <w:r>
+        <w:rPr>
+          <w:color w:val="EE0000"/>
+        </w:rPr>
+        <w:t>Proof of concept (Unit Testing)</w:t>
+      </w:r>
+    </w:p>
+    <w:p>
+      <w:pPr>
+        <w:pStyle w:val="ListParagraph"/>
+        <w:numPr>
+          <w:ilvl w:val="1"/>
+          <w:numId w:val="21"/>
+        </w:numPr>
+        <w:rPr>
+          <w:color w:val="EE0000"/>
+        </w:rPr>
+      </w:pPr>
+      <w:r>
+        <w:rPr>
+          <w:color w:val="EE0000"/>
+        </w:rPr>
+        <w:t xml:space="preserve">test models individually with inputs </w:t>
+      </w:r>
+    </w:p>
+    <w:p>
+      <w:pPr>
+        <w:pStyle w:val="ListParagraph"/>
+        <w:numPr>
+          <w:ilvl w:val="1"/>
+          <w:numId w:val="21"/>
+        </w:numPr>
+        <w:rPr>
+          <w:color w:val="EE0000"/>
+        </w:rPr>
+      </w:pPr>
+      <w:r>
+        <w:rPr>
+          <w:color w:val="EE0000"/>
+        </w:rPr>
+        <w:t>Calculate metrics</w:t>
+      </w:r>
+    </w:p>
+    <w:p>
+      <w:pPr>
+        <w:pStyle w:val="ListParagraph"/>
+        <w:numPr>
+          <w:ilvl w:val="1"/>
+          <w:numId w:val="21"/>
+        </w:numPr>
+        <w:rPr>
+          <w:color w:val="EE0000"/>
+        </w:rPr>
+      </w:pPr>
+      <w:r>
+        <w:rPr>
+          <w:color w:val="EE0000"/>
+        </w:rPr>
+        <w:t xml:space="preserve">Implement evaluator functions to filter input </w:t>
+      </w:r>
+    </w:p>
+    <w:p>
+      <w:pPr>
+        <w:pStyle w:val="ListParagraph"/>
+        <w:ind w:left="1440"/>
+        <w:rPr>
+          <w:color w:val="EE0000"/>
+        </w:rPr>
+      </w:pPr>
+    </w:p>
+    <w:p>
+      <w:pPr>
+        <w:pStyle w:val="ListParagraph"/>
+        <w:numPr>
+          <w:ilvl w:val="0"/>
+          <w:numId w:val="21"/>
+        </w:numPr>
+        <w:rPr>
+          <w:color w:val="EE0000"/>
+        </w:rPr>
+      </w:pPr>
+      <w:r>
+        <w:rPr>
+          <w:color w:val="EE0000"/>
+        </w:rPr>
+        <w:t xml:space="preserve">Proof of Concept (Integration Testing) </w:t>
+      </w:r>
+    </w:p>
+    <w:p>
+      <w:pPr>
+        <w:pStyle w:val="ListParagraph"/>
+        <w:numPr>
+          <w:ilvl w:val="1"/>
+          <w:numId w:val="21"/>
+        </w:numPr>
+        <w:rPr>
+          <w:color w:val="EE0000"/>
+        </w:rPr>
+      </w:pPr>
+      <w:r>
+        <w:rPr>
+          <w:color w:val="EE0000"/>
+        </w:rPr>
+        <w:t>Implement full pipeline transferring outputs from components to core model</w:t>
+      </w:r>
     </w:p>
     <w:p>
       <w:r>
@@ -8590,9 +8725,6 @@
             <w:pPr>
               <w:cnfStyle w:val="000000100000" w:firstRow="0" w:lastRow="0" w:firstColumn="0" w:lastColumn="0" w:oddVBand="0" w:evenVBand="0" w:oddHBand="1" w:evenHBand="0" w:firstRowFirstColumn="0" w:firstRowLastColumn="0" w:lastRowFirstColumn="0" w:lastRowLastColumn="0"/>
             </w:pPr>
-            <w:r>
-              <w:t xml:space="preserve">Pass </w:t>
-            </w:r>
           </w:p>
         </w:tc>
       </w:tr>
@@ -8639,9 +8771,6 @@
             <w:pPr>
               <w:cnfStyle w:val="000000000000" w:firstRow="0" w:lastRow="0" w:firstColumn="0" w:lastColumn="0" w:oddVBand="0" w:evenVBand="0" w:oddHBand="0" w:evenHBand="0" w:firstRowFirstColumn="0" w:firstRowLastColumn="0" w:lastRowFirstColumn="0" w:lastRowLastColumn="0"/>
             </w:pPr>
-            <w:r>
-              <w:t xml:space="preserve">Pass </w:t>
-            </w:r>
           </w:p>
         </w:tc>
       </w:tr>
@@ -8657,38 +8786,6 @@
           <w:p>
             <w:r>
               <w:t>C003</w:t>
-            </w:r>
-          </w:p>
-        </w:tc>
-        <w:tc>
-          <w:tcPr>
-            <w:tcW w:w="2254" w:type="dxa"/>
-          </w:tcPr>
-          <w:p>
-            <w:pPr>
-              <w:cnfStyle w:val="000000100000" w:firstRow="0" w:lastRow="0" w:firstColumn="0" w:lastColumn="0" w:oddVBand="0" w:evenVBand="0" w:oddHBand="1" w:evenHBand="0" w:firstRowFirstColumn="0" w:firstRowLastColumn="0" w:lastRowFirstColumn="0" w:lastRowLastColumn="0"/>
-            </w:pPr>
-            <w:r>
-              <w:t xml:space="preserve">Load </w:t>
-            </w:r>
-            <w:proofErr w:type="spellStart"/>
-            <w:r>
-              <w:t>deBERTa</w:t>
-            </w:r>
-            <w:proofErr w:type="spellEnd"/>
-            <w:r>
-              <w:t xml:space="preserve"> (</w:t>
-            </w:r>
-            <w:proofErr w:type="spellStart"/>
-            <w:r>
-              <w:t>jiazhengli</w:t>
-            </w:r>
-            <w:proofErr w:type="spellEnd"/>
-            <w:r>
-              <w:t>/deberta-large-asap_1</w:t>
-            </w:r>
-            <w:r>
-              <w:t>)</w:t>
             </w:r>
           </w:p>
         </w:tc>
@@ -8710,9 +8807,16 @@
             <w:pPr>
               <w:cnfStyle w:val="000000100000" w:firstRow="0" w:lastRow="0" w:firstColumn="0" w:lastColumn="0" w:oddVBand="0" w:evenVBand="0" w:oddHBand="1" w:evenHBand="0" w:firstRowFirstColumn="0" w:firstRowLastColumn="0" w:lastRowFirstColumn="0" w:lastRowLastColumn="0"/>
             </w:pPr>
-            <w:r>
-              <w:t>Pass</w:t>
-            </w:r>
+          </w:p>
+        </w:tc>
+        <w:tc>
+          <w:tcPr>
+            <w:tcW w:w="2254" w:type="dxa"/>
+          </w:tcPr>
+          <w:p>
+            <w:pPr>
+              <w:cnfStyle w:val="000000100000" w:firstRow="0" w:lastRow="0" w:firstColumn="0" w:lastColumn="0" w:oddVBand="0" w:evenVBand="0" w:oddHBand="1" w:evenHBand="0" w:firstRowFirstColumn="0" w:firstRowLastColumn="0" w:lastRowFirstColumn="0" w:lastRowLastColumn="0"/>
+            </w:pPr>
           </w:p>
         </w:tc>
       </w:tr>
@@ -8846,7 +8950,6 @@
       </w:tr>
     </w:tbl>
     <w:p/>
-    <w:p/>
     <w:p>
       <w:pPr>
         <w:tabs>
@@ -8855,6 +8958,15 @@
       </w:pPr>
       <w:r>
         <w:t>Test environment: Jupyter Notebook</w:t>
+      </w:r>
+      <w:r>
+        <w:t xml:space="preserve"> </w:t>
+      </w:r>
+      <w:r>
+        <w:rPr>
+          <w:color w:val="EE0000"/>
+        </w:rPr>
+        <w:t>(24/7/2026)</w:t>
       </w:r>
       <w:r>
         <w:tab/>
@@ -9000,10 +9112,7 @@
               <w:t>Load audio file</w:t>
             </w:r>
             <w:r>
-              <w:t xml:space="preserve"> of speaker saying: </w:t>
-            </w:r>
-            <w:r>
-              <w:t>“</w:t>
+              <w:t xml:space="preserve"> of speaker saying: “</w:t>
             </w:r>
             <w:r>
               <w:t>3,000 years ago, there were 9,000 people who were less than 3,000 years old.</w:t>
@@ -9087,10 +9196,7 @@
               <w:cnfStyle w:val="000000100000" w:firstRow="0" w:lastRow="0" w:firstColumn="0" w:lastColumn="0" w:oddVBand="0" w:evenVBand="0" w:oddHBand="1" w:evenHBand="0" w:firstRowFirstColumn="0" w:firstRowLastColumn="0" w:lastRowFirstColumn="0" w:lastRowLastColumn="0"/>
             </w:pPr>
             <w:r>
-              <w:t>Pass</w:t>
-            </w:r>
-            <w:r>
-              <w:t>. 100% accuracy</w:t>
+              <w:t>Pass. 100% accuracy</w:t>
             </w:r>
           </w:p>
         </w:tc>
@@ -15158,9 +15264,9 @@
     </w:lvl>
   </w:abstractNum>
   <w:abstractNum w:abstractNumId="14" w15:restartNumberingAfterBreak="0">
-    <w:nsid w:val="65582D2B"/>
+    <w:nsid w:val="623266E0"/>
     <w:multiLevelType w:val="hybridMultilevel"/>
-    <w:tmpl w:val="5E3486F4"/>
+    <w:tmpl w:val="F028B540"/>
     <w:lvl w:ilvl="0" w:tplc="08090001">
       <w:start w:val="1"/>
       <w:numFmt w:val="bullet"/>
@@ -15271,6 +15377,119 @@
     </w:lvl>
   </w:abstractNum>
   <w:abstractNum w:abstractNumId="15" w15:restartNumberingAfterBreak="0">
+    <w:nsid w:val="65582D2B"/>
+    <w:multiLevelType w:val="hybridMultilevel"/>
+    <w:tmpl w:val="5E3486F4"/>
+    <w:lvl w:ilvl="0" w:tplc="08090001">
+      <w:start w:val="1"/>
+      <w:numFmt w:val="bullet"/>
+      <w:lvlText w:val=""/>
+      <w:lvlJc w:val="left"/>
+      <w:pPr>
+        <w:ind w:left="720" w:hanging="360"/>
+      </w:pPr>
+      <w:rPr>
+        <w:rFonts w:ascii="Symbol" w:hAnsi="Symbol" w:hint="default"/>
+      </w:rPr>
+    </w:lvl>
+    <w:lvl w:ilvl="1" w:tplc="08090003">
+      <w:start w:val="1"/>
+      <w:numFmt w:val="bullet"/>
+      <w:lvlText w:val="o"/>
+      <w:lvlJc w:val="left"/>
+      <w:pPr>
+        <w:ind w:left="1440" w:hanging="360"/>
+      </w:pPr>
+      <w:rPr>
+        <w:rFonts w:ascii="Courier New" w:hAnsi="Courier New" w:cs="Courier New" w:hint="default"/>
+      </w:rPr>
+    </w:lvl>
+    <w:lvl w:ilvl="2" w:tplc="08090005" w:tentative="1">
+      <w:start w:val="1"/>
+      <w:numFmt w:val="bullet"/>
+      <w:lvlText w:val=""/>
+      <w:lvlJc w:val="left"/>
+      <w:pPr>
+        <w:ind w:left="2160" w:hanging="360"/>
+      </w:pPr>
+      <w:rPr>
+        <w:rFonts w:ascii="Wingdings" w:hAnsi="Wingdings" w:hint="default"/>
+      </w:rPr>
+    </w:lvl>
+    <w:lvl w:ilvl="3" w:tplc="08090001" w:tentative="1">
+      <w:start w:val="1"/>
+      <w:numFmt w:val="bullet"/>
+      <w:lvlText w:val=""/>
+      <w:lvlJc w:val="left"/>
+      <w:pPr>
+        <w:ind w:left="2880" w:hanging="360"/>
+      </w:pPr>
+      <w:rPr>
+        <w:rFonts w:ascii="Symbol" w:hAnsi="Symbol" w:hint="default"/>
+      </w:rPr>
+    </w:lvl>
+    <w:lvl w:ilvl="4" w:tplc="08090003" w:tentative="1">
+      <w:start w:val="1"/>
+      <w:numFmt w:val="bullet"/>
+      <w:lvlText w:val="o"/>
+      <w:lvlJc w:val="left"/>
+      <w:pPr>
+        <w:ind w:left="3600" w:hanging="360"/>
+      </w:pPr>
+      <w:rPr>
+        <w:rFonts w:ascii="Courier New" w:hAnsi="Courier New" w:cs="Courier New" w:hint="default"/>
+      </w:rPr>
+    </w:lvl>
+    <w:lvl w:ilvl="5" w:tplc="08090005" w:tentative="1">
+      <w:start w:val="1"/>
+      <w:numFmt w:val="bullet"/>
+      <w:lvlText w:val=""/>
+      <w:lvlJc w:val="left"/>
+      <w:pPr>
+        <w:ind w:left="4320" w:hanging="360"/>
+      </w:pPr>
+      <w:rPr>
+        <w:rFonts w:ascii="Wingdings" w:hAnsi="Wingdings" w:hint="default"/>
+      </w:rPr>
+    </w:lvl>
+    <w:lvl w:ilvl="6" w:tplc="08090001" w:tentative="1">
+      <w:start w:val="1"/>
+      <w:numFmt w:val="bullet"/>
+      <w:lvlText w:val=""/>
+      <w:lvlJc w:val="left"/>
+      <w:pPr>
+        <w:ind w:left="5040" w:hanging="360"/>
+      </w:pPr>
+      <w:rPr>
+        <w:rFonts w:ascii="Symbol" w:hAnsi="Symbol" w:hint="default"/>
+      </w:rPr>
+    </w:lvl>
+    <w:lvl w:ilvl="7" w:tplc="08090003" w:tentative="1">
+      <w:start w:val="1"/>
+      <w:numFmt w:val="bullet"/>
+      <w:lvlText w:val="o"/>
+      <w:lvlJc w:val="left"/>
+      <w:pPr>
+        <w:ind w:left="5760" w:hanging="360"/>
+      </w:pPr>
+      <w:rPr>
+        <w:rFonts w:ascii="Courier New" w:hAnsi="Courier New" w:cs="Courier New" w:hint="default"/>
+      </w:rPr>
+    </w:lvl>
+    <w:lvl w:ilvl="8" w:tplc="08090005" w:tentative="1">
+      <w:start w:val="1"/>
+      <w:numFmt w:val="bullet"/>
+      <w:lvlText w:val=""/>
+      <w:lvlJc w:val="left"/>
+      <w:pPr>
+        <w:ind w:left="6480" w:hanging="360"/>
+      </w:pPr>
+      <w:rPr>
+        <w:rFonts w:ascii="Wingdings" w:hAnsi="Wingdings" w:hint="default"/>
+      </w:rPr>
+    </w:lvl>
+  </w:abstractNum>
+  <w:abstractNum w:abstractNumId="16" w15:restartNumberingAfterBreak="0">
     <w:nsid w:val="65DE470F"/>
     <w:multiLevelType w:val="hybridMultilevel"/>
     <w:tmpl w:val="B78E431A"/>
@@ -15383,7 +15602,7 @@
       </w:rPr>
     </w:lvl>
   </w:abstractNum>
-  <w:abstractNum w:abstractNumId="16" w15:restartNumberingAfterBreak="0">
+  <w:abstractNum w:abstractNumId="17" w15:restartNumberingAfterBreak="0">
     <w:nsid w:val="661B6EA6"/>
     <w:multiLevelType w:val="hybridMultilevel"/>
     <w:tmpl w:val="7194B5DA"/>
@@ -15496,7 +15715,7 @@
       </w:rPr>
     </w:lvl>
   </w:abstractNum>
-  <w:abstractNum w:abstractNumId="17" w15:restartNumberingAfterBreak="0">
+  <w:abstractNum w:abstractNumId="18" w15:restartNumberingAfterBreak="0">
     <w:nsid w:val="69C20DB5"/>
     <w:multiLevelType w:val="hybridMultilevel"/>
     <w:tmpl w:val="25DEFF8E"/>
@@ -15609,7 +15828,7 @@
       </w:rPr>
     </w:lvl>
   </w:abstractNum>
-  <w:abstractNum w:abstractNumId="18" w15:restartNumberingAfterBreak="0">
+  <w:abstractNum w:abstractNumId="19" w15:restartNumberingAfterBreak="0">
     <w:nsid w:val="6BBC6CD1"/>
     <w:multiLevelType w:val="hybridMultilevel"/>
     <w:tmpl w:val="B8E0E9B4"/>
@@ -15722,7 +15941,7 @@
       </w:rPr>
     </w:lvl>
   </w:abstractNum>
-  <w:abstractNum w:abstractNumId="19" w15:restartNumberingAfterBreak="0">
+  <w:abstractNum w:abstractNumId="20" w15:restartNumberingAfterBreak="0">
     <w:nsid w:val="7C4823A5"/>
     <w:multiLevelType w:val="hybridMultilevel"/>
     <w:tmpl w:val="6E5E980A"/>
@@ -15812,16 +16031,16 @@
     <w:abstractNumId w:val="4"/>
   </w:num>
   <w:num w:numId="2" w16cid:durableId="1625887844">
-    <w:abstractNumId w:val="17"/>
+    <w:abstractNumId w:val="18"/>
   </w:num>
   <w:num w:numId="3" w16cid:durableId="1615869907">
-    <w:abstractNumId w:val="15"/>
+    <w:abstractNumId w:val="16"/>
   </w:num>
   <w:num w:numId="4" w16cid:durableId="1774739438">
     <w:abstractNumId w:val="1"/>
   </w:num>
   <w:num w:numId="5" w16cid:durableId="290677251">
-    <w:abstractNumId w:val="14"/>
+    <w:abstractNumId w:val="15"/>
   </w:num>
   <w:num w:numId="6" w16cid:durableId="1314800344">
     <w:abstractNumId w:val="7"/>
@@ -15830,7 +16049,7 @@
     <w:abstractNumId w:val="12"/>
   </w:num>
   <w:num w:numId="8" w16cid:durableId="217129057">
-    <w:abstractNumId w:val="18"/>
+    <w:abstractNumId w:val="19"/>
   </w:num>
   <w:num w:numId="9" w16cid:durableId="1816680657">
     <w:abstractNumId w:val="6"/>
@@ -15851,7 +16070,7 @@
     <w:abstractNumId w:val="9"/>
   </w:num>
   <w:num w:numId="15" w16cid:durableId="62340989">
-    <w:abstractNumId w:val="16"/>
+    <w:abstractNumId w:val="17"/>
   </w:num>
   <w:num w:numId="16" w16cid:durableId="2124837437">
     <w:abstractNumId w:val="11"/>
@@ -15866,7 +16085,10 @@
     <w:abstractNumId w:val="8"/>
   </w:num>
   <w:num w:numId="20" w16cid:durableId="1605108735">
-    <w:abstractNumId w:val="19"/>
+    <w:abstractNumId w:val="20"/>
+  </w:num>
+  <w:num w:numId="21" w16cid:durableId="979844662">
+    <w:abstractNumId w:val="14"/>
   </w:num>
 </w:numbering>
 </file>
@@ -16472,6 +16694,7 @@
   <w:style w:type="character" w:default="1" w:styleId="DefaultParagraphFont">
     <w:name w:val="Default Paragraph Font"/>
     <w:uiPriority w:val="1"/>
+    <w:semiHidden/>
     <w:unhideWhenUsed/>
   </w:style>
   <w:style w:type="table" w:default="1" w:styleId="TableNormal">

</xml_diff>

<commit_message>
Complete Whisper testing and evaluation, along with collection of audio samples
</commit_message>
<xml_diff>
--- a/draft report/Final Project - Draft Report.docx
+++ b/draft report/Final Project - Draft Report.docx
@@ -2910,9 +2910,11 @@
         <w:spacing w:line="360" w:lineRule="auto"/>
         <w:ind w:right="971"/>
       </w:pPr>
+      <w:proofErr w:type="spellStart"/>
       <w:r>
         <w:t>BrainPower</w:t>
       </w:r>
+      <w:proofErr w:type="spellEnd"/>
       <w:r>
         <w:t xml:space="preserve">- </w:t>
       </w:r>
@@ -3768,7 +3770,15 @@
         <w:t>with Tr</w:t>
       </w:r>
       <w:r>
-        <w:t xml:space="preserve">-OCR and PaddleOCR for reliable text detection, </w:t>
+        <w:t xml:space="preserve">-OCR and </w:t>
+      </w:r>
+      <w:proofErr w:type="spellStart"/>
+      <w:r>
+        <w:t>PaddleOCR</w:t>
+      </w:r>
+      <w:proofErr w:type="spellEnd"/>
+      <w:r>
+        <w:t xml:space="preserve"> for reliable text detection, </w:t>
       </w:r>
       <w:r>
         <w:t xml:space="preserve">found </w:t>
@@ -3783,8 +3793,13 @@
         <w:t>d</w:t>
       </w:r>
       <w:r>
-        <w:t xml:space="preserve"> the best overall solution for reliable, high-accuracy container ISO code recognition with a recognition accuracy of 92% outperforming a PaddleOCR</w:t>
-      </w:r>
+        <w:t xml:space="preserve"> the best overall solution for reliable, high-accuracy container ISO code recognition with a recognition accuracy of 92% outperforming a </w:t>
+      </w:r>
+      <w:proofErr w:type="spellStart"/>
+      <w:r>
+        <w:t>PaddleOCR</w:t>
+      </w:r>
+      <w:proofErr w:type="spellEnd"/>
       <w:r>
         <w:t xml:space="preserve"> a hybrid CNN-Transformer model.</w:t>
       </w:r>
@@ -3803,7 +3818,23 @@
         </w:rPr>
       </w:pPr>
       <w:r>
-        <w:t>[13] PaddleOCR is an open scource OCR model launched by Baidu Paddle. The architecture always maintains the three-stage Pipeline design of “text-detection + direction classification + text recognition”. [13] tested the model on a</w:t>
+        <w:t xml:space="preserve">[13] </w:t>
+      </w:r>
+      <w:proofErr w:type="spellStart"/>
+      <w:r>
+        <w:t>PaddleOCR</w:t>
+      </w:r>
+      <w:proofErr w:type="spellEnd"/>
+      <w:r>
+        <w:t xml:space="preserve"> is an open </w:t>
+      </w:r>
+      <w:proofErr w:type="spellStart"/>
+      <w:r>
+        <w:t>scource</w:t>
+      </w:r>
+      <w:proofErr w:type="spellEnd"/>
+      <w:r>
+        <w:t xml:space="preserve"> OCR model launched by Baidu Paddle. The architecture always maintains the three-stage Pipeline design of “text-detection + direction classification + text recognition”. [13] tested the model on a</w:t>
       </w:r>
       <w:r>
         <w:t xml:space="preserve"> dataset containing 200 national grids stand slogans and power supply line maps collected on the spot at a power generation environment. The images were captured at different angles under varying lighting conditions. The model achieved high detection accuracy of over 95% for standardized slogans and power supply circuit diagrams. It also achieved 93.3% and 86.6% average recognition for standardized slogans and power supply circuit diagrams respectively [13]. </w:t>
@@ -4084,8 +4115,13 @@
       <w:r>
         <w:t xml:space="preserve"> some multimodal systems that share some similarity with </w:t>
       </w:r>
-      <w:r>
-        <w:t xml:space="preserve">BrainPower </w:t>
+      <w:proofErr w:type="spellStart"/>
+      <w:r>
+        <w:t>BrainPower</w:t>
+      </w:r>
+      <w:proofErr w:type="spellEnd"/>
+      <w:r>
+        <w:t xml:space="preserve"> </w:t>
       </w:r>
       <w:r>
         <w:t>but however, fail to provide in entirety for all input modalities, catering to students who have writing disabilities.</w:t>
@@ -4204,7 +4240,23 @@
         <w:t>] developed</w:t>
       </w:r>
       <w:r>
-        <w:t xml:space="preserve"> a multimodal system ExaGrade the integrates optical character recognition (OCR) with the generative pre-trained transformer (GPT). The platform integrates two pre-trained models - HandwritingOCR to extract text from handwritten exam papers and like [</w:t>
+        <w:t xml:space="preserve"> a multimodal system </w:t>
+      </w:r>
+      <w:proofErr w:type="spellStart"/>
+      <w:r>
+        <w:t>ExaGrade</w:t>
+      </w:r>
+      <w:proofErr w:type="spellEnd"/>
+      <w:r>
+        <w:t xml:space="preserve"> the integrates optical character recognition (OCR) with the generative pre-trained transformer (GPT). The platform integrates two pre-trained models - </w:t>
+      </w:r>
+      <w:proofErr w:type="spellStart"/>
+      <w:r>
+        <w:t>HandwritingOCR</w:t>
+      </w:r>
+      <w:proofErr w:type="spellEnd"/>
+      <w:r>
+        <w:t xml:space="preserve"> to extract text from handwritten exam papers and like [</w:t>
       </w:r>
       <w:r>
         <w:t>20</w:t>
@@ -4244,8 +4296,13 @@
       <w:r>
         <w:t xml:space="preserve">. </w:t>
       </w:r>
-      <w:r>
-        <w:t xml:space="preserve">ExaGrade is not accessible to students with writing disabilities. </w:t>
+      <w:proofErr w:type="spellStart"/>
+      <w:r>
+        <w:t>ExaGrade</w:t>
+      </w:r>
+      <w:proofErr w:type="spellEnd"/>
+      <w:r>
+        <w:t xml:space="preserve"> is not accessible to students with writing disabilities. </w:t>
       </w:r>
       <w:r>
         <w:t xml:space="preserve">Notably absent </w:t>
@@ -4273,8 +4330,13 @@
       <w:r>
         <w:t xml:space="preserve">] proposed </w:t>
       </w:r>
-      <w:r>
-        <w:t xml:space="preserve">VisualAES, </w:t>
+      <w:proofErr w:type="spellStart"/>
+      <w:r>
+        <w:t>VisualAES</w:t>
+      </w:r>
+      <w:proofErr w:type="spellEnd"/>
+      <w:r>
+        <w:t xml:space="preserve">, </w:t>
       </w:r>
       <w:r>
         <w:t xml:space="preserve">a bi-modal system </w:t>
@@ -4318,14 +4380,35 @@
       <w:r>
         <w:t xml:space="preserve">digital text for processing, and a transformer model for essay scoring. </w:t>
       </w:r>
-      <w:r>
-        <w:t xml:space="preserve">VisualAES was evaluated </w:t>
+      <w:proofErr w:type="spellStart"/>
+      <w:r>
+        <w:t>VisualAES</w:t>
+      </w:r>
+      <w:proofErr w:type="spellEnd"/>
+      <w:r>
+        <w:t xml:space="preserve"> was evaluated </w:t>
       </w:r>
       <w:r>
         <w:t>on</w:t>
       </w:r>
       <w:r>
-        <w:t xml:space="preserve"> the Automated Student Assessment Prize (ASAP) dataset and their own handwritten Chinese Student’s handwritten essay dataset (ChnStd). Their results showed that their system outperformed all state-of-the-art methods on both datasets. VisualAES like CAFES does not provide accessibility for students suffering writing disability.</w:t>
+        <w:t xml:space="preserve"> the Automated Student Assessment Prize (ASAP) dataset and their own handwritten Chinese Student’s handwritten essay dataset (</w:t>
+      </w:r>
+      <w:proofErr w:type="spellStart"/>
+      <w:r>
+        <w:t>ChnStd</w:t>
+      </w:r>
+      <w:proofErr w:type="spellEnd"/>
+      <w:r>
+        <w:t xml:space="preserve">). Their results showed that their system outperformed all state-of-the-art methods on both datasets. </w:t>
+      </w:r>
+      <w:proofErr w:type="spellStart"/>
+      <w:r>
+        <w:t>VisualAES</w:t>
+      </w:r>
+      <w:proofErr w:type="spellEnd"/>
+      <w:r>
+        <w:t xml:space="preserve"> like CAFES does not provide accessibility for students suffering writing disability.</w:t>
       </w:r>
     </w:p>
     <w:p>
@@ -4801,8 +4884,13 @@
       <w:r>
         <w:t xml:space="preserve"> </w:t>
       </w:r>
-      <w:r>
-        <w:t>DeBERTa (Decoding</w:t>
+      <w:proofErr w:type="spellStart"/>
+      <w:r>
+        <w:t>DeBERTa</w:t>
+      </w:r>
+      <w:proofErr w:type="spellEnd"/>
+      <w:r>
+        <w:t xml:space="preserve"> (Decoding</w:t>
       </w:r>
       <w:r>
         <w:t>-</w:t>
@@ -4853,8 +4941,13 @@
         <w:t xml:space="preserve"> </w:t>
       </w:r>
       <w:r>
-        <w:t>BERT and RoBERTa</w:t>
-      </w:r>
+        <w:t xml:space="preserve">BERT and </w:t>
+      </w:r>
+      <w:proofErr w:type="spellStart"/>
+      <w:r>
+        <w:t>RoBERTa</w:t>
+      </w:r>
+      <w:proofErr w:type="spellEnd"/>
       <w:r>
         <w:t>,</w:t>
       </w:r>
@@ -4882,8 +4975,13 @@
       <w:r>
         <w:t xml:space="preserve"> and </w:t>
       </w:r>
-      <w:r>
-        <w:t xml:space="preserve">RoBERTa </w:t>
+      <w:proofErr w:type="spellStart"/>
+      <w:r>
+        <w:t>RoBERTa</w:t>
+      </w:r>
+      <w:proofErr w:type="spellEnd"/>
+      <w:r>
+        <w:t xml:space="preserve"> </w:t>
       </w:r>
       <w:r>
         <w:t>represents</w:t>
@@ -4909,9 +5007,11 @@
       <w:r>
         <w:t xml:space="preserve"> </w:t>
       </w:r>
+      <w:proofErr w:type="spellStart"/>
       <w:r>
         <w:t>DeBERTa</w:t>
       </w:r>
+      <w:proofErr w:type="spellEnd"/>
       <w:r>
         <w:t xml:space="preserve">, </w:t>
       </w:r>
@@ -4959,9 +5059,11 @@
       <w:r>
         <w:t xml:space="preserve">] </w:t>
       </w:r>
+      <w:proofErr w:type="spellStart"/>
       <w:r>
         <w:t>DeBERTa</w:t>
       </w:r>
+      <w:proofErr w:type="spellEnd"/>
       <w:r>
         <w:t>,</w:t>
       </w:r>
@@ -4969,8 +5071,13 @@
         <w:t xml:space="preserve"> </w:t>
       </w:r>
       <w:r>
-        <w:t>after training on 78GB of data, outperformed RoBERTa</w:t>
-      </w:r>
+        <w:t xml:space="preserve">after training on 78GB of data, outperformed </w:t>
+      </w:r>
+      <w:proofErr w:type="spellStart"/>
+      <w:r>
+        <w:t>RoBERTa</w:t>
+      </w:r>
+      <w:proofErr w:type="spellEnd"/>
       <w:r>
         <w:t>,</w:t>
       </w:r>
@@ -4995,13 +5102,21 @@
       </w:r>
       <w:proofErr w:type="gramEnd"/>
       <w:r>
-        <w:t xml:space="preserve"> surpassed human scoring on the S</w:t>
+        <w:t xml:space="preserve"> surpassed human scoring on the </w:t>
+      </w:r>
+      <w:proofErr w:type="spellStart"/>
+      <w:r>
+        <w:t>S</w:t>
       </w:r>
       <w:r>
         <w:t>uper</w:t>
       </w:r>
       <w:r>
-        <w:t>GLUE benchmarks for the first time since 202</w:t>
+        <w:t>GLUE</w:t>
+      </w:r>
+      <w:proofErr w:type="spellEnd"/>
+      <w:r>
+        <w:t xml:space="preserve"> benchmarks for the first time since 202</w:t>
       </w:r>
       <w:r>
         <w:t>1</w:t>
@@ -5038,8 +5153,13 @@
       <w:pPr>
         <w:spacing w:line="360" w:lineRule="auto"/>
       </w:pPr>
-      <w:r>
-        <w:t xml:space="preserve">DeBERTa </w:t>
+      <w:proofErr w:type="spellStart"/>
+      <w:r>
+        <w:t>DeBERTa</w:t>
+      </w:r>
+      <w:proofErr w:type="spellEnd"/>
+      <w:r>
+        <w:t xml:space="preserve"> </w:t>
       </w:r>
       <w:r>
         <w:t>has been</w:t>
@@ -5057,7 +5177,15 @@
         <w:t>in the essay processing pipeline</w:t>
       </w:r>
       <w:r>
-        <w:t xml:space="preserve"> for BrainPower, </w:t>
+        <w:t xml:space="preserve"> for </w:t>
+      </w:r>
+      <w:proofErr w:type="spellStart"/>
+      <w:r>
+        <w:t>BrainPower</w:t>
+      </w:r>
+      <w:proofErr w:type="spellEnd"/>
+      <w:r>
+        <w:t xml:space="preserve">, </w:t>
       </w:r>
       <w:r>
         <w:t xml:space="preserve">serving </w:t>
@@ -5138,8 +5266,13 @@
       <w:r>
         <w:t xml:space="preserve">. </w:t>
       </w:r>
-      <w:r>
-        <w:t>DeBERTa is also freely available from the Hugging</w:t>
+      <w:proofErr w:type="spellStart"/>
+      <w:r>
+        <w:t>DeBERTa</w:t>
+      </w:r>
+      <w:proofErr w:type="spellEnd"/>
+      <w:r>
+        <w:t xml:space="preserve"> is also freely available from the Hugging</w:t>
       </w:r>
       <w:r>
         <w:t xml:space="preserve"> F</w:t>
@@ -5187,8 +5320,13 @@
       <w:r>
         <w:t xml:space="preserve">. </w:t>
       </w:r>
-      <w:r>
-        <w:t>High quality images have clear, uncluttered text</w:t>
+      <w:proofErr w:type="gramStart"/>
+      <w:r>
+        <w:t>High quality</w:t>
+      </w:r>
+      <w:proofErr w:type="gramEnd"/>
+      <w:r>
+        <w:t xml:space="preserve"> images have clear, uncluttered text</w:t>
       </w:r>
       <w:r>
         <w:t xml:space="preserve">, </w:t>
@@ -5290,7 +5428,15 @@
         <w:t xml:space="preserve"> as errors</w:t>
       </w:r>
       <w:r>
-        <w:t xml:space="preserve"> fed into the core (DeBERTa) will </w:t>
+        <w:t xml:space="preserve"> fed into the core (</w:t>
+      </w:r>
+      <w:proofErr w:type="spellStart"/>
+      <w:r>
+        <w:t>DeBERTa</w:t>
+      </w:r>
+      <w:proofErr w:type="spellEnd"/>
+      <w:r>
+        <w:t xml:space="preserve">) will </w:t>
       </w:r>
       <w:r>
         <w:t>degrade</w:t>
@@ -5383,15 +5529,25 @@
       <w:r>
         <w:t xml:space="preserve">, that </w:t>
       </w:r>
+      <w:proofErr w:type="spellStart"/>
       <w:r>
         <w:t>Paddle</w:t>
       </w:r>
       <w:r>
-        <w:t xml:space="preserve">OCR has been selected as the OCR input component </w:t>
-      </w:r>
-      <w:r>
-        <w:t>for BrainPower</w:t>
-      </w:r>
+        <w:t>OCR</w:t>
+      </w:r>
+      <w:proofErr w:type="spellEnd"/>
+      <w:r>
+        <w:t xml:space="preserve"> has been selected as the OCR input component </w:t>
+      </w:r>
+      <w:r>
+        <w:t xml:space="preserve">for </w:t>
+      </w:r>
+      <w:proofErr w:type="spellStart"/>
+      <w:r>
+        <w:t>BrainPower</w:t>
+      </w:r>
+      <w:proofErr w:type="spellEnd"/>
       <w:r>
         <w:t>.</w:t>
       </w:r>
@@ -5411,7 +5567,23 @@
         <w:t xml:space="preserve"> model</w:t>
       </w:r>
       <w:r>
-        <w:t>, the capabilities of PaddleOCR make it an ideal candidate for inclusion in BrainPower’s AES pipeline.</w:t>
+        <w:t xml:space="preserve">, the capabilities of </w:t>
+      </w:r>
+      <w:proofErr w:type="spellStart"/>
+      <w:r>
+        <w:t>PaddleOCR</w:t>
+      </w:r>
+      <w:proofErr w:type="spellEnd"/>
+      <w:r>
+        <w:t xml:space="preserve"> make it an ideal candidate for inclusion in </w:t>
+      </w:r>
+      <w:proofErr w:type="spellStart"/>
+      <w:r>
+        <w:t>BrainPower’s</w:t>
+      </w:r>
+      <w:proofErr w:type="spellEnd"/>
+      <w:r>
+        <w:t xml:space="preserve"> AES pipeline.</w:t>
       </w:r>
     </w:p>
     <w:p>
@@ -5556,7 +5728,15 @@
         <w:t>sp</w:t>
       </w:r>
       <w:r>
-        <w:t>er will serve as the ASR/STT component of BrainPower due to its accessibility and state-of-the-art performance. T</w:t>
+        <w:t xml:space="preserve">er will serve as the ASR/STT component of </w:t>
+      </w:r>
+      <w:proofErr w:type="spellStart"/>
+      <w:r>
+        <w:t>BrainPower</w:t>
+      </w:r>
+      <w:proofErr w:type="spellEnd"/>
+      <w:r>
+        <w:t xml:space="preserve"> due to its accessibility and state-of-the-art performance. T</w:t>
       </w:r>
       <w:r>
         <w:t xml:space="preserve">he results from both component and integration testing will indicate if </w:t>
@@ -6025,27 +6205,14 @@
       <w:r>
         <w:t xml:space="preserve">Figure </w:t>
       </w:r>
-      <w:r>
-        <w:fldChar w:fldCharType="begin"/>
-      </w:r>
-      <w:r>
-        <w:instrText xml:space="preserve"> SEQ Figure \* ARABIC </w:instrText>
-      </w:r>
-      <w:r>
-        <w:fldChar w:fldCharType="separate"/>
-      </w:r>
-      <w:r>
-        <w:rPr>
-          <w:noProof/>
-        </w:rPr>
-        <w:t>3</w:t>
-      </w:r>
-      <w:r>
-        <w:rPr>
-          <w:noProof/>
-        </w:rPr>
-        <w:fldChar w:fldCharType="end"/>
-      </w:r>
+      <w:fldSimple w:instr=" SEQ Figure \* ARABIC ">
+        <w:r>
+          <w:rPr>
+            <w:noProof/>
+          </w:rPr>
+          <w:t>3</w:t>
+        </w:r>
+      </w:fldSimple>
       <w:r>
         <w:t xml:space="preserve"> Gantt Chart for </w:t>
       </w:r>
@@ -6520,27 +6687,14 @@
       <w:r>
         <w:t xml:space="preserve">Table </w:t>
       </w:r>
-      <w:r>
-        <w:fldChar w:fldCharType="begin"/>
-      </w:r>
-      <w:r>
-        <w:instrText xml:space="preserve"> SEQ Table \* ARABIC </w:instrText>
-      </w:r>
-      <w:r>
-        <w:fldChar w:fldCharType="separate"/>
-      </w:r>
-      <w:r>
-        <w:rPr>
-          <w:noProof/>
-        </w:rPr>
-        <w:t>1</w:t>
-      </w:r>
-      <w:r>
-        <w:rPr>
-          <w:noProof/>
-        </w:rPr>
-        <w:fldChar w:fldCharType="end"/>
-      </w:r>
+      <w:fldSimple w:instr=" SEQ Table \* ARABIC ">
+        <w:r>
+          <w:rPr>
+            <w:noProof/>
+          </w:rPr>
+          <w:t>1</w:t>
+        </w:r>
+      </w:fldSimple>
       <w:r>
         <w:t>Essay features (Ground Truth</w:t>
       </w:r>
@@ -7129,27 +7283,14 @@
       <w:r>
         <w:t xml:space="preserve">Table </w:t>
       </w:r>
-      <w:r>
-        <w:fldChar w:fldCharType="begin"/>
-      </w:r>
-      <w:r>
-        <w:instrText xml:space="preserve"> SEQ Table \* ARABIC </w:instrText>
-      </w:r>
-      <w:r>
-        <w:fldChar w:fldCharType="separate"/>
-      </w:r>
-      <w:r>
-        <w:rPr>
-          <w:noProof/>
-        </w:rPr>
-        <w:t>2</w:t>
-      </w:r>
-      <w:r>
-        <w:rPr>
-          <w:noProof/>
-        </w:rPr>
-        <w:fldChar w:fldCharType="end"/>
-      </w:r>
+      <w:fldSimple w:instr=" SEQ Table \* ARABIC ">
+        <w:r>
+          <w:rPr>
+            <w:noProof/>
+          </w:rPr>
+          <w:t>2</w:t>
+        </w:r>
+      </w:fldSimple>
       <w:r>
         <w:t xml:space="preserve"> Specification of phone used to capture image of essay</w:t>
       </w:r>
@@ -7491,27 +7632,14 @@
       <w:r>
         <w:t xml:space="preserve">Table </w:t>
       </w:r>
-      <w:r>
-        <w:fldChar w:fldCharType="begin"/>
-      </w:r>
-      <w:r>
-        <w:instrText xml:space="preserve"> SEQ Table \* ARABIC </w:instrText>
-      </w:r>
-      <w:r>
-        <w:fldChar w:fldCharType="separate"/>
-      </w:r>
-      <w:r>
-        <w:rPr>
-          <w:noProof/>
-        </w:rPr>
-        <w:t>3</w:t>
-      </w:r>
-      <w:r>
-        <w:rPr>
-          <w:noProof/>
-        </w:rPr>
-        <w:fldChar w:fldCharType="end"/>
-      </w:r>
+      <w:fldSimple w:instr=" SEQ Table \* ARABIC ">
+        <w:r>
+          <w:rPr>
+            <w:noProof/>
+          </w:rPr>
+          <w:t>3</w:t>
+        </w:r>
+      </w:fldSimple>
       <w:r>
         <w:t xml:space="preserve"> Properties of image of essay</w:t>
       </w:r>
@@ -7836,27 +7964,14 @@
       <w:r>
         <w:t xml:space="preserve">Table </w:t>
       </w:r>
-      <w:r>
-        <w:fldChar w:fldCharType="begin"/>
-      </w:r>
-      <w:r>
-        <w:instrText xml:space="preserve"> SEQ Table \* ARABIC </w:instrText>
-      </w:r>
-      <w:r>
-        <w:fldChar w:fldCharType="separate"/>
-      </w:r>
-      <w:r>
-        <w:rPr>
-          <w:noProof/>
-        </w:rPr>
-        <w:t>4</w:t>
-      </w:r>
-      <w:r>
-        <w:rPr>
-          <w:noProof/>
-        </w:rPr>
-        <w:fldChar w:fldCharType="end"/>
-      </w:r>
+      <w:fldSimple w:instr=" SEQ Table \* ARABIC ">
+        <w:r>
+          <w:rPr>
+            <w:noProof/>
+          </w:rPr>
+          <w:t>4</w:t>
+        </w:r>
+      </w:fldSimple>
       <w:r>
         <w:t xml:space="preserve"> Results from prototyping </w:t>
       </w:r>
@@ -8092,27 +8207,14 @@
       <w:r>
         <w:t xml:space="preserve">Figure </w:t>
       </w:r>
-      <w:r>
-        <w:fldChar w:fldCharType="begin"/>
-      </w:r>
-      <w:r>
-        <w:instrText xml:space="preserve"> SEQ Figure \* ARABIC </w:instrText>
-      </w:r>
-      <w:r>
-        <w:fldChar w:fldCharType="separate"/>
-      </w:r>
-      <w:r>
-        <w:rPr>
-          <w:noProof/>
-        </w:rPr>
-        <w:t>1</w:t>
-      </w:r>
-      <w:r>
-        <w:rPr>
-          <w:noProof/>
-        </w:rPr>
-        <w:fldChar w:fldCharType="end"/>
-      </w:r>
+      <w:fldSimple w:instr=" SEQ Figure \* ARABIC ">
+        <w:r>
+          <w:rPr>
+            <w:noProof/>
+          </w:rPr>
+          <w:t>1</w:t>
+        </w:r>
+      </w:fldSimple>
       <w:r>
         <w:t xml:space="preserve"> Architecture of </w:t>
       </w:r>
@@ -8476,27 +8578,14 @@
       <w:r>
         <w:t xml:space="preserve">Figure </w:t>
       </w:r>
-      <w:r>
-        <w:fldChar w:fldCharType="begin"/>
-      </w:r>
-      <w:r>
-        <w:instrText xml:space="preserve"> SEQ Figure \* ARABIC </w:instrText>
-      </w:r>
-      <w:r>
-        <w:fldChar w:fldCharType="separate"/>
-      </w:r>
-      <w:r>
-        <w:rPr>
-          <w:noProof/>
-        </w:rPr>
-        <w:t>2</w:t>
-      </w:r>
-      <w:r>
-        <w:rPr>
-          <w:noProof/>
-        </w:rPr>
-        <w:fldChar w:fldCharType="end"/>
-      </w:r>
+      <w:fldSimple w:instr=" SEQ Figure \* ARABIC ">
+        <w:r>
+          <w:rPr>
+            <w:noProof/>
+          </w:rPr>
+          <w:t>2</w:t>
+        </w:r>
+      </w:fldSimple>
       <w:r>
         <w:t xml:space="preserve"> User interface for </w:t>
       </w:r>
@@ -8955,17 +9044,9 @@
         <w:pStyle w:val="Heading1"/>
         <w:jc w:val="center"/>
       </w:pPr>
-      <w:bookmarkStart w:id="16" w:name="_Toc236493173"/>
-      <w:r>
-        <w:t xml:space="preserve">Evaluation </w:t>
-      </w:r>
-      <w:r>
-        <w:t>P</w:t>
-      </w:r>
-      <w:r>
-        <w:t>lan</w:t>
-      </w:r>
-      <w:bookmarkEnd w:id="16"/>
+      <w:r>
+        <w:t>Implementation</w:t>
+      </w:r>
     </w:p>
     <w:p/>
     <w:p>
@@ -8985,12 +9066,24 @@
       <w:pPr>
         <w:pStyle w:val="Heading3"/>
       </w:pPr>
-      <w:bookmarkStart w:id="17" w:name="_Toc236493174"/>
+      <w:bookmarkStart w:id="16" w:name="_Toc236493174"/>
       <w:r>
         <w:lastRenderedPageBreak/>
         <w:t>Evaluation Metrics</w:t>
       </w:r>
-      <w:bookmarkEnd w:id="17"/>
+      <w:bookmarkEnd w:id="16"/>
+      <w:r>
+        <w:t xml:space="preserve"> (</w:t>
+      </w:r>
+      <w:r>
+        <w:rPr>
+          <w:color w:val="EE0000"/>
+        </w:rPr>
+        <w:t>needs to be moved to other section</w:t>
+      </w:r>
+      <w:r>
+        <w:t>)</w:t>
+      </w:r>
     </w:p>
     <w:p>
       <w:pPr>
@@ -9362,12 +9455,12 @@
       <w:pPr>
         <w:pStyle w:val="Heading3"/>
       </w:pPr>
-      <w:bookmarkStart w:id="18" w:name="_Toc236493175"/>
+      <w:bookmarkStart w:id="17" w:name="_Toc236493175"/>
       <w:r>
         <w:lastRenderedPageBreak/>
         <w:t>Procedure</w:t>
       </w:r>
-      <w:bookmarkEnd w:id="18"/>
+      <w:bookmarkEnd w:id="17"/>
     </w:p>
     <w:p>
       <w:r>
@@ -9476,8 +9569,13 @@
         <w:t xml:space="preserve">1.0 </w:t>
       </w:r>
       <w:r>
-        <w:t>dataset for training and testing BrainPower</w:t>
-      </w:r>
+        <w:t xml:space="preserve">dataset for training and testing </w:t>
+      </w:r>
+      <w:proofErr w:type="spellStart"/>
+      <w:r>
+        <w:t>BrainPower</w:t>
+      </w:r>
+      <w:proofErr w:type="spellEnd"/>
     </w:p>
     <w:p>
       <w:pPr>
@@ -9751,7 +9849,7 @@
           <w:color w:val="EE0000"/>
         </w:rPr>
       </w:pPr>
-      <w:bookmarkStart w:id="19" w:name="_Toc236493176"/>
+      <w:bookmarkStart w:id="18" w:name="_Toc236493176"/>
       <w:r>
         <w:rPr>
           <w:color w:val="EE0000"/>
@@ -9759,7 +9857,7 @@
         <w:lastRenderedPageBreak/>
         <w:t>System Deployment/Implementation Details</w:t>
       </w:r>
-      <w:bookmarkEnd w:id="19"/>
+      <w:bookmarkEnd w:id="18"/>
       <w:r>
         <w:rPr>
           <w:color w:val="EE0000"/>
@@ -9827,22 +9925,20 @@
         <w:pStyle w:val="Heading1"/>
         <w:jc w:val="center"/>
       </w:pPr>
-      <w:bookmarkStart w:id="20" w:name="_Toc236493177"/>
+      <w:bookmarkStart w:id="19" w:name="_Toc236493177"/>
       <w:r>
         <w:t>CHAPTER  5</w:t>
       </w:r>
-      <w:bookmarkEnd w:id="20"/>
+      <w:bookmarkEnd w:id="19"/>
     </w:p>
     <w:p>
       <w:pPr>
         <w:pStyle w:val="Heading1"/>
         <w:jc w:val="center"/>
       </w:pPr>
-      <w:bookmarkStart w:id="21" w:name="_Toc236493178"/>
-      <w:r>
-        <w:t>Testing</w:t>
-      </w:r>
-      <w:bookmarkEnd w:id="21"/>
+      <w:r>
+        <w:t>Evaluation</w:t>
+      </w:r>
     </w:p>
     <w:p>
       <w:pPr>
@@ -9851,7 +9947,7 @@
       <w:r>
         <w:br w:type="page"/>
       </w:r>
-      <w:bookmarkStart w:id="22" w:name="_Toc236493179"/>
+      <w:bookmarkStart w:id="20" w:name="_Toc236493179"/>
       <w:r>
         <w:lastRenderedPageBreak/>
         <w:t xml:space="preserve">5.1 </w:t>
@@ -9862,7 +9958,7 @@
       <w:r>
         <w:t>ronment</w:t>
       </w:r>
-      <w:bookmarkEnd w:id="22"/>
+      <w:bookmarkEnd w:id="20"/>
     </w:p>
     <w:p/>
     <w:p>
@@ -10091,12 +10187,12 @@
       <w:pPr>
         <w:pStyle w:val="Heading2"/>
       </w:pPr>
-      <w:bookmarkStart w:id="23" w:name="_Toc236493180"/>
+      <w:bookmarkStart w:id="21" w:name="_Toc236493180"/>
       <w:r>
         <w:lastRenderedPageBreak/>
         <w:t>5.2 Unit Tests</w:t>
       </w:r>
-      <w:bookmarkEnd w:id="23"/>
+      <w:bookmarkEnd w:id="21"/>
     </w:p>
     <w:p/>
     <w:p>
@@ -11271,10 +11367,7 @@
           </w:tcPr>
           <w:p>
             <w:r>
-              <w:t>UT00</w:t>
-            </w:r>
-            <w:r>
-              <w:t>9</w:t>
+              <w:t>UT009</w:t>
             </w:r>
           </w:p>
         </w:tc>
@@ -11327,10 +11420,7 @@
           </w:tcPr>
           <w:p>
             <w:r>
-              <w:t>UT0</w:t>
-            </w:r>
-            <w:r>
-              <w:t>10</w:t>
+              <w:t>UT010</w:t>
             </w:r>
           </w:p>
         </w:tc>
@@ -11410,12 +11500,15 @@
     </w:p>
     <w:p>
       <w:r>
+        <w:rPr>
+          <w:noProof/>
+        </w:rPr>
         <w:lastRenderedPageBreak/>
         <w:drawing>
-          <wp:inline distT="0" distB="0" distL="0" distR="0" wp14:anchorId="02F4E0F3" wp14:editId="4FF4BB0D">
-            <wp:extent cx="2933700" cy="1994916"/>
-            <wp:effectExtent l="0" t="0" r="0" b="5715"/>
-            <wp:docPr id="68841764" name="Picture 1"/>
+          <wp:inline distT="0" distB="0" distL="0" distR="0" wp14:anchorId="35E0F96F" wp14:editId="12CDDDAF">
+            <wp:extent cx="5020376" cy="2600688"/>
+            <wp:effectExtent l="0" t="0" r="8890" b="9525"/>
+            <wp:docPr id="638147064" name="Picture 1"/>
             <wp:cNvGraphicFramePr>
               <a:graphicFrameLocks xmlns:a="http://schemas.openxmlformats.org/drawingml/2006/main" noChangeAspect="1"/>
             </wp:cNvGraphicFramePr>
@@ -11423,7 +11516,7 @@
               <a:graphicData uri="http://schemas.openxmlformats.org/drawingml/2006/picture">
                 <pic:pic xmlns:pic="http://schemas.openxmlformats.org/drawingml/2006/picture">
                   <pic:nvPicPr>
-                    <pic:cNvPr id="68841764" name=""/>
+                    <pic:cNvPr id="638147064" name=""/>
                     <pic:cNvPicPr/>
                   </pic:nvPicPr>
                   <pic:blipFill>
@@ -11435,7 +11528,7 @@
                   <pic:spPr>
                     <a:xfrm>
                       <a:off x="0" y="0"/>
-                      <a:ext cx="2941718" cy="2000368"/>
+                      <a:ext cx="5020376" cy="2600688"/>
                     </a:xfrm>
                     <a:prstGeom prst="rect">
                       <a:avLst/>
@@ -11450,26 +11543,27 @@
     </w:p>
     <w:p>
       <w:r>
+        <w:t>The researcher chose to use class attributes instead of instance variables for the normalisation process to conserve memory – each object will have its own copy of instance variables as compared to one set per class</w:t>
+      </w:r>
+      <w:r>
+        <w:t>,</w:t>
+      </w:r>
+      <w:r>
+        <w:t xml:space="preserve"> available to all objects. This means that the normalisation process scales well as the number of input essays grows.  </w:t>
+      </w:r>
+    </w:p>
+    <w:p>
+      <w:r>
         <w:t xml:space="preserve">Some members of the sample use the spoken form slash to represent ‘/’, while others use ‘or’. </w:t>
       </w:r>
       <w:r>
-        <w:t xml:space="preserve">The </w:t>
-      </w:r>
-      <w:proofErr w:type="spellStart"/>
-      <w:r>
-        <w:t>normalise_spoken_forms_and_</w:t>
-      </w:r>
-      <w:proofErr w:type="gramStart"/>
-      <w:r>
-        <w:t>symbols</w:t>
-      </w:r>
-      <w:proofErr w:type="spellEnd"/>
-      <w:r>
-        <w:t>(</w:t>
-      </w:r>
-      <w:proofErr w:type="gramEnd"/>
-      <w:r>
-        <w:t xml:space="preserve">) method </w:t>
+        <w:t>The normalise</w:t>
+      </w:r>
+      <w:r>
+        <w:t xml:space="preserve"> </w:t>
+      </w:r>
+      <w:r>
+        <w:t xml:space="preserve">() method </w:t>
       </w:r>
       <w:r>
         <w:t xml:space="preserve">of the </w:t>
@@ -11483,11 +11577,20 @@
         <w:t xml:space="preserve"> class, </w:t>
       </w:r>
       <w:r>
-        <w:t>substitutes these symbols with their spoken forms. This is to ensure that when applied to spoken essays from different speakers, the output is consistent after normalisation, making calculating the CER and WER from transcription more accurate.</w:t>
-      </w:r>
-    </w:p>
-    <w:p>
-      <w:r>
+        <w:t>substitutes these symbols with their spoken forms. This is to ensure that when applied to spoken essays from different speakers, the output is consistent after normalisation, making calcul</w:t>
+      </w:r>
+      <w:r>
+        <w:t xml:space="preserve">ation of </w:t>
+      </w:r>
+      <w:r>
+        <w:t>the CER and WER more accurate.</w:t>
+      </w:r>
+    </w:p>
+    <w:p>
+      <w:r>
+        <w:rPr>
+          <w:noProof/>
+        </w:rPr>
         <w:drawing>
           <wp:inline distT="0" distB="0" distL="0" distR="0" wp14:anchorId="678A28B4" wp14:editId="3A4880B2">
             <wp:extent cx="4544059" cy="1571844"/>
@@ -11582,7 +11685,7 @@
       <w:pPr>
         <w:pStyle w:val="Heading2"/>
       </w:pPr>
-      <w:bookmarkStart w:id="24" w:name="_Toc236493181"/>
+      <w:bookmarkStart w:id="22" w:name="_Toc236493181"/>
       <w:r>
         <w:lastRenderedPageBreak/>
         <w:t xml:space="preserve">5.3 </w:t>
@@ -11593,7 +11696,7 @@
       <w:r>
         <w:t xml:space="preserve"> Testing</w:t>
       </w:r>
-      <w:bookmarkEnd w:id="24"/>
+      <w:bookmarkEnd w:id="22"/>
     </w:p>
     <w:p/>
     <w:p>
@@ -12161,10 +12264,25 @@
         <w:t xml:space="preserve">: </w:t>
       </w:r>
       <w:r>
+        <w:t>faster-</w:t>
+      </w:r>
+      <w:r>
         <w:t>whisper-</w:t>
       </w:r>
       <w:r>
-        <w:t>base, whisper-small, whisper-medium</w:t>
+        <w:t xml:space="preserve">base, </w:t>
+      </w:r>
+      <w:r>
+        <w:t>faster-</w:t>
+      </w:r>
+      <w:r>
+        <w:t xml:space="preserve">whisper-small, </w:t>
+      </w:r>
+      <w:r>
+        <w:t>faster-</w:t>
+      </w:r>
+      <w:r>
+        <w:t>whisper-medium</w:t>
       </w:r>
     </w:p>
     <w:p>
@@ -12260,16 +12378,7 @@
           </w:tcPr>
           <w:p>
             <w:r>
-              <w:t>C</w:t>
-            </w:r>
-            <w:r>
-              <w:t>T</w:t>
-            </w:r>
-            <w:r>
-              <w:t>00</w:t>
-            </w:r>
-            <w:r>
-              <w:t>7</w:t>
+              <w:t>CT007</w:t>
             </w:r>
           </w:p>
         </w:tc>
@@ -12282,7 +12391,7 @@
               <w:cnfStyle w:val="000000100000" w:firstRow="0" w:lastRow="0" w:firstColumn="0" w:lastColumn="0" w:oddVBand="0" w:evenVBand="0" w:oddHBand="1" w:evenHBand="0" w:firstRowFirstColumn="0" w:firstRowLastColumn="0" w:lastRowFirstColumn="0" w:lastRowLastColumn="0"/>
             </w:pPr>
             <w:r>
-              <w:t>Load Whisper Model</w:t>
+              <w:t>Access audio file(s) via specified path</w:t>
             </w:r>
           </w:p>
         </w:tc>
@@ -12307,6 +12416,9 @@
             <w:pPr>
               <w:cnfStyle w:val="000000100000" w:firstRow="0" w:lastRow="0" w:firstColumn="0" w:lastColumn="0" w:oddVBand="0" w:evenVBand="0" w:oddHBand="1" w:evenHBand="0" w:firstRowFirstColumn="0" w:firstRowLastColumn="0" w:lastRowFirstColumn="0" w:lastRowLastColumn="0"/>
             </w:pPr>
+            <w:r>
+              <w:t>Model loaded successfully.</w:t>
+            </w:r>
           </w:p>
         </w:tc>
       </w:tr>
@@ -12318,16 +12430,7 @@
           </w:tcPr>
           <w:p>
             <w:r>
-              <w:t>C</w:t>
-            </w:r>
-            <w:r>
-              <w:t>T</w:t>
-            </w:r>
-            <w:r>
-              <w:t>00</w:t>
-            </w:r>
-            <w:r>
-              <w:t>8</w:t>
+              <w:t>CT008</w:t>
             </w:r>
           </w:p>
         </w:tc>
@@ -12340,10 +12443,21 @@
               <w:cnfStyle w:val="000000000000" w:firstRow="0" w:lastRow="0" w:firstColumn="0" w:lastColumn="0" w:oddVBand="0" w:evenVBand="0" w:oddHBand="0" w:evenHBand="0" w:firstRowFirstColumn="0" w:firstRowLastColumn="0" w:lastRowFirstColumn="0" w:lastRowLastColumn="0"/>
             </w:pPr>
             <w:r>
-              <w:t>Load audio recording</w:t>
-            </w:r>
-            <w:r>
-              <w:t xml:space="preserve"> for a single .wav file</w:t>
+              <w:t xml:space="preserve">Load audio </w:t>
+            </w:r>
+            <w:r>
+              <w:t xml:space="preserve">file to </w:t>
+            </w:r>
+            <w:proofErr w:type="spellStart"/>
+            <w:r>
+              <w:t>librosa</w:t>
+            </w:r>
+            <w:proofErr w:type="spellEnd"/>
+            <w:r>
+              <w:t xml:space="preserve"> for signal </w:t>
+            </w:r>
+            <w:r>
+              <w:t>conversion</w:t>
             </w:r>
           </w:p>
         </w:tc>
@@ -12368,6 +12482,9 @@
             <w:pPr>
               <w:cnfStyle w:val="000000000000" w:firstRow="0" w:lastRow="0" w:firstColumn="0" w:lastColumn="0" w:oddVBand="0" w:evenVBand="0" w:oddHBand="0" w:evenHBand="0" w:firstRowFirstColumn="0" w:firstRowLastColumn="0" w:lastRowFirstColumn="0" w:lastRowLastColumn="0"/>
             </w:pPr>
+            <w:r>
+              <w:t>Audio loaded successfully</w:t>
+            </w:r>
           </w:p>
         </w:tc>
       </w:tr>
@@ -12382,16 +12499,7 @@
           </w:tcPr>
           <w:p>
             <w:r>
-              <w:t>C</w:t>
-            </w:r>
-            <w:r>
-              <w:t>T</w:t>
-            </w:r>
-            <w:r>
-              <w:t>00</w:t>
-            </w:r>
-            <w:r>
-              <w:t>9</w:t>
+              <w:t>CT009</w:t>
             </w:r>
           </w:p>
         </w:tc>
@@ -12404,10 +12512,7 @@
               <w:cnfStyle w:val="000000100000" w:firstRow="0" w:lastRow="0" w:firstColumn="0" w:lastColumn="0" w:oddVBand="0" w:evenVBand="0" w:oddHBand="1" w:evenHBand="0" w:firstRowFirstColumn="0" w:firstRowLastColumn="0" w:lastRowFirstColumn="0" w:lastRowLastColumn="0"/>
             </w:pPr>
             <w:r>
-              <w:t>Generate transcription</w:t>
-            </w:r>
-            <w:r>
-              <w:t xml:space="preserve"> for a single .wav file</w:t>
+              <w:t>Generate transcription for a single .wav file</w:t>
             </w:r>
           </w:p>
         </w:tc>
@@ -12432,6 +12537,9 @@
             <w:pPr>
               <w:cnfStyle w:val="000000100000" w:firstRow="0" w:lastRow="0" w:firstColumn="0" w:lastColumn="0" w:oddVBand="0" w:evenVBand="0" w:oddHBand="1" w:evenHBand="0" w:firstRowFirstColumn="0" w:firstRowLastColumn="0" w:lastRowFirstColumn="0" w:lastRowLastColumn="0"/>
             </w:pPr>
+            <w:r>
+              <w:t>Transcription performed successfully</w:t>
+            </w:r>
           </w:p>
         </w:tc>
       </w:tr>
@@ -12443,16 +12551,7 @@
           </w:tcPr>
           <w:p>
             <w:r>
-              <w:t>C</w:t>
-            </w:r>
-            <w:r>
-              <w:t>T</w:t>
-            </w:r>
-            <w:r>
-              <w:t>0</w:t>
-            </w:r>
-            <w:r>
-              <w:t>10</w:t>
+              <w:t>CT010</w:t>
             </w:r>
           </w:p>
         </w:tc>
@@ -12465,10 +12564,7 @@
               <w:cnfStyle w:val="000000000000" w:firstRow="0" w:lastRow="0" w:firstColumn="0" w:lastColumn="0" w:oddVBand="0" w:evenVBand="0" w:oddHBand="0" w:evenHBand="0" w:firstRowFirstColumn="0" w:firstRowLastColumn="0" w:lastRowFirstColumn="0" w:lastRowLastColumn="0"/>
             </w:pPr>
             <w:r>
-              <w:t>Calculate CER and WER</w:t>
-            </w:r>
-            <w:r>
-              <w:t xml:space="preserve"> for transcription of a single .wav file</w:t>
+              <w:t>Load whisper model(s)</w:t>
             </w:r>
           </w:p>
         </w:tc>
@@ -12481,7 +12577,7 @@
               <w:cnfStyle w:val="000000000000" w:firstRow="0" w:lastRow="0" w:firstColumn="0" w:lastColumn="0" w:oddVBand="0" w:evenVBand="0" w:oddHBand="0" w:evenHBand="0" w:firstRowFirstColumn="0" w:firstRowLastColumn="0" w:lastRowFirstColumn="0" w:lastRowLastColumn="0"/>
             </w:pPr>
             <w:r>
-              <w:t>CER and WER accurately calculated for single file</w:t>
+              <w:t>Models loaded successfully</w:t>
             </w:r>
           </w:p>
         </w:tc>
@@ -12493,6 +12589,9 @@
             <w:pPr>
               <w:cnfStyle w:val="000000000000" w:firstRow="0" w:lastRow="0" w:firstColumn="0" w:lastColumn="0" w:oddVBand="0" w:evenVBand="0" w:oddHBand="0" w:evenHBand="0" w:firstRowFirstColumn="0" w:firstRowLastColumn="0" w:lastRowFirstColumn="0" w:lastRowLastColumn="0"/>
             </w:pPr>
+            <w:r>
+              <w:t>Model loaded successfully</w:t>
+            </w:r>
           </w:p>
         </w:tc>
       </w:tr>
@@ -12507,16 +12606,7 @@
           </w:tcPr>
           <w:p>
             <w:r>
-              <w:t>C</w:t>
-            </w:r>
-            <w:r>
-              <w:t>T</w:t>
-            </w:r>
-            <w:r>
-              <w:t>0</w:t>
-            </w:r>
-            <w:r>
-              <w:t>11</w:t>
+              <w:t>CT011</w:t>
             </w:r>
           </w:p>
         </w:tc>
@@ -12529,10 +12619,7 @@
               <w:cnfStyle w:val="000000100000" w:firstRow="0" w:lastRow="0" w:firstColumn="0" w:lastColumn="0" w:oddVBand="0" w:evenVBand="0" w:oddHBand="1" w:evenHBand="0" w:firstRowFirstColumn="0" w:firstRowLastColumn="0" w:lastRowFirstColumn="0" w:lastRowLastColumn="0"/>
             </w:pPr>
             <w:r>
-              <w:t>Display transcription and evaluation</w:t>
-            </w:r>
-            <w:r>
-              <w:t xml:space="preserve"> after processing a single .wav file</w:t>
+              <w:t>Transcribe an audio recording</w:t>
             </w:r>
           </w:p>
         </w:tc>
@@ -12544,6 +12631,9 @@
             <w:pPr>
               <w:cnfStyle w:val="000000100000" w:firstRow="0" w:lastRow="0" w:firstColumn="0" w:lastColumn="0" w:oddVBand="0" w:evenVBand="0" w:oddHBand="1" w:evenHBand="0" w:firstRowFirstColumn="0" w:firstRowLastColumn="0" w:lastRowFirstColumn="0" w:lastRowLastColumn="0"/>
             </w:pPr>
+            <w:r>
+              <w:t>Recording successfully transcribed</w:t>
+            </w:r>
           </w:p>
         </w:tc>
         <w:tc>
@@ -12554,6 +12644,9 @@
             <w:pPr>
               <w:cnfStyle w:val="000000100000" w:firstRow="0" w:lastRow="0" w:firstColumn="0" w:lastColumn="0" w:oddVBand="0" w:evenVBand="0" w:oddHBand="1" w:evenHBand="0" w:firstRowFirstColumn="0" w:firstRowLastColumn="0" w:lastRowFirstColumn="0" w:lastRowLastColumn="0"/>
             </w:pPr>
+            <w:r>
+              <w:t>Recording successfully transcribed</w:t>
+            </w:r>
           </w:p>
         </w:tc>
       </w:tr>
@@ -12578,7 +12671,7 @@
               <w:cnfStyle w:val="000000000000" w:firstRow="0" w:lastRow="0" w:firstColumn="0" w:lastColumn="0" w:oddVBand="0" w:evenVBand="0" w:oddHBand="0" w:evenHBand="0" w:firstRowFirstColumn="0" w:firstRowLastColumn="0" w:lastRowFirstColumn="0" w:lastRowLastColumn="0"/>
             </w:pPr>
             <w:r>
-              <w:t>Load audio recordings for a batch of .wav files</w:t>
+              <w:t>Save model configuration and experiment data.</w:t>
             </w:r>
           </w:p>
         </w:tc>
@@ -12590,6 +12683,9 @@
             <w:pPr>
               <w:cnfStyle w:val="000000000000" w:firstRow="0" w:lastRow="0" w:firstColumn="0" w:lastColumn="0" w:oddVBand="0" w:evenVBand="0" w:oddHBand="0" w:evenHBand="0" w:firstRowFirstColumn="0" w:firstRowLastColumn="0" w:lastRowFirstColumn="0" w:lastRowLastColumn="0"/>
             </w:pPr>
+            <w:r>
+              <w:t xml:space="preserve">Model configuration and experiment data successfully saved </w:t>
+            </w:r>
           </w:p>
         </w:tc>
         <w:tc>
@@ -12600,6 +12696,9 @@
             <w:pPr>
               <w:cnfStyle w:val="000000000000" w:firstRow="0" w:lastRow="0" w:firstColumn="0" w:lastColumn="0" w:oddVBand="0" w:evenVBand="0" w:oddHBand="0" w:evenHBand="0" w:firstRowFirstColumn="0" w:firstRowLastColumn="0" w:lastRowFirstColumn="0" w:lastRowLastColumn="0"/>
             </w:pPr>
+            <w:r>
+              <w:t xml:space="preserve">Model configuration and experiment data successfully saved </w:t>
+            </w:r>
           </w:p>
         </w:tc>
       </w:tr>
@@ -12627,7 +12726,7 @@
               <w:cnfStyle w:val="000000100000" w:firstRow="0" w:lastRow="0" w:firstColumn="0" w:lastColumn="0" w:oddVBand="0" w:evenVBand="0" w:oddHBand="1" w:evenHBand="0" w:firstRowFirstColumn="0" w:firstRowLastColumn="0" w:lastRowFirstColumn="0" w:lastRowLastColumn="0"/>
             </w:pPr>
             <w:r>
-              <w:t>Generate transcription for a batch of .wav files</w:t>
+              <w:t>Transcribe a batch of .wav spoken essay files</w:t>
             </w:r>
           </w:p>
         </w:tc>
@@ -12639,6 +12738,9 @@
             <w:pPr>
               <w:cnfStyle w:val="000000100000" w:firstRow="0" w:lastRow="0" w:firstColumn="0" w:lastColumn="0" w:oddVBand="0" w:evenVBand="0" w:oddHBand="1" w:evenHBand="0" w:firstRowFirstColumn="0" w:firstRowLastColumn="0" w:lastRowFirstColumn="0" w:lastRowLastColumn="0"/>
             </w:pPr>
+            <w:r>
+              <w:t>Batch of spoken essay files successfully transcribed</w:t>
+            </w:r>
           </w:p>
         </w:tc>
         <w:tc>
@@ -12649,6 +12751,9 @@
             <w:pPr>
               <w:cnfStyle w:val="000000100000" w:firstRow="0" w:lastRow="0" w:firstColumn="0" w:lastColumn="0" w:oddVBand="0" w:evenVBand="0" w:oddHBand="1" w:evenHBand="0" w:firstRowFirstColumn="0" w:firstRowLastColumn="0" w:lastRowFirstColumn="0" w:lastRowLastColumn="0"/>
             </w:pPr>
+            <w:r>
+              <w:t>Batch of spoken essay files successfully transcribed</w:t>
+            </w:r>
           </w:p>
         </w:tc>
       </w:tr>
@@ -12673,7 +12778,7 @@
               <w:cnfStyle w:val="000000000000" w:firstRow="0" w:lastRow="0" w:firstColumn="0" w:lastColumn="0" w:oddVBand="0" w:evenVBand="0" w:oddHBand="0" w:evenHBand="0" w:firstRowFirstColumn="0" w:firstRowLastColumn="0" w:lastRowFirstColumn="0" w:lastRowLastColumn="0"/>
             </w:pPr>
             <w:r>
-              <w:t>Calculate CER and WER for transcription of a batch of .wav files</w:t>
+              <w:t>Assign a transcription “pass” or “fail” based on its WER and CER values</w:t>
             </w:r>
           </w:p>
         </w:tc>
@@ -12685,6 +12790,9 @@
             <w:pPr>
               <w:cnfStyle w:val="000000000000" w:firstRow="0" w:lastRow="0" w:firstColumn="0" w:lastColumn="0" w:oddVBand="0" w:evenVBand="0" w:oddHBand="0" w:evenHBand="0" w:firstRowFirstColumn="0" w:firstRowLastColumn="0" w:lastRowFirstColumn="0" w:lastRowLastColumn="0"/>
             </w:pPr>
+            <w:r>
+              <w:t>Transcriptions successfully assigned “pass” or “fail” status based on WER and CER values</w:t>
+            </w:r>
           </w:p>
         </w:tc>
         <w:tc>
@@ -12695,6 +12803,9 @@
             <w:pPr>
               <w:cnfStyle w:val="000000000000" w:firstRow="0" w:lastRow="0" w:firstColumn="0" w:lastColumn="0" w:oddVBand="0" w:evenVBand="0" w:oddHBand="0" w:evenHBand="0" w:firstRowFirstColumn="0" w:firstRowLastColumn="0" w:lastRowFirstColumn="0" w:lastRowLastColumn="0"/>
             </w:pPr>
+            <w:r>
+              <w:t>Transcriptions successfully assigned “pass” or “fail” status based on WER and CER values</w:t>
+            </w:r>
           </w:p>
         </w:tc>
       </w:tr>
@@ -12722,7 +12833,7 @@
               <w:cnfStyle w:val="000000100000" w:firstRow="0" w:lastRow="0" w:firstColumn="0" w:lastColumn="0" w:oddVBand="0" w:evenVBand="0" w:oddHBand="1" w:evenHBand="0" w:firstRowFirstColumn="0" w:firstRowLastColumn="0" w:lastRowFirstColumn="0" w:lastRowLastColumn="0"/>
             </w:pPr>
             <w:r>
-              <w:t>Display transcription and evaluation after processing a batch of .wav files</w:t>
+              <w:t>Save the WER and CER statistics for the batch of recordings</w:t>
             </w:r>
           </w:p>
         </w:tc>
@@ -12734,6 +12845,9 @@
             <w:pPr>
               <w:cnfStyle w:val="000000100000" w:firstRow="0" w:lastRow="0" w:firstColumn="0" w:lastColumn="0" w:oddVBand="0" w:evenVBand="0" w:oddHBand="1" w:evenHBand="0" w:firstRowFirstColumn="0" w:firstRowLastColumn="0" w:lastRowFirstColumn="0" w:lastRowLastColumn="0"/>
             </w:pPr>
+            <w:r>
+              <w:t>WER and CER statistics per batch saved</w:t>
+            </w:r>
           </w:p>
         </w:tc>
         <w:tc>
@@ -12744,49 +12858,9 @@
             <w:pPr>
               <w:cnfStyle w:val="000000100000" w:firstRow="0" w:lastRow="0" w:firstColumn="0" w:lastColumn="0" w:oddVBand="0" w:evenVBand="0" w:oddHBand="1" w:evenHBand="0" w:firstRowFirstColumn="0" w:firstRowLastColumn="0" w:lastRowFirstColumn="0" w:lastRowLastColumn="0"/>
             </w:pPr>
-          </w:p>
-        </w:tc>
-      </w:tr>
-      <w:tr>
-        <w:tc>
-          <w:tcPr>
-            <w:cnfStyle w:val="001000000000" w:firstRow="0" w:lastRow="0" w:firstColumn="1" w:lastColumn="0" w:oddVBand="0" w:evenVBand="0" w:oddHBand="0" w:evenHBand="0" w:firstRowFirstColumn="0" w:firstRowLastColumn="0" w:lastRowFirstColumn="0" w:lastRowLastColumn="0"/>
-            <w:tcW w:w="1129" w:type="dxa"/>
-          </w:tcPr>
-          <w:p>
-            <w:r>
-              <w:t>CT016</w:t>
-            </w:r>
-          </w:p>
-        </w:tc>
-        <w:tc>
-          <w:tcPr>
-            <w:tcW w:w="3379" w:type="dxa"/>
-          </w:tcPr>
-          <w:p>
-            <w:pPr>
-              <w:cnfStyle w:val="000000000000" w:firstRow="0" w:lastRow="0" w:firstColumn="0" w:lastColumn="0" w:oddVBand="0" w:evenVBand="0" w:oddHBand="0" w:evenHBand="0" w:firstRowFirstColumn="0" w:firstRowLastColumn="0" w:lastRowFirstColumn="0" w:lastRowLastColumn="0"/>
-            </w:pPr>
-          </w:p>
-        </w:tc>
-        <w:tc>
-          <w:tcPr>
-            <w:tcW w:w="2254" w:type="dxa"/>
-          </w:tcPr>
-          <w:p>
-            <w:pPr>
-              <w:cnfStyle w:val="000000000000" w:firstRow="0" w:lastRow="0" w:firstColumn="0" w:lastColumn="0" w:oddVBand="0" w:evenVBand="0" w:oddHBand="0" w:evenHBand="0" w:firstRowFirstColumn="0" w:firstRowLastColumn="0" w:lastRowFirstColumn="0" w:lastRowLastColumn="0"/>
-            </w:pPr>
-          </w:p>
-        </w:tc>
-        <w:tc>
-          <w:tcPr>
-            <w:tcW w:w="2254" w:type="dxa"/>
-          </w:tcPr>
-          <w:p>
-            <w:pPr>
-              <w:cnfStyle w:val="000000000000" w:firstRow="0" w:lastRow="0" w:firstColumn="0" w:lastColumn="0" w:oddVBand="0" w:evenVBand="0" w:oddHBand="0" w:evenHBand="0" w:firstRowFirstColumn="0" w:firstRowLastColumn="0" w:lastRowFirstColumn="0" w:lastRowLastColumn="0"/>
-            </w:pPr>
+            <w:r>
+              <w:t>WER and CER statistics per batch saved</w:t>
+            </w:r>
           </w:p>
         </w:tc>
       </w:tr>
@@ -12805,10 +12879,21 @@
         </w:tabs>
       </w:pPr>
       <w:r>
-        <w:t xml:space="preserve">Selecting the best model along with the optimum parameter configuration. A list of six, 2-tuples – (model size, </w:t>
-      </w:r>
-      <w:proofErr w:type="spellStart"/>
-      <w:r>
+        <w:t>Selecting the best model along with the optimum parameter configuration. A list of six, 2-tuples – (</w:t>
+      </w:r>
+      <w:r>
+        <w:rPr>
+          <w:b/>
+          <w:bCs/>
+        </w:rPr>
+        <w:t xml:space="preserve">model size, </w:t>
+      </w:r>
+      <w:proofErr w:type="spellStart"/>
+      <w:r>
+        <w:rPr>
+          <w:b/>
+          <w:bCs/>
+        </w:rPr>
         <w:t>compute_type</w:t>
       </w:r>
       <w:proofErr w:type="spellEnd"/>
@@ -12823,6 +12908,10 @@
         </w:tabs>
       </w:pPr>
       <w:r>
+        <w:rPr>
+          <w:noProof/>
+        </w:rPr>
+        <w:lastRenderedPageBreak/>
         <w:drawing>
           <wp:inline distT="0" distB="0" distL="0" distR="0" wp14:anchorId="6E70B76C" wp14:editId="7539A87C">
             <wp:extent cx="3734321" cy="1600423"/>
@@ -12867,8 +12956,39 @@
         </w:tabs>
       </w:pPr>
       <w:r>
-        <w:lastRenderedPageBreak/>
-        <w:t xml:space="preserve">Thus, a total of 30 experiments – 5 per each model size, compute pair, were carried out. </w:t>
+        <w:t xml:space="preserve">Thus, a total of 30 experiments – 5 per each </w:t>
+      </w:r>
+      <w:r>
+        <w:rPr>
+          <w:b/>
+          <w:bCs/>
+        </w:rPr>
+        <w:t>model size</w:t>
+      </w:r>
+      <w:r>
+        <w:t xml:space="preserve">, </w:t>
+      </w:r>
+      <w:proofErr w:type="spellStart"/>
+      <w:r>
+        <w:rPr>
+          <w:b/>
+          <w:bCs/>
+        </w:rPr>
+        <w:t>compute</w:t>
+      </w:r>
+      <w:r>
+        <w:rPr>
+          <w:b/>
+          <w:bCs/>
+        </w:rPr>
+        <w:t>_type</w:t>
+      </w:r>
+      <w:proofErr w:type="spellEnd"/>
+      <w:r>
+        <w:t xml:space="preserve"> </w:t>
+      </w:r>
+      <w:r>
+        <w:t xml:space="preserve">pair, were carried out. </w:t>
       </w:r>
       <w:r>
         <w:t xml:space="preserve">For each pair, transcription was done </w:t>
@@ -12883,28 +13003,35 @@
         <w:t>rom</w:t>
       </w:r>
       <w:r>
-        <w:t xml:space="preserve"> 1 to 5.  The results from these experiments</w:t>
-      </w:r>
-      <w:r>
-        <w:t xml:space="preserve"> stored as a list of dictionaries are shown in the table below. </w:t>
-      </w:r>
-    </w:p>
-    <w:p>
-      <w:pPr>
-        <w:rPr>
-          <w:b/>
-          <w:bCs/>
-        </w:rPr>
-      </w:pPr>
-      <w:r>
-        <w:rPr>
-          <w:b/>
-          <w:bCs/>
+        <w:t xml:space="preserve"> 1 to 5</w:t>
+      </w:r>
+      <w:r>
+        <w:t xml:space="preserve"> respectively</w:t>
+      </w:r>
+      <w:r>
+        <w:t xml:space="preserve">.  The results </w:t>
+      </w:r>
+      <w:r>
+        <w:t xml:space="preserve">stored as a list of dictionaries are shown in the table below. </w:t>
+      </w:r>
+    </w:p>
+    <w:p>
+      <w:pPr>
+        <w:rPr>
+          <w:b/>
+          <w:bCs/>
+        </w:rPr>
+      </w:pPr>
+      <w:r>
+        <w:rPr>
+          <w:b/>
+          <w:bCs/>
+          <w:noProof/>
         </w:rPr>
         <w:drawing>
-          <wp:inline distT="0" distB="0" distL="0" distR="0" wp14:anchorId="507146C5" wp14:editId="383E09B5">
-            <wp:extent cx="5731510" cy="1552575"/>
-            <wp:effectExtent l="0" t="0" r="2540" b="9525"/>
+          <wp:inline distT="0" distB="0" distL="0" distR="0" wp14:anchorId="507146C5" wp14:editId="40D1C72F">
+            <wp:extent cx="5681780" cy="1626781"/>
+            <wp:effectExtent l="0" t="0" r="0" b="0"/>
             <wp:docPr id="898140625" name="Picture 1"/>
             <wp:cNvGraphicFramePr>
               <a:graphicFrameLocks xmlns:a="http://schemas.openxmlformats.org/drawingml/2006/main" noChangeAspect="1"/>
@@ -12916,8 +13043,368 @@
                     <pic:cNvPr id="898140625" name=""/>
                     <pic:cNvPicPr/>
                   </pic:nvPicPr>
+                  <pic:blipFill rotWithShape="1">
+                    <a:blip r:embed="rId17"/>
+                    <a:srcRect r="5389"/>
+                    <a:stretch>
+                      <a:fillRect/>
+                    </a:stretch>
+                  </pic:blipFill>
+                  <pic:spPr bwMode="auto">
+                    <a:xfrm>
+                      <a:off x="0" y="0"/>
+                      <a:ext cx="5687213" cy="1628337"/>
+                    </a:xfrm>
+                    <a:prstGeom prst="rect">
+                      <a:avLst/>
+                    </a:prstGeom>
+                    <a:ln>
+                      <a:noFill/>
+                    </a:ln>
+                    <a:extLst>
+                      <a:ext uri="{53640926-AAD7-44D8-BBD7-CCE9431645EC}">
+                        <a14:shadowObscured xmlns:a14="http://schemas.microsoft.com/office/drawing/2010/main"/>
+                      </a:ext>
+                    </a:extLst>
+                  </pic:spPr>
+                </pic:pic>
+              </a:graphicData>
+            </a:graphic>
+          </wp:inline>
+        </w:drawing>
+      </w:r>
+    </w:p>
+    <w:p>
+      <w:r>
+        <w:t>Experiments 24 and 28 achieved the same transcription accuracy. However, they differed</w:t>
+      </w:r>
+      <w:r>
+        <w:t xml:space="preserve"> noticeably </w:t>
+      </w:r>
+      <w:r>
+        <w:t xml:space="preserve">in the time </w:t>
+      </w:r>
+      <w:r>
+        <w:t>the model took to load</w:t>
+      </w:r>
+      <w:r>
+        <w:t xml:space="preserve">. In experiment 24, mixed-precision quantization - int8_float16 was used, along with </w:t>
+      </w:r>
+      <w:r>
+        <w:t>the</w:t>
+      </w:r>
+      <w:r>
+        <w:t xml:space="preserve"> </w:t>
+      </w:r>
+      <w:proofErr w:type="spellStart"/>
+      <w:r>
+        <w:rPr>
+          <w:b/>
+          <w:bCs/>
+        </w:rPr>
+        <w:t>beam</w:t>
+      </w:r>
+      <w:r>
+        <w:rPr>
+          <w:b/>
+          <w:bCs/>
+        </w:rPr>
+        <w:t>size</w:t>
+      </w:r>
+      <w:proofErr w:type="spellEnd"/>
+      <w:r>
+        <w:rPr>
+          <w:b/>
+          <w:bCs/>
+        </w:rPr>
+        <w:t>=5</w:t>
+      </w:r>
+      <w:r>
+        <w:t xml:space="preserve">. This model took roughly </w:t>
+      </w:r>
+      <w:r>
+        <w:t>four (4)</w:t>
+      </w:r>
+      <w:r>
+        <w:t xml:space="preserve"> seconds to transcribe the audio. </w:t>
+      </w:r>
+    </w:p>
+    <w:p>
+      <w:r>
+        <w:t xml:space="preserve">The model in experiment 28, with </w:t>
+      </w:r>
+      <w:r>
+        <w:rPr>
+          <w:b/>
+          <w:bCs/>
+        </w:rPr>
+        <w:t>beam size</w:t>
+      </w:r>
+      <w:r>
+        <w:rPr>
+          <w:b/>
+          <w:bCs/>
+        </w:rPr>
+        <w:t>=</w:t>
+      </w:r>
+      <w:r>
+        <w:rPr>
+          <w:b/>
+          <w:bCs/>
+        </w:rPr>
+        <w:t>4</w:t>
+      </w:r>
+      <w:r>
+        <w:t xml:space="preserve"> and </w:t>
+      </w:r>
+      <w:proofErr w:type="spellStart"/>
+      <w:r>
+        <w:rPr>
+          <w:b/>
+          <w:bCs/>
+        </w:rPr>
+        <w:t>compute_type</w:t>
+      </w:r>
+      <w:proofErr w:type="spellEnd"/>
+      <w:r>
+        <w:rPr>
+          <w:b/>
+          <w:bCs/>
+        </w:rPr>
+        <w:t>=</w:t>
+      </w:r>
+      <w:r>
+        <w:rPr>
+          <w:b/>
+          <w:bCs/>
+        </w:rPr>
+        <w:t>float16</w:t>
+      </w:r>
+      <w:r>
+        <w:t xml:space="preserve">, however, took about 50% less time to load but </w:t>
+      </w:r>
+      <w:r>
+        <w:t xml:space="preserve">was more than </w:t>
+      </w:r>
+      <w:r>
+        <w:t xml:space="preserve">three times </w:t>
+      </w:r>
+      <w:r>
+        <w:t xml:space="preserve">slower </w:t>
+      </w:r>
+      <w:r>
+        <w:t xml:space="preserve">than the model in experiment 24. </w:t>
+      </w:r>
+    </w:p>
+    <w:p>
+      <w:r>
+        <w:t>(Questions requiring answers)</w:t>
+      </w:r>
+    </w:p>
+    <w:p>
+      <w:pPr>
+        <w:rPr>
+          <w:color w:val="EE0000"/>
+        </w:rPr>
+      </w:pPr>
+      <w:r>
+        <w:rPr>
+          <w:color w:val="EE0000"/>
+        </w:rPr>
+        <w:t>Why was the VAD Filter set to True?</w:t>
+      </w:r>
+    </w:p>
+    <w:p>
+      <w:pPr>
+        <w:rPr>
+          <w:color w:val="EE0000"/>
+        </w:rPr>
+      </w:pPr>
+      <w:r>
+        <w:rPr>
+          <w:color w:val="EE0000"/>
+        </w:rPr>
+        <w:t>Why was the beam size adjusted?</w:t>
+      </w:r>
+    </w:p>
+    <w:p>
+      <w:pPr>
+        <w:rPr>
+          <w:color w:val="EE0000"/>
+        </w:rPr>
+      </w:pPr>
+      <w:r>
+        <w:rPr>
+          <w:color w:val="EE0000"/>
+        </w:rPr>
+        <w:t>Why were 16 threads alone used?</w:t>
+      </w:r>
+    </w:p>
+    <w:p>
+      <w:pPr>
+        <w:rPr>
+          <w:color w:val="EE0000"/>
+        </w:rPr>
+      </w:pPr>
+      <w:r>
+        <w:rPr>
+          <w:color w:val="EE0000"/>
+        </w:rPr>
+        <w:t>Why was CUDA fixed?</w:t>
+      </w:r>
+    </w:p>
+    <w:p>
+      <w:r>
+        <w:t xml:space="preserve">After </w:t>
+      </w:r>
+      <w:r>
+        <w:t xml:space="preserve">the </w:t>
+      </w:r>
+      <w:r>
+        <w:t>optimum configuration was implemented</w:t>
+      </w:r>
+      <w:r>
+        <w:t xml:space="preserve">, </w:t>
+      </w:r>
+      <w:r>
+        <w:t xml:space="preserve">the </w:t>
+      </w:r>
+      <w:r>
+        <w:rPr>
+          <w:b/>
+          <w:bCs/>
+        </w:rPr>
+        <w:t>details</w:t>
+      </w:r>
+      <w:r>
+        <w:t xml:space="preserve"> dictionary was updated to include not only </w:t>
+      </w:r>
+      <w:r>
+        <w:t>each</w:t>
+      </w:r>
+      <w:r>
+        <w:t xml:space="preserve"> file’s properties e.g. length and size along with the </w:t>
+      </w:r>
+      <w:r>
+        <w:t xml:space="preserve">WER and CER for the transcription </w:t>
+      </w:r>
+      <w:r>
+        <w:t>but also a “pass” or “fail” evaluation status. These values are assigned in relation to the WER and CER values exceeding the set threshold values of 0.</w:t>
+      </w:r>
+      <w:r>
+        <w:t>0</w:t>
+      </w:r>
+      <w:r>
+        <w:t>99 and 0.</w:t>
+      </w:r>
+      <w:r>
+        <w:t>0</w:t>
+      </w:r>
+      <w:r>
+        <w:t xml:space="preserve">59 respectively. </w:t>
+      </w:r>
+      <w:r>
+        <w:t xml:space="preserve">These </w:t>
+      </w:r>
+      <w:r>
+        <w:t>evaluation labels</w:t>
+      </w:r>
+      <w:r>
+        <w:t xml:space="preserve"> will be used later</w:t>
+      </w:r>
+      <w:r>
+        <w:t>,</w:t>
+      </w:r>
+      <w:r>
+        <w:t xml:space="preserve"> to determine which transcription</w:t>
+      </w:r>
+      <w:r>
+        <w:t>s</w:t>
+      </w:r>
+      <w:r>
+        <w:t xml:space="preserve"> are forwarded to the transformer or human scorer for scoring. </w:t>
+      </w:r>
+    </w:p>
+    <w:p>
+      <w:r>
+        <w:lastRenderedPageBreak/>
+        <w:t xml:space="preserve">A </w:t>
+      </w:r>
+      <w:proofErr w:type="spellStart"/>
+      <w:r>
+        <w:rPr>
+          <w:b/>
+          <w:bCs/>
+        </w:rPr>
+        <w:t>batch</w:t>
+      </w:r>
+      <w:r>
+        <w:rPr>
+          <w:b/>
+          <w:bCs/>
+        </w:rPr>
+        <w:t>_transcription</w:t>
+      </w:r>
+      <w:proofErr w:type="spellEnd"/>
+      <w:r>
+        <w:t xml:space="preserve"> dict</w:t>
+      </w:r>
+      <w:r>
+        <w:t>ionary</w:t>
+      </w:r>
+      <w:r>
+        <w:t xml:space="preserve"> stores </w:t>
+      </w:r>
+      <w:r>
+        <w:t xml:space="preserve">all individual </w:t>
+      </w:r>
+      <w:r>
+        <w:t>transcription</w:t>
+      </w:r>
+      <w:r>
+        <w:t>-detail</w:t>
+      </w:r>
+      <w:r>
+        <w:t xml:space="preserve"> dictionaries </w:t>
+      </w:r>
+      <w:r>
+        <w:t xml:space="preserve">in a list </w:t>
+      </w:r>
+      <w:r>
+        <w:t>along with WER</w:t>
+      </w:r>
+      <w:r>
+        <w:t xml:space="preserve">, </w:t>
+      </w:r>
+      <w:r>
+        <w:t>CER</w:t>
+      </w:r>
+      <w:r>
+        <w:t xml:space="preserve"> and evaluation statistics for the batch</w:t>
+      </w:r>
+      <w:r>
+        <w:t>.</w:t>
+      </w:r>
+    </w:p>
+    <w:p>
+      <w:r>
+        <w:drawing>
+          <wp:inline distT="0" distB="0" distL="0" distR="0" wp14:anchorId="3947A97C" wp14:editId="0D3DD28A">
+            <wp:extent cx="2476846" cy="5372850"/>
+            <wp:effectExtent l="0" t="0" r="0" b="0"/>
+            <wp:docPr id="1083939629" name="Picture 1"/>
+            <wp:cNvGraphicFramePr>
+              <a:graphicFrameLocks xmlns:a="http://schemas.openxmlformats.org/drawingml/2006/main" noChangeAspect="1"/>
+            </wp:cNvGraphicFramePr>
+            <a:graphic xmlns:a="http://schemas.openxmlformats.org/drawingml/2006/main">
+              <a:graphicData uri="http://schemas.openxmlformats.org/drawingml/2006/picture">
+                <pic:pic xmlns:pic="http://schemas.openxmlformats.org/drawingml/2006/picture">
+                  <pic:nvPicPr>
+                    <pic:cNvPr id="1083939629" name=""/>
+                    <pic:cNvPicPr/>
+                  </pic:nvPicPr>
                   <pic:blipFill>
-                    <a:blip r:embed="rId17"/>
+                    <a:blip r:embed="rId18"/>
                     <a:stretch>
                       <a:fillRect/>
                     </a:stretch>
@@ -12925,7 +13412,7 @@
                   <pic:spPr>
                     <a:xfrm>
                       <a:off x="0" y="0"/>
-                      <a:ext cx="5731510" cy="1552575"/>
+                      <a:ext cx="2476846" cy="5372850"/>
                     </a:xfrm>
                     <a:prstGeom prst="rect">
                       <a:avLst/>
@@ -12939,153 +13426,874 @@
       </w:r>
     </w:p>
     <w:p>
-      <w:r>
-        <w:t xml:space="preserve">Experiments 24 and 28 achieved the same transcription accuracy. </w:t>
-      </w:r>
-      <w:r>
-        <w:t>However,</w:t>
-      </w:r>
-      <w:r>
-        <w:t xml:space="preserve"> they differed</w:t>
-      </w:r>
-      <w:r>
-        <w:t xml:space="preserve"> noticeably </w:t>
-      </w:r>
-      <w:r>
-        <w:t xml:space="preserve">in the time </w:t>
-      </w:r>
-      <w:r>
-        <w:t>the model took to load</w:t>
-      </w:r>
-      <w:r>
-        <w:t xml:space="preserve">. In experiment 24, mixed-precision quantization - int8_float16 was used, along with </w:t>
+      <w:pPr>
+        <w:rPr>
+          <w:color w:val="EE0000"/>
+        </w:rPr>
+      </w:pPr>
+      <w:r>
+        <w:t xml:space="preserve">The rationale behind this design decision is to make possible the analysis of transcription statistics per individual transcription </w:t>
+      </w:r>
+      <w:r>
+        <w:t>and per batch (e.g. a class of 25 students).</w:t>
+      </w:r>
+    </w:p>
+    <w:p>
+      <w:r>
+        <w:t xml:space="preserve">Although </w:t>
+      </w:r>
+      <w:r>
+        <w:t>the WER</w:t>
+      </w:r>
+      <w:r>
+        <w:t xml:space="preserve"> and CER per batch </w:t>
+      </w:r>
+      <w:r>
+        <w:t>are stored in the</w:t>
+      </w:r>
+      <w:r>
+        <w:t xml:space="preserve"> </w:t>
+      </w:r>
+      <w:proofErr w:type="spellStart"/>
+      <w:r>
+        <w:rPr>
+          <w:b/>
+          <w:bCs/>
+        </w:rPr>
+        <w:t>batch</w:t>
+      </w:r>
+      <w:r>
+        <w:rPr>
+          <w:b/>
+          <w:bCs/>
+        </w:rPr>
+        <w:t>_transcription</w:t>
+      </w:r>
+      <w:proofErr w:type="spellEnd"/>
+      <w:r>
+        <w:t xml:space="preserve"> object, </w:t>
       </w:r>
       <w:r>
         <w:t>the</w:t>
       </w:r>
       <w:r>
-        <w:t xml:space="preserve"> beam size </w:t>
-      </w:r>
-      <w:r>
-        <w:t>parameter set to</w:t>
-      </w:r>
-      <w:r>
-        <w:t xml:space="preserve"> 5. This model took </w:t>
-      </w:r>
-      <w:r>
-        <w:t>roughly</w:t>
-      </w:r>
+        <w:t>ir</w:t>
+      </w:r>
+      <w:r>
+        <w:t xml:space="preserve"> calculation is not performed locally.  </w:t>
+      </w:r>
+      <w:r>
+        <w:t xml:space="preserve">The </w:t>
+      </w:r>
+      <w:r>
+        <w:t xml:space="preserve">global </w:t>
+      </w:r>
+      <w:proofErr w:type="spellStart"/>
+      <w:r>
+        <w:rPr>
+          <w:b/>
+          <w:bCs/>
+        </w:rPr>
+        <w:t>calculate_stats</w:t>
+      </w:r>
+      <w:proofErr w:type="spellEnd"/>
+      <w:r>
+        <w:t xml:space="preserve"> function is invoked</w:t>
+      </w:r>
+      <w:r>
+        <w:t xml:space="preserve"> to perform these calculations</w:t>
+      </w:r>
+      <w:r>
+        <w:t xml:space="preserve">. </w:t>
+      </w:r>
+      <w:proofErr w:type="spellStart"/>
+      <w:r>
+        <w:rPr>
+          <w:b/>
+          <w:bCs/>
+        </w:rPr>
+        <w:t>calculate_stats</w:t>
+      </w:r>
+      <w:proofErr w:type="spellEnd"/>
       <w:r>
         <w:t xml:space="preserve"> </w:t>
       </w:r>
       <w:r>
-        <w:t>four (4)</w:t>
-      </w:r>
-      <w:r>
-        <w:t xml:space="preserve"> seconds to transcribe the audio. </w:t>
-      </w:r>
-    </w:p>
-    <w:p>
-      <w:r>
-        <w:t xml:space="preserve">The model in experiment 28, with beam size 4 and </w:t>
-      </w:r>
-      <w:proofErr w:type="spellStart"/>
-      <w:r>
-        <w:rPr>
-          <w:b/>
-          <w:bCs/>
-        </w:rPr>
-        <w:t>compute_type</w:t>
-      </w:r>
-      <w:proofErr w:type="spellEnd"/>
-      <w:r>
-        <w:rPr>
-          <w:b/>
-          <w:bCs/>
-        </w:rPr>
+        <w:t>converts</w:t>
+      </w:r>
+      <w:r>
+        <w:t xml:space="preserve"> a list of individual transcription statistics to a </w:t>
+      </w:r>
+      <w:proofErr w:type="spellStart"/>
+      <w:r>
+        <w:rPr>
+          <w:b/>
+          <w:bCs/>
+        </w:rPr>
+        <w:t>numpy</w:t>
+      </w:r>
+      <w:proofErr w:type="spellEnd"/>
+      <w:r>
+        <w:t xml:space="preserve"> array and invokes </w:t>
+      </w:r>
+      <w:proofErr w:type="spellStart"/>
+      <w:r>
+        <w:t>numpy’s</w:t>
+      </w:r>
+      <w:proofErr w:type="spellEnd"/>
+      <w:r>
+        <w:t xml:space="preserve"> statistical function</w:t>
+      </w:r>
+      <w:r>
+        <w:t>s</w:t>
+      </w:r>
+      <w:r>
+        <w:t xml:space="preserve"> to obtain an aggregate of the mean, median and so on</w:t>
+      </w:r>
+      <w:r>
+        <w:t xml:space="preserve">. </w:t>
+      </w:r>
+      <w:r>
         <w:t xml:space="preserve"> </w:t>
       </w:r>
       <w:r>
-        <w:t xml:space="preserve">set to float16, however, took about 50% less time to load but </w:t>
-      </w:r>
-      <w:r>
-        <w:t xml:space="preserve">was more than </w:t>
-      </w:r>
-      <w:r>
-        <w:t xml:space="preserve">three times </w:t>
-      </w:r>
-      <w:r>
-        <w:t xml:space="preserve">slower </w:t>
-      </w:r>
-      <w:r>
-        <w:t>than the model in experiment 24. It is likely that the reduced precision of int8 which produced smaller numerical values, as compared to float16, reduced the computation load resulting in significantly less transcription time.</w:t>
-      </w:r>
-    </w:p>
-    <w:p>
-      <w:pPr>
-        <w:rPr>
-          <w:color w:val="EE0000"/>
-        </w:rPr>
-      </w:pPr>
-      <w:r>
-        <w:rPr>
-          <w:color w:val="EE0000"/>
-        </w:rPr>
-        <w:t>Why was the VAD Filter set to True?</w:t>
-      </w:r>
-    </w:p>
-    <w:p>
-      <w:pPr>
-        <w:rPr>
-          <w:color w:val="EE0000"/>
-        </w:rPr>
-      </w:pPr>
-      <w:r>
-        <w:rPr>
-          <w:color w:val="EE0000"/>
-        </w:rPr>
-        <w:t>Why was the beam size adjusted?</w:t>
-      </w:r>
-    </w:p>
-    <w:p>
-      <w:pPr>
-        <w:rPr>
-          <w:color w:val="EE0000"/>
-        </w:rPr>
-      </w:pPr>
-      <w:r>
-        <w:rPr>
-          <w:color w:val="EE0000"/>
-        </w:rPr>
-        <w:t>Why were 16 threads alone used?</w:t>
-      </w:r>
-    </w:p>
-    <w:p>
-      <w:r>
-        <w:rPr>
-          <w:color w:val="EE0000"/>
-        </w:rPr>
-        <w:t>Why was CUDA fixed?</w:t>
-      </w:r>
-      <w:r>
-        <w:rPr>
-          <w:b/>
-          <w:bCs/>
-        </w:rPr>
+        <w:t xml:space="preserve">The function </w:t>
+      </w:r>
+      <w:r>
+        <w:t>returns</w:t>
+      </w:r>
+      <w:r>
+        <w:t xml:space="preserve"> a dictionary with the </w:t>
+      </w:r>
+      <w:r>
+        <w:t>calculated</w:t>
+      </w:r>
+      <w:r>
+        <w:t xml:space="preserve"> statistics. </w:t>
+      </w:r>
+      <w:r>
+        <w:t xml:space="preserve"> </w:t>
+      </w:r>
+      <w:r>
+        <w:t xml:space="preserve">The rationale behind this </w:t>
+      </w:r>
+      <w:r>
+        <w:t>design,</w:t>
+      </w:r>
+      <w:r>
+        <w:t xml:space="preserve"> is to avoid code redundancy – the OCR component also utilises the </w:t>
+      </w:r>
+      <w:proofErr w:type="spellStart"/>
+      <w:r>
+        <w:rPr>
+          <w:b/>
+          <w:bCs/>
+        </w:rPr>
+        <w:t>calculate_stats</w:t>
+      </w:r>
+      <w:proofErr w:type="spellEnd"/>
+      <w:r>
+        <w:t xml:space="preserve"> function. </w:t>
+      </w:r>
+    </w:p>
+    <w:p>
+      <w:r>
+        <w:lastRenderedPageBreak/>
+        <w:drawing>
+          <wp:inline distT="0" distB="0" distL="0" distR="0" wp14:anchorId="575C7B11" wp14:editId="27707E00">
+            <wp:extent cx="1913860" cy="1913860"/>
+            <wp:effectExtent l="0" t="0" r="0" b="0"/>
+            <wp:docPr id="497411748" name="Picture 1"/>
+            <wp:cNvGraphicFramePr>
+              <a:graphicFrameLocks xmlns:a="http://schemas.openxmlformats.org/drawingml/2006/main" noChangeAspect="1"/>
+            </wp:cNvGraphicFramePr>
+            <a:graphic xmlns:a="http://schemas.openxmlformats.org/drawingml/2006/main">
+              <a:graphicData uri="http://schemas.openxmlformats.org/drawingml/2006/picture">
+                <pic:pic xmlns:pic="http://schemas.openxmlformats.org/drawingml/2006/picture">
+                  <pic:nvPicPr>
+                    <pic:cNvPr id="497411748" name=""/>
+                    <pic:cNvPicPr/>
+                  </pic:nvPicPr>
+                  <pic:blipFill>
+                    <a:blip r:embed="rId19"/>
+                    <a:stretch>
+                      <a:fillRect/>
+                    </a:stretch>
+                  </pic:blipFill>
+                  <pic:spPr>
+                    <a:xfrm>
+                      <a:off x="0" y="0"/>
+                      <a:ext cx="1917733" cy="1917733"/>
+                    </a:xfrm>
+                    <a:prstGeom prst="rect">
+                      <a:avLst/>
+                    </a:prstGeom>
+                  </pic:spPr>
+                </pic:pic>
+              </a:graphicData>
+            </a:graphic>
+          </wp:inline>
+        </w:drawing>
+      </w:r>
+    </w:p>
+    <w:p>
+      <w:pPr>
+        <w:rPr>
+          <w:b/>
+          <w:bCs/>
+        </w:rPr>
+      </w:pPr>
+    </w:p>
+    <w:p>
+      <w:pPr>
+        <w:rPr>
+          <w:b/>
+          <w:bCs/>
+        </w:rPr>
+      </w:pPr>
+      <w:r>
+        <w:rPr>
+          <w:b/>
+          <w:bCs/>
+        </w:rPr>
+        <w:t>Evaluation</w:t>
+      </w:r>
+      <w:r>
+        <w:rPr>
+          <w:b/>
+          <w:bCs/>
+        </w:rPr>
+        <w:t xml:space="preserve"> of Whisper</w:t>
+      </w:r>
+      <w:r>
+        <w:rPr>
+          <w:b/>
+          <w:bCs/>
+        </w:rPr>
+        <w:t>:</w:t>
+      </w:r>
+    </w:p>
+    <w:p>
+      <w:r>
+        <w:t xml:space="preserve">The </w:t>
+      </w:r>
+      <w:r>
+        <w:t>mean</w:t>
+      </w:r>
+      <w:r>
+        <w:t xml:space="preserve"> WER, </w:t>
+      </w:r>
+      <w:r>
+        <w:t>11.55</w:t>
+      </w:r>
+      <w:r>
+        <w:t>%</w:t>
+      </w:r>
+      <w:r>
+        <w:t xml:space="preserve">, is </w:t>
+      </w:r>
+      <w:r>
+        <w:t xml:space="preserve">slightly </w:t>
+      </w:r>
+      <w:r>
+        <w:t xml:space="preserve">higher than the acceptable threshold of </w:t>
+      </w:r>
+      <w:r>
+        <w:t>9.</w:t>
+      </w:r>
+      <w:r>
+        <w:t>0</w:t>
+      </w:r>
+      <w:r>
+        <w:t xml:space="preserve">%. </w:t>
+      </w:r>
+      <w:r>
+        <w:t xml:space="preserve">The max WER </w:t>
+      </w:r>
+      <w:r>
+        <w:t xml:space="preserve">however, </w:t>
+      </w:r>
+      <w:r>
+        <w:t xml:space="preserve">differs from the min by </w:t>
+      </w:r>
+      <w:r>
+        <w:t xml:space="preserve">roughly </w:t>
+      </w:r>
+      <w:r>
+        <w:t>15</w:t>
+      </w:r>
+      <w:r>
+        <w:t xml:space="preserve"> percentage points</w:t>
+      </w:r>
+      <w:r>
+        <w:t xml:space="preserve"> – </w:t>
+      </w:r>
+      <w:r>
+        <w:t>indicating variation in transcription accuracy across the samples</w:t>
+      </w:r>
+      <w:r>
+        <w:t xml:space="preserve">. </w:t>
+      </w:r>
+      <w:r>
+        <w:t xml:space="preserve">The median </w:t>
+      </w:r>
+      <w:r>
+        <w:t>WER</w:t>
+      </w:r>
+      <w:r>
+        <w:t>, 10.56%</w:t>
+      </w:r>
+      <w:r>
+        <w:t xml:space="preserve"> </w:t>
+      </w:r>
+      <w:r>
+        <w:t xml:space="preserve">is </w:t>
+      </w:r>
+      <w:r>
+        <w:t>slightly above the threshold while the CER</w:t>
+      </w:r>
+      <w:r>
+        <w:t>, 4.70</w:t>
+      </w:r>
+      <w:r>
+        <w:t>%, is</w:t>
+      </w:r>
+      <w:r>
+        <w:t xml:space="preserve"> slightly below the threshold. </w:t>
+      </w:r>
+      <w:r>
+        <w:t>Whisper transcribed 2</w:t>
+      </w:r>
+      <w:r>
+        <w:t>7</w:t>
+      </w:r>
+      <w:r>
+        <w:t xml:space="preserve"> essays</w:t>
+      </w:r>
+      <w:r>
+        <w:t xml:space="preserve">. </w:t>
+      </w:r>
+      <w:r>
+        <w:t>29.6</w:t>
+      </w:r>
+      <w:r>
+        <w:t xml:space="preserve">% </w:t>
+      </w:r>
+      <w:r>
+        <w:t xml:space="preserve">were within the acceptable bound and were </w:t>
+      </w:r>
+      <w:r>
+        <w:t>classified as “pass”,</w:t>
+      </w:r>
+      <w:r>
+        <w:t xml:space="preserve"> </w:t>
+      </w:r>
+      <w:r>
+        <w:t>which means that they will be scored by the transformer</w:t>
+      </w:r>
+      <w:r>
+        <w:t>.</w:t>
+      </w:r>
+      <w:r>
+        <w:t xml:space="preserve"> The majority, </w:t>
+      </w:r>
+      <w:r>
+        <w:t xml:space="preserve">however, </w:t>
+      </w:r>
+      <w:r>
+        <w:t xml:space="preserve">more than double the percentage pass, </w:t>
+      </w:r>
+      <w:r>
+        <w:t xml:space="preserve">were </w:t>
+      </w:r>
+      <w:r>
+        <w:t>classified as “fail”</w:t>
+      </w:r>
+      <w:r>
+        <w:t>, and</w:t>
+      </w:r>
+      <w:r>
+        <w:t xml:space="preserve"> will</w:t>
+      </w:r>
+      <w:r>
+        <w:t xml:space="preserve"> be assigned to the human scorer for scoring. </w:t>
+      </w:r>
+    </w:p>
+    <w:p>
+      <w:r>
+        <w:t>The number of essays</w:t>
+      </w:r>
+      <w:r>
+        <w:t xml:space="preserve"> </w:t>
+      </w:r>
+      <w:r>
+        <w:t>classified as “fail”</w:t>
+      </w:r>
+      <w:r>
+        <w:t>,</w:t>
+      </w:r>
+      <w:r>
+        <w:t xml:space="preserve"> due to a high WER is </w:t>
+      </w:r>
+      <w:r>
+        <w:t xml:space="preserve">more than </w:t>
+      </w:r>
+      <w:r>
+        <w:t xml:space="preserve">double that of those </w:t>
+      </w:r>
+      <w:r>
+        <w:t>classified as “pass”</w:t>
+      </w:r>
+      <w:r>
+        <w:t xml:space="preserve">. </w:t>
+      </w:r>
+      <w:r>
+        <w:t>With respect CER the number of transcriptions that are classified as “pass” is roughly 10% more than those classified as “fail”.</w:t>
+      </w:r>
+      <w:r>
+        <w:t xml:space="preserve"> The model seems to more consistently get </w:t>
+      </w:r>
+      <w:r>
+        <w:t>words</w:t>
+      </w:r>
+      <w:r>
+        <w:t xml:space="preserve"> wrong rather than </w:t>
+      </w:r>
+      <w:r>
+        <w:t>individual letters or characters.</w:t>
+      </w:r>
+      <w:r>
+        <w:t xml:space="preserve"> There were 8/27 WER passes, 29.63% and 15/25 CER passes, 55.56%.</w:t>
+      </w:r>
+    </w:p>
+    <w:p>
+      <w:r>
+        <w:t xml:space="preserve">The </w:t>
+      </w:r>
+      <w:r>
+        <w:t>most accurately transcribed essay has a WER o</w:t>
+      </w:r>
+      <w:r>
+        <w:t>f</w:t>
+      </w:r>
+      <w:r>
+        <w:t xml:space="preserve"> </w:t>
+      </w:r>
+      <w:r>
+        <w:t>6.67%</w:t>
+      </w:r>
+      <w:r>
+        <w:t xml:space="preserve">, and a CER of </w:t>
+      </w:r>
+      <w:r>
+        <w:t xml:space="preserve">less than </w:t>
+      </w:r>
+      <w:r>
+        <w:t xml:space="preserve">2%.  </w:t>
+      </w:r>
+      <w:r>
+        <w:t>P</w:t>
+      </w:r>
+      <w:r>
+        <w:t>erusal of th</w:t>
+      </w:r>
+      <w:r>
+        <w:t>is</w:t>
+      </w:r>
+      <w:r>
+        <w:t xml:space="preserve"> </w:t>
+      </w:r>
+      <w:r>
+        <w:t xml:space="preserve">essay after </w:t>
+      </w:r>
+      <w:r>
+        <w:t>normalisation revealed</w:t>
+      </w:r>
+      <w:r>
+        <w:t xml:space="preserve"> that it is near perfect and </w:t>
+      </w:r>
+      <w:r>
+        <w:t xml:space="preserve">that </w:t>
+      </w:r>
+      <w:r>
+        <w:t>the errors in transcription d</w:t>
+      </w:r>
+      <w:r>
+        <w:t>id</w:t>
+      </w:r>
+      <w:r>
+        <w:t xml:space="preserve"> not detract from the semantic of the essay. </w:t>
+      </w:r>
+      <w:r>
+        <w:t>An excerpt is shown below.</w:t>
+      </w:r>
+    </w:p>
+    <w:p>
+      <w:r>
+        <w:drawing>
+          <wp:inline distT="0" distB="0" distL="0" distR="0" wp14:anchorId="300EB876" wp14:editId="3FC76474">
+            <wp:extent cx="3848637" cy="1781424"/>
+            <wp:effectExtent l="0" t="0" r="0" b="9525"/>
+            <wp:docPr id="1364885674" name="Picture 1"/>
+            <wp:cNvGraphicFramePr>
+              <a:graphicFrameLocks xmlns:a="http://schemas.openxmlformats.org/drawingml/2006/main" noChangeAspect="1"/>
+            </wp:cNvGraphicFramePr>
+            <a:graphic xmlns:a="http://schemas.openxmlformats.org/drawingml/2006/main">
+              <a:graphicData uri="http://schemas.openxmlformats.org/drawingml/2006/picture">
+                <pic:pic xmlns:pic="http://schemas.openxmlformats.org/drawingml/2006/picture">
+                  <pic:nvPicPr>
+                    <pic:cNvPr id="1364885674" name=""/>
+                    <pic:cNvPicPr/>
+                  </pic:nvPicPr>
+                  <pic:blipFill>
+                    <a:blip r:embed="rId20"/>
+                    <a:stretch>
+                      <a:fillRect/>
+                    </a:stretch>
+                  </pic:blipFill>
+                  <pic:spPr>
+                    <a:xfrm>
+                      <a:off x="0" y="0"/>
+                      <a:ext cx="3848637" cy="1781424"/>
+                    </a:xfrm>
+                    <a:prstGeom prst="rect">
+                      <a:avLst/>
+                    </a:prstGeom>
+                  </pic:spPr>
+                </pic:pic>
+              </a:graphicData>
+            </a:graphic>
+          </wp:inline>
+        </w:drawing>
+      </w:r>
+    </w:p>
+    <w:p>
+      <w:r>
+        <w:lastRenderedPageBreak/>
+        <w:t xml:space="preserve">The essay with the median WER percentage has a WER </w:t>
+      </w:r>
+      <w:r>
+        <w:t>slightly above the acceptable</w:t>
+      </w:r>
+      <w:r>
+        <w:t xml:space="preserve"> WER </w:t>
+      </w:r>
+      <w:r>
+        <w:t>threshold,</w:t>
+      </w:r>
+      <w:r>
+        <w:t xml:space="preserve"> and a CER </w:t>
+      </w:r>
+      <w:r>
+        <w:t>slightly below the</w:t>
+      </w:r>
+      <w:r>
+        <w:t xml:space="preserve"> acceptable threshold.</w:t>
+      </w:r>
+      <w:r>
+        <w:t xml:space="preserve"> </w:t>
+      </w:r>
+      <w:r>
+        <w:drawing>
+          <wp:inline distT="0" distB="0" distL="0" distR="0" wp14:anchorId="64DE5C6B" wp14:editId="418C5887">
+            <wp:extent cx="4667901" cy="1781424"/>
+            <wp:effectExtent l="0" t="0" r="0" b="9525"/>
+            <wp:docPr id="1460716706" name="Picture 1"/>
+            <wp:cNvGraphicFramePr>
+              <a:graphicFrameLocks xmlns:a="http://schemas.openxmlformats.org/drawingml/2006/main" noChangeAspect="1"/>
+            </wp:cNvGraphicFramePr>
+            <a:graphic xmlns:a="http://schemas.openxmlformats.org/drawingml/2006/main">
+              <a:graphicData uri="http://schemas.openxmlformats.org/drawingml/2006/picture">
+                <pic:pic xmlns:pic="http://schemas.openxmlformats.org/drawingml/2006/picture">
+                  <pic:nvPicPr>
+                    <pic:cNvPr id="1460716706" name=""/>
+                    <pic:cNvPicPr/>
+                  </pic:nvPicPr>
+                  <pic:blipFill>
+                    <a:blip r:embed="rId21"/>
+                    <a:stretch>
+                      <a:fillRect/>
+                    </a:stretch>
+                  </pic:blipFill>
+                  <pic:spPr>
+                    <a:xfrm>
+                      <a:off x="0" y="0"/>
+                      <a:ext cx="4667901" cy="1781424"/>
+                    </a:xfrm>
+                    <a:prstGeom prst="rect">
+                      <a:avLst/>
+                    </a:prstGeom>
+                  </pic:spPr>
+                </pic:pic>
+              </a:graphicData>
+            </a:graphic>
+          </wp:inline>
+        </w:drawing>
+      </w:r>
+    </w:p>
+    <w:p>
+      <w:r>
+        <w:t xml:space="preserve"> </w:t>
+      </w:r>
+      <w:r>
+        <w:t xml:space="preserve">From a visual inspection </w:t>
+      </w:r>
+      <w:r>
+        <w:t>of the</w:t>
+      </w:r>
+      <w:r>
+        <w:t xml:space="preserve"> normalised essay, it </w:t>
+      </w:r>
+      <w:r>
+        <w:t>is</w:t>
+      </w:r>
+      <w:r>
+        <w:t xml:space="preserve"> apparent that most of the wrongly transcribed words are </w:t>
+      </w:r>
+      <w:r>
+        <w:t xml:space="preserve">still </w:t>
+      </w:r>
+      <w:r>
+        <w:t>decipherable by a human scorer. For example, Whisper transcribed “sea floor spreading” as</w:t>
+      </w:r>
+    </w:p>
+    <w:p>
+      <w:r>
+        <w:drawing>
+          <wp:inline distT="0" distB="0" distL="0" distR="0" wp14:anchorId="17A16A25" wp14:editId="021924A7">
+            <wp:extent cx="2584173" cy="276447"/>
+            <wp:effectExtent l="0" t="0" r="6985" b="9525"/>
+            <wp:docPr id="2132120072" name="Picture 1"/>
+            <wp:cNvGraphicFramePr>
+              <a:graphicFrameLocks xmlns:a="http://schemas.openxmlformats.org/drawingml/2006/main" noChangeAspect="1"/>
+            </wp:cNvGraphicFramePr>
+            <a:graphic xmlns:a="http://schemas.openxmlformats.org/drawingml/2006/main">
+              <a:graphicData uri="http://schemas.openxmlformats.org/drawingml/2006/picture">
+                <pic:pic xmlns:pic="http://schemas.openxmlformats.org/drawingml/2006/picture">
+                  <pic:nvPicPr>
+                    <pic:cNvPr id="2132120072" name=""/>
+                    <pic:cNvPicPr/>
+                  </pic:nvPicPr>
+                  <pic:blipFill>
+                    <a:blip r:embed="rId22"/>
+                    <a:stretch>
+                      <a:fillRect/>
+                    </a:stretch>
+                  </pic:blipFill>
+                  <pic:spPr>
+                    <a:xfrm>
+                      <a:off x="0" y="0"/>
+                      <a:ext cx="2609479" cy="279154"/>
+                    </a:xfrm>
+                    <a:prstGeom prst="rect">
+                      <a:avLst/>
+                    </a:prstGeom>
+                  </pic:spPr>
+                </pic:pic>
+              </a:graphicData>
+            </a:graphic>
+          </wp:inline>
+        </w:drawing>
+      </w:r>
+      <w:r>
+        <w:t xml:space="preserve">. This </w:t>
+      </w:r>
+      <w:r>
+        <w:t>observation</w:t>
+      </w:r>
+      <w:r>
+        <w:t>, however,</w:t>
+      </w:r>
+      <w:r>
+        <w:t xml:space="preserve"> </w:t>
+      </w:r>
+      <w:r>
+        <w:t xml:space="preserve">does not motivate an adjustment to the current thresholds as this </w:t>
+      </w:r>
+      <w:r>
+        <w:t>substitution,</w:t>
+      </w:r>
+      <w:r>
+        <w:t xml:space="preserve"> though recognisable to a human score</w:t>
+      </w:r>
+      <w:r>
+        <w:t xml:space="preserve">r, is </w:t>
+      </w:r>
+      <w:r>
+        <w:t xml:space="preserve">likely </w:t>
+      </w:r>
+      <w:r>
+        <w:t xml:space="preserve">to </w:t>
+      </w:r>
+      <w:r>
+        <w:t xml:space="preserve">affect the </w:t>
+      </w:r>
+      <w:r>
+        <w:t>transformer’s interpretation</w:t>
+      </w:r>
+      <w:r>
+        <w:t>, resulting in an inaccurate score</w:t>
+      </w:r>
+      <w:r>
+        <w:t xml:space="preserve">. </w:t>
+      </w:r>
+    </w:p>
+    <w:p>
+      <w:r>
+        <w:t>The screenshots below are from transcriptions with WER and CER percentages between the min and median and the median and max, respectively.</w:t>
+      </w:r>
+    </w:p>
+    <w:p>
+      <w:r>
+        <w:drawing>
+          <wp:inline distT="0" distB="0" distL="0" distR="0" wp14:anchorId="73600ADA" wp14:editId="468D3186">
+            <wp:extent cx="4896533" cy="1648055"/>
+            <wp:effectExtent l="0" t="0" r="0" b="9525"/>
+            <wp:docPr id="1081167865" name="Picture 1"/>
+            <wp:cNvGraphicFramePr>
+              <a:graphicFrameLocks xmlns:a="http://schemas.openxmlformats.org/drawingml/2006/main" noChangeAspect="1"/>
+            </wp:cNvGraphicFramePr>
+            <a:graphic xmlns:a="http://schemas.openxmlformats.org/drawingml/2006/main">
+              <a:graphicData uri="http://schemas.openxmlformats.org/drawingml/2006/picture">
+                <pic:pic xmlns:pic="http://schemas.openxmlformats.org/drawingml/2006/picture">
+                  <pic:nvPicPr>
+                    <pic:cNvPr id="1081167865" name=""/>
+                    <pic:cNvPicPr/>
+                  </pic:nvPicPr>
+                  <pic:blipFill>
+                    <a:blip r:embed="rId23"/>
+                    <a:stretch>
+                      <a:fillRect/>
+                    </a:stretch>
+                  </pic:blipFill>
+                  <pic:spPr>
+                    <a:xfrm>
+                      <a:off x="0" y="0"/>
+                      <a:ext cx="4896533" cy="1648055"/>
+                    </a:xfrm>
+                    <a:prstGeom prst="rect">
+                      <a:avLst/>
+                    </a:prstGeom>
+                  </pic:spPr>
+                </pic:pic>
+              </a:graphicData>
+            </a:graphic>
+          </wp:inline>
+        </w:drawing>
+      </w:r>
+    </w:p>
+    <w:p>
+      <w:r>
+        <w:drawing>
+          <wp:inline distT="0" distB="0" distL="0" distR="0" wp14:anchorId="78DE51DC" wp14:editId="03F76414">
+            <wp:extent cx="5172797" cy="1810003"/>
+            <wp:effectExtent l="0" t="0" r="0" b="0"/>
+            <wp:docPr id="1322649141" name="Picture 1"/>
+            <wp:cNvGraphicFramePr>
+              <a:graphicFrameLocks xmlns:a="http://schemas.openxmlformats.org/drawingml/2006/main" noChangeAspect="1"/>
+            </wp:cNvGraphicFramePr>
+            <a:graphic xmlns:a="http://schemas.openxmlformats.org/drawingml/2006/main">
+              <a:graphicData uri="http://schemas.openxmlformats.org/drawingml/2006/picture">
+                <pic:pic xmlns:pic="http://schemas.openxmlformats.org/drawingml/2006/picture">
+                  <pic:nvPicPr>
+                    <pic:cNvPr id="1322649141" name=""/>
+                    <pic:cNvPicPr/>
+                  </pic:nvPicPr>
+                  <pic:blipFill>
+                    <a:blip r:embed="rId24"/>
+                    <a:stretch>
+                      <a:fillRect/>
+                    </a:stretch>
+                  </pic:blipFill>
+                  <pic:spPr>
+                    <a:xfrm>
+                      <a:off x="0" y="0"/>
+                      <a:ext cx="5172797" cy="1810003"/>
+                    </a:xfrm>
+                    <a:prstGeom prst="rect">
+                      <a:avLst/>
+                    </a:prstGeom>
+                  </pic:spPr>
+                </pic:pic>
+              </a:graphicData>
+            </a:graphic>
+          </wp:inline>
+        </w:drawing>
+      </w:r>
+    </w:p>
+    <w:p>
+      <w:r>
+        <w:lastRenderedPageBreak/>
+        <w:t xml:space="preserve">The transcription of Daniella voice is </w:t>
+      </w:r>
+      <w:r>
+        <w:t>highly accurate with a WER of 8.89% and a CER of 3.79%</w:t>
+      </w:r>
+      <w:r>
+        <w:t xml:space="preserve">. The transcription of Hannah although classified as “fail” is still readable and interpretable by a human scorer. </w:t>
+      </w:r>
+    </w:p>
+    <w:p>
+      <w:r>
+        <w:t>The most inaccurate transcription is still decipherable by a human scorer</w:t>
+      </w:r>
+      <w:r>
+        <w:t xml:space="preserve">, as seen in the screenshot below. </w:t>
+      </w:r>
+    </w:p>
+    <w:p>
+      <w:r>
+        <w:drawing>
+          <wp:inline distT="0" distB="0" distL="0" distR="0" wp14:anchorId="0429DC32" wp14:editId="54F11B51">
+            <wp:extent cx="4248743" cy="1619476"/>
+            <wp:effectExtent l="0" t="0" r="0" b="0"/>
+            <wp:docPr id="1179730839" name="Picture 1"/>
+            <wp:cNvGraphicFramePr>
+              <a:graphicFrameLocks xmlns:a="http://schemas.openxmlformats.org/drawingml/2006/main" noChangeAspect="1"/>
+            </wp:cNvGraphicFramePr>
+            <a:graphic xmlns:a="http://schemas.openxmlformats.org/drawingml/2006/main">
+              <a:graphicData uri="http://schemas.openxmlformats.org/drawingml/2006/picture">
+                <pic:pic xmlns:pic="http://schemas.openxmlformats.org/drawingml/2006/picture">
+                  <pic:nvPicPr>
+                    <pic:cNvPr id="1179730839" name=""/>
+                    <pic:cNvPicPr/>
+                  </pic:nvPicPr>
+                  <pic:blipFill>
+                    <a:blip r:embed="rId25"/>
+                    <a:stretch>
+                      <a:fillRect/>
+                    </a:stretch>
+                  </pic:blipFill>
+                  <pic:spPr>
+                    <a:xfrm>
+                      <a:off x="0" y="0"/>
+                      <a:ext cx="4248743" cy="1619476"/>
+                    </a:xfrm>
+                    <a:prstGeom prst="rect">
+                      <a:avLst/>
+                    </a:prstGeom>
+                  </pic:spPr>
+                </pic:pic>
+              </a:graphicData>
+            </a:graphic>
+          </wp:inline>
+        </w:drawing>
+      </w:r>
+    </w:p>
+    <w:p>
+      <w:r>
+        <w:t xml:space="preserve"> This indicates that the evaluation logic worked as intended, demonstrating sensitivity to transcriptions with high WER percentages, preventing them from moving through the pipeline. </w:t>
+      </w:r>
+    </w:p>
+    <w:p>
+      <w:r>
+        <w:t>This analysis supports the inclusion of Whisper in the AES pipeline as an assistive technology. However, the high proportion of failed transcriptions justifies the use of evaluation logic to route transcriptions to the appropriate scorer based on their WER and CER.</w:t>
+      </w:r>
+      <w:r>
         <w:br w:type="page"/>
       </w:r>
     </w:p>
     <w:p>
-      <w:pPr>
-        <w:pStyle w:val="ListParagraph"/>
-        <w:numPr>
-          <w:ilvl w:val="0"/>
-          <w:numId w:val="28"/>
-        </w:numPr>
-        <w:tabs>
-          <w:tab w:val="left" w:pos="1965"/>
-        </w:tabs>
-      </w:pPr>
       <w:r>
         <w:rPr>
           <w:b/>
@@ -13630,15 +14838,18 @@
       <w:r>
         <w:br w:type="page"/>
       </w:r>
-      <w:bookmarkStart w:id="25" w:name="_Toc236493182"/>
+      <w:bookmarkStart w:id="23" w:name="_Toc236493182"/>
       <w:r>
         <w:lastRenderedPageBreak/>
-        <w:t xml:space="preserve">5.4 </w:t>
+        <w:t>5.4</w:t>
+      </w:r>
+      <w:r>
+        <w:t xml:space="preserve"> </w:t>
       </w:r>
       <w:r>
         <w:t>Integration Testing</w:t>
       </w:r>
-      <w:bookmarkEnd w:id="25"/>
+      <w:bookmarkEnd w:id="23"/>
     </w:p>
     <w:p/>
     <w:tbl>
@@ -14076,7 +15287,7 @@
                     <pic:cNvPicPr/>
                   </pic:nvPicPr>
                   <pic:blipFill rotWithShape="1">
-                    <a:blip r:embed="rId18"/>
+                    <a:blip r:embed="rId26"/>
                     <a:srcRect l="575"/>
                     <a:stretch>
                       <a:fillRect/>
@@ -14118,7 +15329,7 @@
       <w:r>
         <w:br w:type="page"/>
       </w:r>
-      <w:bookmarkStart w:id="26" w:name="_Toc236493183"/>
+      <w:bookmarkStart w:id="24" w:name="_Toc236493183"/>
       <w:r>
         <w:lastRenderedPageBreak/>
         <w:t xml:space="preserve">5.5 </w:t>
@@ -14129,7 +15340,7 @@
       <w:r>
         <w:t>System Testing</w:t>
       </w:r>
-      <w:bookmarkEnd w:id="26"/>
+      <w:bookmarkEnd w:id="24"/>
     </w:p>
     <w:p/>
     <w:p>
@@ -14549,7 +15760,7 @@
       <w:pPr>
         <w:pStyle w:val="Heading2"/>
       </w:pPr>
-      <w:bookmarkStart w:id="27" w:name="_Toc236493184"/>
+      <w:bookmarkStart w:id="25" w:name="_Toc236493184"/>
       <w:r>
         <w:lastRenderedPageBreak/>
         <w:t xml:space="preserve">5.6 </w:t>
@@ -14560,7 +15771,7 @@
       <w:r>
         <w:t>User Testing</w:t>
       </w:r>
-      <w:bookmarkEnd w:id="27"/>
+      <w:bookmarkEnd w:id="25"/>
     </w:p>
     <w:tbl>
       <w:tblPr>
@@ -14857,7 +16068,7 @@
       <w:pPr>
         <w:pStyle w:val="Heading3"/>
         <w:sectPr>
-          <w:footerReference w:type="default" r:id="rId19"/>
+          <w:footerReference w:type="default" r:id="rId27"/>
           <w:pgSz w:w="11906" w:h="16838"/>
           <w:pgMar w:top="1440" w:right="1440" w:bottom="1440" w:left="1440" w:header="708" w:footer="708" w:gutter="0"/>
           <w:cols w:space="708"/>
@@ -14870,7 +16081,7 @@
       <w:pPr>
         <w:pStyle w:val="Heading2"/>
       </w:pPr>
-      <w:bookmarkStart w:id="28" w:name="_Toc236493185"/>
+      <w:bookmarkStart w:id="26" w:name="_Toc236493185"/>
       <w:r>
         <w:lastRenderedPageBreak/>
         <w:t xml:space="preserve">5.7 </w:t>
@@ -14878,7 +16089,7 @@
       <w:r>
         <w:t>Usability Testing</w:t>
       </w:r>
-      <w:bookmarkEnd w:id="28"/>
+      <w:bookmarkEnd w:id="26"/>
     </w:p>
     <w:p/>
     <w:tbl>
@@ -15675,25 +16886,25 @@
         <w:pStyle w:val="Heading1"/>
         <w:jc w:val="center"/>
       </w:pPr>
-      <w:bookmarkStart w:id="29" w:name="_Toc236493186"/>
+      <w:bookmarkStart w:id="27" w:name="_Toc236493186"/>
       <w:r>
         <w:t>Chapter 6</w:t>
       </w:r>
-      <w:bookmarkEnd w:id="29"/>
+      <w:bookmarkEnd w:id="27"/>
     </w:p>
     <w:p>
       <w:pPr>
         <w:pStyle w:val="Heading1"/>
         <w:jc w:val="center"/>
       </w:pPr>
-      <w:bookmarkStart w:id="30" w:name="_Toc236493187"/>
+      <w:bookmarkStart w:id="28" w:name="_Toc236493187"/>
       <w:r>
         <w:t xml:space="preserve">Conclusion and </w:t>
       </w:r>
       <w:r>
         <w:t>Future Improvements</w:t>
       </w:r>
-      <w:bookmarkEnd w:id="30"/>
+      <w:bookmarkEnd w:id="28"/>
     </w:p>
     <w:p>
       <w:r>
@@ -15840,6 +17051,18 @@
         <w:t xml:space="preserve">Combining interpretable features such as word count, sentence count, spelling errors with transformer output, or using them to engineer a trainable system. </w:t>
       </w:r>
     </w:p>
+    <w:p>
+      <w:pPr>
+        <w:pStyle w:val="ListParagraph"/>
+        <w:numPr>
+          <w:ilvl w:val="0"/>
+          <w:numId w:val="36"/>
+        </w:numPr>
+      </w:pPr>
+      <w:r>
+        <w:t>Merge images of essays submitted as separate files</w:t>
+      </w:r>
+    </w:p>
     <w:p/>
     <w:p>
       <w:pPr>
@@ -15858,7 +17081,7 @@
       <w:pPr>
         <w:pStyle w:val="Heading2"/>
       </w:pPr>
-      <w:bookmarkStart w:id="31" w:name="_Toc236493188"/>
+      <w:bookmarkStart w:id="29" w:name="_Toc236493188"/>
       <w:r>
         <w:lastRenderedPageBreak/>
         <w:t>Appendix A</w:t>
@@ -15916,7 +17139,7 @@
         <w:lastRenderedPageBreak/>
         <w:t xml:space="preserve">Appendix </w:t>
       </w:r>
-      <w:bookmarkEnd w:id="31"/>
+      <w:bookmarkEnd w:id="29"/>
       <w:r>
         <w:t>B</w:t>
       </w:r>
@@ -16078,8 +17301,9 @@
           <w:lang w:eastAsia="en-GB"/>
           <w14:ligatures w14:val="none"/>
         </w:rPr>
-        <w:t xml:space="preserve"> His solution to survive this weather that is dangerous to us humans is to allow them to float above the fray. A "blimp-like" vehicle hovering 30 or so miles would help avoid the unfriendly ground </w:t>
-      </w:r>
+        <w:t xml:space="preserve"> His solution to survive this weather that is dangerous to us humans </w:t>
+      </w:r>
+      <w:proofErr w:type="gramStart"/>
       <w:r>
         <w:rPr>
           <w:rFonts w:ascii="Aptos Narrow" w:eastAsia="Times New Roman" w:hAnsi="Aptos Narrow" w:cs="Times New Roman"/>
@@ -16088,8 +17312,9 @@
           <w:lang w:eastAsia="en-GB"/>
           <w14:ligatures w14:val="none"/>
         </w:rPr>
-        <w:t>conditions.</w:t>
-      </w:r>
+        <w:t>is</w:t>
+      </w:r>
+      <w:proofErr w:type="gramEnd"/>
       <w:r>
         <w:rPr>
           <w:rFonts w:ascii="Aptos Narrow" w:eastAsia="Times New Roman" w:hAnsi="Aptos Narrow" w:cs="Times New Roman"/>
@@ -16098,9 +17323,8 @@
           <w:lang w:eastAsia="en-GB"/>
           <w14:ligatures w14:val="none"/>
         </w:rPr>
-        <w:t xml:space="preserve"> At thirty-plus miles above the surface, temperatures would still be toasty at around 170 degrees Fahrenheit, but the air pressure would be close to that of sea level on Earth. So not easy conditions, but survivable enough for humans. </w:t>
-      </w:r>
-      <w:proofErr w:type="gramStart"/>
+        <w:t xml:space="preserve"> to allow them to float above the fray. A "blimp-like" vehicle hovering 30 or so miles would help avoid the unfriendly ground </w:t>
+      </w:r>
       <w:r>
         <w:rPr>
           <w:rFonts w:ascii="Aptos Narrow" w:eastAsia="Times New Roman" w:hAnsi="Aptos Narrow" w:cs="Times New Roman"/>
@@ -16109,9 +17333,8 @@
           <w:lang w:eastAsia="en-GB"/>
           <w14:ligatures w14:val="none"/>
         </w:rPr>
-        <w:t>So</w:t>
-      </w:r>
-      <w:proofErr w:type="gramEnd"/>
+        <w:t>conditions.</w:t>
+      </w:r>
       <w:r>
         <w:rPr>
           <w:rFonts w:ascii="Aptos Narrow" w:eastAsia="Times New Roman" w:hAnsi="Aptos Narrow" w:cs="Times New Roman"/>
@@ -16120,8 +17343,9 @@
           <w:lang w:eastAsia="en-GB"/>
           <w14:ligatures w14:val="none"/>
         </w:rPr>
-        <w:t xml:space="preserve"> this would help make the mission capeable of completing.</w:t>
-      </w:r>
+        <w:t xml:space="preserve"> At thirty-plus miles above the surface, temperatures would still be toasty at around 170 degrees Fahrenheit, but the air pressure would be close to that of sea level on Earth. So not easy conditions, but survivable enough for humans. </w:t>
+      </w:r>
+      <w:proofErr w:type="gramStart"/>
       <w:r>
         <w:rPr>
           <w:rFonts w:ascii="Aptos Narrow" w:eastAsia="Times New Roman" w:hAnsi="Aptos Narrow" w:cs="Times New Roman"/>
@@ -16130,8 +17354,9 @@
           <w:lang w:eastAsia="en-GB"/>
           <w14:ligatures w14:val="none"/>
         </w:rPr>
-        <w:br/>
-      </w:r>
+        <w:t>So</w:t>
+      </w:r>
+      <w:proofErr w:type="gramEnd"/>
       <w:r>
         <w:rPr>
           <w:rFonts w:ascii="Aptos Narrow" w:eastAsia="Times New Roman" w:hAnsi="Aptos Narrow" w:cs="Times New Roman"/>
@@ -16140,9 +17365,9 @@
           <w:lang w:eastAsia="en-GB"/>
           <w14:ligatures w14:val="none"/>
         </w:rPr>
-        <w:br/>
-        <w:t xml:space="preserve">He also mentions how peering at venus from a ship orbiting or hovering safely far above the planet can provide only limited insight on ground conditions because most forms of light cannot penertrate the dense atmosphere making it hard to take </w:t>
-      </w:r>
+        <w:t xml:space="preserve"> this would help make the mission </w:t>
+      </w:r>
+      <w:proofErr w:type="spellStart"/>
       <w:r>
         <w:rPr>
           <w:rFonts w:ascii="Aptos Narrow" w:eastAsia="Times New Roman" w:hAnsi="Aptos Narrow" w:cs="Times New Roman"/>
@@ -16151,8 +17376,9 @@
           <w:lang w:eastAsia="en-GB"/>
           <w14:ligatures w14:val="none"/>
         </w:rPr>
-        <w:t>photographs.</w:t>
-      </w:r>
+        <w:t>capeable</w:t>
+      </w:r>
+      <w:proofErr w:type="spellEnd"/>
       <w:r>
         <w:rPr>
           <w:rFonts w:ascii="Aptos Narrow" w:eastAsia="Times New Roman" w:hAnsi="Aptos Narrow" w:cs="Times New Roman"/>
@@ -16161,7 +17387,136 @@
           <w:lang w:eastAsia="en-GB"/>
           <w14:ligatures w14:val="none"/>
         </w:rPr>
-        <w:t xml:space="preserve"> They also cannot take samples of rock, gas, or anything else, from a distance. So many reaserchers are working on innovations that would allow their machines to last long enough to help gain some imformation of Venus.</w:t>
+        <w:t xml:space="preserve"> of completing.</w:t>
+      </w:r>
+      <w:r>
+        <w:rPr>
+          <w:rFonts w:ascii="Aptos Narrow" w:eastAsia="Times New Roman" w:hAnsi="Aptos Narrow" w:cs="Times New Roman"/>
+          <w:color w:val="000000"/>
+          <w:kern w:val="0"/>
+          <w:lang w:eastAsia="en-GB"/>
+          <w14:ligatures w14:val="none"/>
+        </w:rPr>
+        <w:br/>
+      </w:r>
+      <w:r>
+        <w:rPr>
+          <w:rFonts w:ascii="Aptos Narrow" w:eastAsia="Times New Roman" w:hAnsi="Aptos Narrow" w:cs="Times New Roman"/>
+          <w:color w:val="000000"/>
+          <w:kern w:val="0"/>
+          <w:lang w:eastAsia="en-GB"/>
+          <w14:ligatures w14:val="none"/>
+        </w:rPr>
+        <w:br/>
+        <w:t xml:space="preserve">He also mentions how peering at </w:t>
+      </w:r>
+      <w:proofErr w:type="spellStart"/>
+      <w:r>
+        <w:rPr>
+          <w:rFonts w:ascii="Aptos Narrow" w:eastAsia="Times New Roman" w:hAnsi="Aptos Narrow" w:cs="Times New Roman"/>
+          <w:color w:val="000000"/>
+          <w:kern w:val="0"/>
+          <w:lang w:eastAsia="en-GB"/>
+          <w14:ligatures w14:val="none"/>
+        </w:rPr>
+        <w:t>venus</w:t>
+      </w:r>
+      <w:proofErr w:type="spellEnd"/>
+      <w:r>
+        <w:rPr>
+          <w:rFonts w:ascii="Aptos Narrow" w:eastAsia="Times New Roman" w:hAnsi="Aptos Narrow" w:cs="Times New Roman"/>
+          <w:color w:val="000000"/>
+          <w:kern w:val="0"/>
+          <w:lang w:eastAsia="en-GB"/>
+          <w14:ligatures w14:val="none"/>
+        </w:rPr>
+        <w:t xml:space="preserve"> from a ship orbiting or hovering safely far above the planet can provide only limited insight on ground conditions because most forms of light cannot </w:t>
+      </w:r>
+      <w:proofErr w:type="spellStart"/>
+      <w:r>
+        <w:rPr>
+          <w:rFonts w:ascii="Aptos Narrow" w:eastAsia="Times New Roman" w:hAnsi="Aptos Narrow" w:cs="Times New Roman"/>
+          <w:color w:val="000000"/>
+          <w:kern w:val="0"/>
+          <w:lang w:eastAsia="en-GB"/>
+          <w14:ligatures w14:val="none"/>
+        </w:rPr>
+        <w:t>penertrate</w:t>
+      </w:r>
+      <w:proofErr w:type="spellEnd"/>
+      <w:r>
+        <w:rPr>
+          <w:rFonts w:ascii="Aptos Narrow" w:eastAsia="Times New Roman" w:hAnsi="Aptos Narrow" w:cs="Times New Roman"/>
+          <w:color w:val="000000"/>
+          <w:kern w:val="0"/>
+          <w:lang w:eastAsia="en-GB"/>
+          <w14:ligatures w14:val="none"/>
+        </w:rPr>
+        <w:t xml:space="preserve"> the dense atmosphere making it hard to take </w:t>
+      </w:r>
+      <w:r>
+        <w:rPr>
+          <w:rFonts w:ascii="Aptos Narrow" w:eastAsia="Times New Roman" w:hAnsi="Aptos Narrow" w:cs="Times New Roman"/>
+          <w:color w:val="000000"/>
+          <w:kern w:val="0"/>
+          <w:lang w:eastAsia="en-GB"/>
+          <w14:ligatures w14:val="none"/>
+        </w:rPr>
+        <w:t>photographs.</w:t>
+      </w:r>
+      <w:r>
+        <w:rPr>
+          <w:rFonts w:ascii="Aptos Narrow" w:eastAsia="Times New Roman" w:hAnsi="Aptos Narrow" w:cs="Times New Roman"/>
+          <w:color w:val="000000"/>
+          <w:kern w:val="0"/>
+          <w:lang w:eastAsia="en-GB"/>
+          <w14:ligatures w14:val="none"/>
+        </w:rPr>
+        <w:t xml:space="preserve"> They also cannot take samples of rock, gas, or anything else, from a distance. So many </w:t>
+      </w:r>
+      <w:proofErr w:type="spellStart"/>
+      <w:r>
+        <w:rPr>
+          <w:rFonts w:ascii="Aptos Narrow" w:eastAsia="Times New Roman" w:hAnsi="Aptos Narrow" w:cs="Times New Roman"/>
+          <w:color w:val="000000"/>
+          <w:kern w:val="0"/>
+          <w:lang w:eastAsia="en-GB"/>
+          <w14:ligatures w14:val="none"/>
+        </w:rPr>
+        <w:t>reaserchers</w:t>
+      </w:r>
+      <w:proofErr w:type="spellEnd"/>
+      <w:r>
+        <w:rPr>
+          <w:rFonts w:ascii="Aptos Narrow" w:eastAsia="Times New Roman" w:hAnsi="Aptos Narrow" w:cs="Times New Roman"/>
+          <w:color w:val="000000"/>
+          <w:kern w:val="0"/>
+          <w:lang w:eastAsia="en-GB"/>
+          <w14:ligatures w14:val="none"/>
+        </w:rPr>
+        <w:t xml:space="preserve"> are working on innovations that would allow their machines to last long enough to help gain some </w:t>
+      </w:r>
+      <w:proofErr w:type="spellStart"/>
+      <w:r>
+        <w:rPr>
+          <w:rFonts w:ascii="Aptos Narrow" w:eastAsia="Times New Roman" w:hAnsi="Aptos Narrow" w:cs="Times New Roman"/>
+          <w:color w:val="000000"/>
+          <w:kern w:val="0"/>
+          <w:lang w:eastAsia="en-GB"/>
+          <w14:ligatures w14:val="none"/>
+        </w:rPr>
+        <w:t>imformation</w:t>
+      </w:r>
+      <w:proofErr w:type="spellEnd"/>
+      <w:r>
+        <w:rPr>
+          <w:rFonts w:ascii="Aptos Narrow" w:eastAsia="Times New Roman" w:hAnsi="Aptos Narrow" w:cs="Times New Roman"/>
+          <w:color w:val="000000"/>
+          <w:kern w:val="0"/>
+          <w:lang w:eastAsia="en-GB"/>
+          <w14:ligatures w14:val="none"/>
+        </w:rPr>
+        <w:t xml:space="preserve"> of Venus.</w:t>
       </w:r>
       <w:r>
         <w:rPr>
@@ -16216,7 +17571,7 @@
                     <pic:cNvPicPr/>
                   </pic:nvPicPr>
                   <pic:blipFill>
-                    <a:blip r:embed="rId20">
+                    <a:blip r:embed="rId28">
                       <a:extLst>
                         <a:ext uri="{28A0092B-C50C-407E-A947-70E740481C1C}">
                           <a14:useLocalDpi xmlns:a14="http://schemas.microsoft.com/office/drawing/2010/main" val="0"/>
@@ -16275,7 +17630,7 @@
                     <pic:cNvPicPr/>
                   </pic:nvPicPr>
                   <pic:blipFill>
-                    <a:blip r:embed="rId21">
+                    <a:blip r:embed="rId29">
                       <a:extLst>
                         <a:ext uri="{28A0092B-C50C-407E-A947-70E740481C1C}">
                           <a14:useLocalDpi xmlns:a14="http://schemas.microsoft.com/office/drawing/2010/main" val="0"/>
@@ -16319,12 +17674,12 @@
       <w:pPr>
         <w:pStyle w:val="Heading2"/>
       </w:pPr>
-      <w:bookmarkStart w:id="32" w:name="_Toc236493189"/>
+      <w:bookmarkStart w:id="30" w:name="_Toc236493189"/>
       <w:r>
         <w:lastRenderedPageBreak/>
         <w:t>Appendix B</w:t>
       </w:r>
-      <w:bookmarkEnd w:id="32"/>
+      <w:bookmarkEnd w:id="30"/>
     </w:p>
     <w:p/>
     <w:p>
@@ -19616,22 +20971,22 @@
       <w:pPr>
         <w:pStyle w:val="Heading2"/>
       </w:pPr>
-      <w:bookmarkStart w:id="33" w:name="_Toc236493190"/>
+      <w:bookmarkStart w:id="31" w:name="_Toc236493190"/>
       <w:r>
         <w:lastRenderedPageBreak/>
         <w:t>Appendix C</w:t>
       </w:r>
-      <w:bookmarkEnd w:id="33"/>
+      <w:bookmarkEnd w:id="31"/>
     </w:p>
     <w:p>
       <w:pPr>
         <w:pStyle w:val="Heading3"/>
       </w:pPr>
-      <w:bookmarkStart w:id="34" w:name="_Toc236493191"/>
+      <w:bookmarkStart w:id="32" w:name="_Toc236493191"/>
       <w:r>
         <w:t>Consent Forms</w:t>
       </w:r>
-      <w:bookmarkEnd w:id="34"/>
+      <w:bookmarkEnd w:id="32"/>
     </w:p>
     <w:p>
       <w:r>
@@ -19655,12 +21010,12 @@
       <w:pPr>
         <w:pStyle w:val="Heading2"/>
       </w:pPr>
-      <w:bookmarkStart w:id="35" w:name="_Toc236493192"/>
+      <w:bookmarkStart w:id="33" w:name="_Toc236493192"/>
       <w:r>
         <w:lastRenderedPageBreak/>
         <w:t>Reference List</w:t>
       </w:r>
-      <w:bookmarkEnd w:id="35"/>
+      <w:bookmarkEnd w:id="33"/>
     </w:p>
     <w:p/>
     <w:p>
@@ -19672,7 +21027,15 @@
         <w:t>[1]</w:t>
       </w:r>
       <w:r>
-        <w:t xml:space="preserve"> I. M. G. S. Artha, A. S. Kusuma, and P. Sugiartawan, "A Comparative Study of Semantic Similarity, Rubric-Based, Generative AI, and Hybrid Scoring Methods for Automated Essay Evaluation," in </w:t>
+        <w:t xml:space="preserve"> I. M. G. S. Artha, A. S. Kusuma, and P. </w:t>
+      </w:r>
+      <w:proofErr w:type="spellStart"/>
+      <w:r>
+        <w:t>Sugiartawan</w:t>
+      </w:r>
+      <w:proofErr w:type="spellEnd"/>
+      <w:r>
+        <w:t xml:space="preserve">, "A Comparative Study of Semantic Similarity, Rubric-Based, Generative AI, and Hybrid Scoring Methods for Automated Essay Evaluation," in </w:t>
       </w:r>
       <w:r>
         <w:rPr>
@@ -19682,7 +21045,15 @@
         <w:t>Proc. 2026 International Seminar on Intelligent Business and Edge-Computing Research (ISIBER)</w:t>
       </w:r>
       <w:r>
-        <w:t>, 2026, pp. 656–661, doi: 10.1109/ISIBER68248.2026.11470541.</w:t>
+        <w:t xml:space="preserve">, 2026, pp. 656–661, </w:t>
+      </w:r>
+      <w:proofErr w:type="spellStart"/>
+      <w:r>
+        <w:t>doi</w:t>
+      </w:r>
+      <w:proofErr w:type="spellEnd"/>
+      <w:r>
+        <w:t>: 10.1109/ISIBER68248.2026.11470541.</w:t>
       </w:r>
     </w:p>
     <w:p>
@@ -19704,7 +21075,15 @@
         <w:t>Proc. 2024 5th International Conference on Advanced Information Technologies (ICAIT)</w:t>
       </w:r>
       <w:r>
-        <w:t>, 2024, pp. 1–6, doi: 10.1109/ICAIT65209.2024.10754925.</w:t>
+        <w:t xml:space="preserve">, 2024, pp. 1–6, </w:t>
+      </w:r>
+      <w:proofErr w:type="spellStart"/>
+      <w:r>
+        <w:t>doi</w:t>
+      </w:r>
+      <w:proofErr w:type="spellEnd"/>
+      <w:r>
+        <w:t>: 10.1109/ICAIT65209.2024.10754925.</w:t>
       </w:r>
     </w:p>
     <w:p>
@@ -19726,7 +21105,15 @@
         <w:t>Proceedings of the 2016 Conference on Empirical Methods in Natural Language Processing (EMNLP)</w:t>
       </w:r>
       <w:r>
-        <w:t>, Austin, TX, USA, Nov. 2016, pp. 1882–1891, doi: 10.18653/v1/D16-1193.</w:t>
+        <w:t xml:space="preserve">, Austin, TX, USA, Nov. 2016, pp. 1882–1891, </w:t>
+      </w:r>
+      <w:proofErr w:type="spellStart"/>
+      <w:r>
+        <w:t>doi</w:t>
+      </w:r>
+      <w:proofErr w:type="spellEnd"/>
+      <w:r>
+        <w:t>: 10.18653/v1/D16-1193.</w:t>
       </w:r>
     </w:p>
     <w:p>
@@ -19738,7 +21125,23 @@
         <w:t>[4]</w:t>
       </w:r>
       <w:r>
-        <w:t xml:space="preserve"> A. M. Elmassry, N. Zaki, N. Alsheikh, and M. Mediani, "A Systematic Review of Pretrained Models in Automated Essay Scoring," </w:t>
+        <w:t xml:space="preserve"> A. M. </w:t>
+      </w:r>
+      <w:proofErr w:type="spellStart"/>
+      <w:r>
+        <w:t>Elmassry</w:t>
+      </w:r>
+      <w:proofErr w:type="spellEnd"/>
+      <w:r>
+        <w:t xml:space="preserve">, N. Zaki, N. Alsheikh, and M. </w:t>
+      </w:r>
+      <w:proofErr w:type="spellStart"/>
+      <w:r>
+        <w:t>Mediani</w:t>
+      </w:r>
+      <w:proofErr w:type="spellEnd"/>
+      <w:r>
+        <w:t xml:space="preserve">, "A Systematic Review of Pretrained Models in Automated Essay Scoring," </w:t>
       </w:r>
       <w:r>
         <w:rPr>
@@ -19748,7 +21151,15 @@
         <w:t>IEEE Access</w:t>
       </w:r>
       <w:r>
-        <w:t>, vol. 13, pp. 121902–121917, 2025, doi: 10.1109/ACCESS.2025.3584784.</w:t>
+        <w:t xml:space="preserve">, vol. 13, pp. 121902–121917, 2025, </w:t>
+      </w:r>
+      <w:proofErr w:type="spellStart"/>
+      <w:r>
+        <w:t>doi</w:t>
+      </w:r>
+      <w:proofErr w:type="spellEnd"/>
+      <w:r>
+        <w:t>: 10.1109/ACCESS.2025.3584784.</w:t>
       </w:r>
     </w:p>
     <w:p>
@@ -19776,7 +21187,15 @@
         <w:t>IEEE Access</w:t>
       </w:r>
       <w:r>
-        <w:t>, vol. 12, pp. 77639–77657, 2024, doi: 10.1109/ACCESS.2024.3399163.</w:t>
+        <w:t xml:space="preserve">, vol. 12, pp. 77639–77657, 2024, </w:t>
+      </w:r>
+      <w:proofErr w:type="spellStart"/>
+      <w:r>
+        <w:t>doi</w:t>
+      </w:r>
+      <w:proofErr w:type="spellEnd"/>
+      <w:r>
+        <w:t>: 10.1109/ACCESS.2024.3399163.</w:t>
       </w:r>
     </w:p>
     <w:p>
@@ -19788,7 +21207,15 @@
         <w:t>[6]</w:t>
       </w:r>
       <w:r>
-        <w:t xml:space="preserve"> P. Lagakis and S. Demetriadis, "Automated Essay Scoring: A Review of the Field," in </w:t>
+        <w:t xml:space="preserve"> P. Lagakis and S. </w:t>
+      </w:r>
+      <w:proofErr w:type="spellStart"/>
+      <w:r>
+        <w:t>Demetriadis</w:t>
+      </w:r>
+      <w:proofErr w:type="spellEnd"/>
+      <w:r>
+        <w:t xml:space="preserve">, "Automated Essay Scoring: A Review of the Field," in </w:t>
       </w:r>
       <w:r>
         <w:rPr>
@@ -19798,7 +21225,15 @@
         <w:t>Proc. 2021 International Conference on Computer, Information and Telecommunication Systems (CITS)</w:t>
       </w:r>
       <w:r>
-        <w:t>, Istanbul, Turkey, Jul. 2021, pp. 1–5, doi: 10.1109/CITS52676.2021.9618476</w:t>
+        <w:t xml:space="preserve">, Istanbul, Turkey, Jul. 2021, pp. 1–5, </w:t>
+      </w:r>
+      <w:proofErr w:type="spellStart"/>
+      <w:r>
+        <w:t>doi</w:t>
+      </w:r>
+      <w:proofErr w:type="spellEnd"/>
+      <w:r>
+        <w:t>: 10.1109/CITS52676.2021.9618476</w:t>
       </w:r>
     </w:p>
     <w:p>
@@ -19820,7 +21255,15 @@
         <w:t>Proc. 2024 4th International Conference on Educational Technology (ICET)</w:t>
       </w:r>
       <w:r>
-        <w:t>, 2024, pp. 170–175, doi: 10.1109/ICET62460.2024.10868446.</w:t>
+        <w:t xml:space="preserve">, 2024, pp. 170–175, </w:t>
+      </w:r>
+      <w:proofErr w:type="spellStart"/>
+      <w:r>
+        <w:t>doi</w:t>
+      </w:r>
+      <w:proofErr w:type="spellEnd"/>
+      <w:r>
+        <w:t>: 10.1109/ICET62460.2024.10868446.</w:t>
       </w:r>
     </w:p>
     <w:p>
@@ -19832,7 +21275,15 @@
         <w:t>[8]</w:t>
       </w:r>
       <w:r>
-        <w:t xml:space="preserve"> R. Dadi and S. K. Sanampudi, "A Robust Model for Automated Essay Scoring System," in </w:t>
+        <w:t xml:space="preserve"> R. Dadi and S. K. </w:t>
+      </w:r>
+      <w:proofErr w:type="spellStart"/>
+      <w:r>
+        <w:t>Sanampudi</w:t>
+      </w:r>
+      <w:proofErr w:type="spellEnd"/>
+      <w:r>
+        <w:t xml:space="preserve">, "A Robust Model for Automated Essay Scoring System," in </w:t>
       </w:r>
       <w:r>
         <w:rPr>
@@ -19842,7 +21293,15 @@
         <w:t>Proc. 2024 International Conference on Computational Intelligence and Sustainable Engineering Solutions (CISES)</w:t>
       </w:r>
       <w:r>
-        <w:t>, 2024, pp. 1–6, doi: 10.1109/CISES62520.2024.10712145.</w:t>
+        <w:t xml:space="preserve">, 2024, pp. 1–6, </w:t>
+      </w:r>
+      <w:proofErr w:type="spellStart"/>
+      <w:r>
+        <w:t>doi</w:t>
+      </w:r>
+      <w:proofErr w:type="spellEnd"/>
+      <w:r>
+        <w:t>: 10.1109/CISES62520.2024.10712145.</w:t>
       </w:r>
     </w:p>
     <w:p>
@@ -19861,10 +21320,34 @@
           <w:i/>
           <w:iCs/>
         </w:rPr>
-        <w:t>Proc. 2021 International Conference on Computational Performance Evaluation (ComPE)</w:t>
-      </w:r>
-      <w:r>
-        <w:t>, Shillong, India, 2021, pp. 640–646, doi: 10.1109/ComPE53109.2021.9752243.</w:t>
+        <w:t>Proc. 2021 International Conference on Computational Performance Evaluation (</w:t>
+      </w:r>
+      <w:proofErr w:type="spellStart"/>
+      <w:r>
+        <w:rPr>
+          <w:i/>
+          <w:iCs/>
+        </w:rPr>
+        <w:t>ComPE</w:t>
+      </w:r>
+      <w:proofErr w:type="spellEnd"/>
+      <w:r>
+        <w:rPr>
+          <w:i/>
+          <w:iCs/>
+        </w:rPr>
+        <w:t>)</w:t>
+      </w:r>
+      <w:r>
+        <w:t xml:space="preserve">, Shillong, India, 2021, pp. 640–646, </w:t>
+      </w:r>
+      <w:proofErr w:type="spellStart"/>
+      <w:r>
+        <w:t>doi</w:t>
+      </w:r>
+      <w:proofErr w:type="spellEnd"/>
+      <w:r>
+        <w:t>: 10.1109/ComPE53109.2021.9752243.</w:t>
       </w:r>
     </w:p>
     <w:p>
@@ -19877,214 +21360,360 @@
         <w:t>[10]</w:t>
       </w:r>
       <w:r>
-        <w:t xml:space="preserve"> M. Li, T. Lv, J. Chen, L. Cui, Y. Lu, D. Florencio, C. Zhang, Z. Li, and F. Wei, "TrOCR: Transformer-Based Optical Character Recognition with Pre-trained Models," </w:t>
-      </w:r>
+        <w:t xml:space="preserve"> M. Li, T. </w:t>
+      </w:r>
+      <w:proofErr w:type="spellStart"/>
+      <w:r>
+        <w:t>Lv</w:t>
+      </w:r>
+      <w:proofErr w:type="spellEnd"/>
+      <w:r>
+        <w:t>, J. Chen, L. Cui, Y. Lu, D. Florencio, C. Zhang, Z. Li, and F. Wei, "</w:t>
+      </w:r>
+      <w:proofErr w:type="spellStart"/>
+      <w:r>
+        <w:t>TrOCR</w:t>
+      </w:r>
+      <w:proofErr w:type="spellEnd"/>
+      <w:r>
+        <w:t xml:space="preserve">: Transformer-Based Optical Character Recognition with Pre-trained Models," </w:t>
+      </w:r>
+      <w:proofErr w:type="spellStart"/>
       <w:r>
         <w:rPr>
           <w:i/>
           <w:iCs/>
         </w:rPr>
-        <w:t>arXiv preprint arXiv:2109.10282</w:t>
-      </w:r>
-      <w:r>
-        <w:t>, 2021.</w:t>
-      </w:r>
-    </w:p>
-    <w:p>
-      <w:r>
-        <w:rPr>
-          <w:b/>
-          <w:bCs/>
-        </w:rPr>
-        <w:t>[11]</w:t>
-      </w:r>
-      <w:r>
-        <w:t xml:space="preserve"> M. T. Mostafa, E. R. Rhythm, M. H. K. Mehedi, and A. A. Rasel, "Advancements in Optical Character Recognition for Bangla Scripts," in </w:t>
-      </w:r>
+        <w:t>arXiv</w:t>
+      </w:r>
+      <w:proofErr w:type="spellEnd"/>
       <w:r>
         <w:rPr>
           <w:i/>
           <w:iCs/>
         </w:rPr>
-        <w:t>Proc. 2023 International Conference on Electrical, Computer and Communication Engineering (ECCE)</w:t>
-      </w:r>
-      <w:r>
-        <w:t>, 2023, pp. 1–6.</w:t>
-      </w:r>
-    </w:p>
-    <w:p>
-      <w:r>
-        <w:rPr>
-          <w:b/>
-          <w:bCs/>
-        </w:rPr>
-        <w:t>[12]</w:t>
-      </w:r>
-      <w:r>
-        <w:t xml:space="preserve"> J. Q. Cheok, K. C. Lim, and C. E. Si, "Maximizing Recognition Reliability: TrOCR Outperforms PaddleOCR in Challenging Container Automation Environments," </w:t>
+        <w:t xml:space="preserve"> preprint arXiv:2109.10282</w:t>
+      </w:r>
+      <w:r>
+        <w:t>, 2021.</w:t>
+      </w:r>
+    </w:p>
+    <w:p>
+      <w:r>
+        <w:rPr>
+          <w:b/>
+          <w:bCs/>
+        </w:rPr>
+        <w:t>[11]</w:t>
+      </w:r>
+      <w:r>
+        <w:t xml:space="preserve"> M. T. Mostafa, E. R. Rhythm, M. H. K. Mehedi, and A. A. Rasel, "Advancements in Optical Character Recognition for Bangla Scripts," in </w:t>
       </w:r>
       <w:r>
         <w:rPr>
           <w:i/>
           <w:iCs/>
         </w:rPr>
-        <w:t>International Journal of Research and Innovation in Social Science (IJRISS)</w:t>
-      </w:r>
-      <w:r>
-        <w:t>, vol. 9, no. 11, 2025, Art. no. 91100629, doi: 10.47772/IJRISS.2025.91100629.</w:t>
-      </w:r>
-    </w:p>
-    <w:p>
-      <w:r>
-        <w:rPr>
-          <w:b/>
-          <w:bCs/>
-        </w:rPr>
-        <w:t>[13]</w:t>
-      </w:r>
-      <w:r>
-        <w:t xml:space="preserve"> </w:t>
-      </w:r>
-      <w:r>
-        <w:t xml:space="preserve">B. Wang, T. Zhao, L. Dong, Z. Yu, and Y. Qian, "Application of PaddleOCR in Power Consumption Environment Text Recognition," in </w:t>
+        <w:t>Proc. 2023 International Conference on Electrical, Computer and Communication Engineering (ECCE)</w:t>
+      </w:r>
+      <w:r>
+        <w:t>, 2023, pp. 1–6.</w:t>
+      </w:r>
+    </w:p>
+    <w:p>
+      <w:r>
+        <w:rPr>
+          <w:b/>
+          <w:bCs/>
+        </w:rPr>
+        <w:t>[12]</w:t>
+      </w:r>
+      <w:r>
+        <w:t xml:space="preserve"> J. Q. Cheok, K. C. Lim, and C. E. Si, "Maximizing Recognition Reliability: </w:t>
+      </w:r>
+      <w:proofErr w:type="spellStart"/>
+      <w:r>
+        <w:t>TrOCR</w:t>
+      </w:r>
+      <w:proofErr w:type="spellEnd"/>
+      <w:r>
+        <w:t xml:space="preserve"> Outperforms </w:t>
+      </w:r>
+      <w:proofErr w:type="spellStart"/>
+      <w:r>
+        <w:t>PaddleOCR</w:t>
+      </w:r>
+      <w:proofErr w:type="spellEnd"/>
+      <w:r>
+        <w:t xml:space="preserve"> in Challenging Container Automation Environments," </w:t>
       </w:r>
       <w:r>
         <w:rPr>
           <w:i/>
           <w:iCs/>
         </w:rPr>
-        <w:t>Proc. 7th Int. Academic Exchange Conf. on Science and Technology Innovation (IAECST)</w:t>
-      </w:r>
-      <w:r>
-        <w:t>, 2025, pp. 1562–1566, doi: 10.1109/IAECST68792.2025.11415173.</w:t>
-      </w:r>
-    </w:p>
-    <w:p>
-      <w:r>
-        <w:rPr>
-          <w:b/>
-          <w:bCs/>
-        </w:rPr>
-        <w:t>[14]</w:t>
-      </w:r>
-      <w:r>
-        <w:t xml:space="preserve"> A. Elakkiya, K. Jaya Surya, K. Venkatesh, and S. Aakash, "Implementation of Speech to Text Conversion Using Hidden Markov Model," </w:t>
+        <w:t>International Journal of Research and Innovation in Social Science (IJRISS)</w:t>
+      </w:r>
+      <w:r>
+        <w:t xml:space="preserve">, vol. 9, no. 11, 2025, Art. no. 91100629, </w:t>
+      </w:r>
+      <w:proofErr w:type="spellStart"/>
+      <w:r>
+        <w:t>doi</w:t>
+      </w:r>
+      <w:proofErr w:type="spellEnd"/>
+      <w:r>
+        <w:t>: 10.47772/IJRISS.2025.91100629.</w:t>
+      </w:r>
+    </w:p>
+    <w:p>
+      <w:r>
+        <w:rPr>
+          <w:b/>
+          <w:bCs/>
+        </w:rPr>
+        <w:t>[13]</w:t>
+      </w:r>
+      <w:r>
+        <w:t xml:space="preserve"> </w:t>
+      </w:r>
+      <w:r>
+        <w:t xml:space="preserve">B. Wang, T. Zhao, L. Dong, Z. Yu, and Y. Qian, "Application of </w:t>
+      </w:r>
+      <w:proofErr w:type="spellStart"/>
+      <w:r>
+        <w:t>PaddleOCR</w:t>
+      </w:r>
+      <w:proofErr w:type="spellEnd"/>
+      <w:r>
+        <w:t xml:space="preserve"> in Power Consumption Environment Text Recognition," in </w:t>
       </w:r>
       <w:r>
         <w:rPr>
           <w:i/>
           <w:iCs/>
         </w:rPr>
-        <w:t>Proc. 2023 International Conference on Intelligent Computing and Control Systems (ICICCS)</w:t>
-      </w:r>
-      <w:r>
-        <w:t>, 2023, pp. 1–5.</w:t>
-      </w:r>
-    </w:p>
-    <w:p>
-      <w:r>
-        <w:rPr>
-          <w:b/>
-          <w:bCs/>
-        </w:rPr>
-        <w:t>[15]</w:t>
-      </w:r>
-      <w:r>
-        <w:t xml:space="preserve"> M. S. Tabrej, K. J. Deb, M. A. Hakim, and S. Goswami, "Automatic Speech Recognition in the Modern Era: Architectures, Training, and Evaluation," </w:t>
+        <w:t>Proc. 7th Int. Academic Exchange Conf. on Science and Technology Innovation (IAECST)</w:t>
+      </w:r>
+      <w:r>
+        <w:t xml:space="preserve">, 2025, pp. 1562–1566, </w:t>
+      </w:r>
+      <w:proofErr w:type="spellStart"/>
+      <w:r>
+        <w:t>doi</w:t>
+      </w:r>
+      <w:proofErr w:type="spellEnd"/>
+      <w:r>
+        <w:t>: 10.1109/IAECST68792.2025.11415173.</w:t>
+      </w:r>
+    </w:p>
+    <w:p>
+      <w:r>
+        <w:rPr>
+          <w:b/>
+          <w:bCs/>
+        </w:rPr>
+        <w:t>[14]</w:t>
+      </w:r>
+      <w:r>
+        <w:t xml:space="preserve"> A. Elakkiya, K. Jaya Surya, K. Venkatesh, and S. Aakash, "Implementation of Speech to Text Conversion Using Hidden Markov Model," </w:t>
       </w:r>
       <w:r>
         <w:rPr>
           <w:i/>
           <w:iCs/>
         </w:rPr>
-        <w:t>Proc. 2023 International Conference on Artificial Intelligence and Data Engineering (AIDE)</w:t>
-      </w:r>
-      <w:r>
-        <w:t>, 2023, pp. 1–6.</w:t>
-      </w:r>
-    </w:p>
-    <w:p>
-      <w:r>
-        <w:rPr>
-          <w:b/>
-          <w:bCs/>
-        </w:rPr>
-        <w:t>[16]</w:t>
-      </w:r>
-      <w:r>
-        <w:t xml:space="preserve"> G. Hinton, L. Deng, D. Yu, G. E. Dahl, A.-r. Mohamed, N. Jaitly, A. Senior, V. Vanhoucke, P. Nguyen, T. N. Sainath, and B. Kingsbury, "Deep Neural Networks for Acoustic Modeling in Speech Recognition," </w:t>
+        <w:t>Proc. 2023 International Conference on Intelligent Computing and Control Systems (ICICCS)</w:t>
+      </w:r>
+      <w:r>
+        <w:t>, 2023, pp. 1–5.</w:t>
+      </w:r>
+    </w:p>
+    <w:p>
+      <w:r>
+        <w:rPr>
+          <w:b/>
+          <w:bCs/>
+        </w:rPr>
+        <w:t>[15]</w:t>
+      </w:r>
+      <w:r>
+        <w:t xml:space="preserve"> M. S. </w:t>
+      </w:r>
+      <w:proofErr w:type="spellStart"/>
+      <w:r>
+        <w:t>Tabrej</w:t>
+      </w:r>
+      <w:proofErr w:type="spellEnd"/>
+      <w:r>
+        <w:t xml:space="preserve">, K. J. Deb, M. A. Hakim, and S. Goswami, "Automatic Speech Recognition in the Modern Era: Architectures, Training, and Evaluation," </w:t>
       </w:r>
       <w:r>
         <w:rPr>
           <w:i/>
           <w:iCs/>
         </w:rPr>
-        <w:t>IEEE Signal Processing Magazine</w:t>
-      </w:r>
-      <w:r>
-        <w:t>, vol. 29, no. 6, pp. 82–97, 2012, doi: 10.1109/MSP.2012.2205597.</w:t>
-      </w:r>
-    </w:p>
-    <w:p>
-      <w:r>
-        <w:rPr>
-          <w:b/>
-          <w:bCs/>
-        </w:rPr>
-        <w:t>[17]</w:t>
-      </w:r>
-      <w:r>
-        <w:t xml:space="preserve"> A. Radford, J. Kim, T. Xu, G. Brockman, C. McLeavey, and I. Sutskever, "Robust Speech Recognition via Large-Scale Weak Supervision," </w:t>
+        <w:t>Proc. 2023 International Conference on Artificial Intelligence and Data Engineering (AIDE)</w:t>
+      </w:r>
+      <w:r>
+        <w:t>, 2023, pp. 1–6.</w:t>
+      </w:r>
+    </w:p>
+    <w:p>
+      <w:r>
+        <w:rPr>
+          <w:b/>
+          <w:bCs/>
+        </w:rPr>
+        <w:t>[16]</w:t>
+      </w:r>
+      <w:r>
+        <w:t xml:space="preserve"> G. Hinton, L. Deng, D. Yu, G. E. Dahl, A.-r. Mohamed, N. Jaitly, A. Senior, V. Vanhoucke, P. Nguyen, T. N. Sainath, and B. Kingsbury, "Deep Neural Networks for Acoustic </w:t>
+      </w:r>
+      <w:proofErr w:type="spellStart"/>
+      <w:r>
+        <w:t>Modeling</w:t>
+      </w:r>
+      <w:proofErr w:type="spellEnd"/>
+      <w:r>
+        <w:t xml:space="preserve"> in Speech Recognition," </w:t>
       </w:r>
       <w:r>
         <w:rPr>
           <w:i/>
           <w:iCs/>
         </w:rPr>
-        <w:t>arXiv preprint arXiv:2212.04356</w:t>
-      </w:r>
-      <w:r>
-        <w:t>, 2022.</w:t>
-      </w:r>
-    </w:p>
-    <w:p>
-      <w:r>
-        <w:rPr>
-          <w:b/>
-          <w:bCs/>
-        </w:rPr>
-        <w:t>[18]</w:t>
-      </w:r>
-      <w:r>
-        <w:t xml:space="preserve"> A. Vaswani, N. Shazeer, N. Parmar, J. Uszkoreit, L. Jones, A. N. Gomez, Ł. Kaiser, and I. Polosukhin, "Attention Is All You Need," in </w:t>
-      </w:r>
+        <w:t>IEEE Signal Processing Magazine</w:t>
+      </w:r>
+      <w:r>
+        <w:t xml:space="preserve">, vol. 29, no. 6, pp. 82–97, 2012, </w:t>
+      </w:r>
+      <w:proofErr w:type="spellStart"/>
+      <w:r>
+        <w:t>doi</w:t>
+      </w:r>
+      <w:proofErr w:type="spellEnd"/>
+      <w:r>
+        <w:t>: 10.1109/MSP.2012.2205597.</w:t>
+      </w:r>
+    </w:p>
+    <w:p>
+      <w:r>
+        <w:rPr>
+          <w:b/>
+          <w:bCs/>
+        </w:rPr>
+        <w:t>[17]</w:t>
+      </w:r>
+      <w:r>
+        <w:t xml:space="preserve"> A. Radford, J. Kim, T. Xu, G. Brockman, C. McLeavey, and I. </w:t>
+      </w:r>
+      <w:proofErr w:type="spellStart"/>
+      <w:r>
+        <w:t>Sutskever</w:t>
+      </w:r>
+      <w:proofErr w:type="spellEnd"/>
+      <w:r>
+        <w:t xml:space="preserve">, "Robust Speech Recognition via Large-Scale Weak Supervision," </w:t>
+      </w:r>
+      <w:proofErr w:type="spellStart"/>
       <w:r>
         <w:rPr>
           <w:i/>
           <w:iCs/>
         </w:rPr>
-        <w:t>Advances in Neural Information Processing Systems (NeurIPS)</w:t>
-      </w:r>
-      <w:r>
-        <w:t>, 2017, pp. 5998–6008.</w:t>
-      </w:r>
-    </w:p>
-    <w:p>
-      <w:r>
-        <w:rPr>
-          <w:b/>
-          <w:bCs/>
-        </w:rPr>
-        <w:t>[19]</w:t>
-      </w:r>
-      <w:r>
-        <w:t xml:space="preserve"> K. Hlongwane, S. Mthethwa, and L. Manqele, "Enhancing Diversity in Inclusive Learning Classroom Using OpenAI Whisper Model," in </w:t>
-      </w:r>
+        <w:t>arXiv</w:t>
+      </w:r>
+      <w:proofErr w:type="spellEnd"/>
       <w:r>
         <w:rPr>
           <w:i/>
           <w:iCs/>
         </w:rPr>
+        <w:t xml:space="preserve"> preprint arXiv:2212.04356</w:t>
+      </w:r>
+      <w:r>
+        <w:t>, 2022.</w:t>
+      </w:r>
+    </w:p>
+    <w:p>
+      <w:r>
+        <w:rPr>
+          <w:b/>
+          <w:bCs/>
+        </w:rPr>
+        <w:t>[18]</w:t>
+      </w:r>
+      <w:r>
+        <w:t xml:space="preserve"> A. Vaswani, N. </w:t>
+      </w:r>
+      <w:proofErr w:type="spellStart"/>
+      <w:r>
+        <w:t>Shazeer</w:t>
+      </w:r>
+      <w:proofErr w:type="spellEnd"/>
+      <w:r>
+        <w:t xml:space="preserve">, N. Parmar, J. </w:t>
+      </w:r>
+      <w:proofErr w:type="spellStart"/>
+      <w:r>
+        <w:t>Uszkoreit</w:t>
+      </w:r>
+      <w:proofErr w:type="spellEnd"/>
+      <w:r>
+        <w:t xml:space="preserve">, L. Jones, A. N. Gomez, Ł. Kaiser, and I. </w:t>
+      </w:r>
+      <w:proofErr w:type="spellStart"/>
+      <w:r>
+        <w:t>Polosukhin</w:t>
+      </w:r>
+      <w:proofErr w:type="spellEnd"/>
+      <w:r>
+        <w:t xml:space="preserve">, "Attention Is All You Need," in </w:t>
+      </w:r>
+      <w:r>
+        <w:rPr>
+          <w:i/>
+          <w:iCs/>
+        </w:rPr>
+        <w:t>Advances in Neural Information Processing Systems (</w:t>
+      </w:r>
+      <w:proofErr w:type="spellStart"/>
+      <w:r>
+        <w:rPr>
+          <w:i/>
+          <w:iCs/>
+        </w:rPr>
+        <w:t>NeurIPS</w:t>
+      </w:r>
+      <w:proofErr w:type="spellEnd"/>
+      <w:r>
+        <w:rPr>
+          <w:i/>
+          <w:iCs/>
+        </w:rPr>
+        <w:t>)</w:t>
+      </w:r>
+      <w:r>
+        <w:t>, 2017, pp. 5998–6008.</w:t>
+      </w:r>
+    </w:p>
+    <w:p>
+      <w:r>
+        <w:rPr>
+          <w:b/>
+          <w:bCs/>
+        </w:rPr>
+        <w:t>[19]</w:t>
+      </w:r>
+      <w:r>
+        <w:t xml:space="preserve"> K. Hlongwane, S. Mthethwa, and L. Manqele, "Enhancing Diversity in Inclusive Learning Classroom Using OpenAI Whisper Model," in </w:t>
+      </w:r>
+      <w:r>
+        <w:rPr>
+          <w:i/>
+          <w:iCs/>
+        </w:rPr>
         <w:t>IST-Africa 2025 Conference Proceedings</w:t>
       </w:r>
       <w:r>
@@ -20103,211 +21732,341 @@
       <w:r>
         <w:t xml:space="preserve"> J. Su, Y. Yan, Z. Gao, H. Zhang, X. Liu, and X. Hu, "Multi-Granular Multimodal Essay Scoring," </w:t>
       </w:r>
+      <w:proofErr w:type="spellStart"/>
       <w:r>
         <w:rPr>
           <w:i/>
           <w:iCs/>
         </w:rPr>
-        <w:t>arXiv preprint arXiv:2505.13965</w:t>
-      </w:r>
-      <w:r>
-        <w:t>, 2025.</w:t>
-      </w:r>
-    </w:p>
-    <w:p>
-      <w:r>
-        <w:rPr>
-          <w:b/>
-          <w:bCs/>
-        </w:rPr>
-        <w:t>[21]</w:t>
-      </w:r>
-      <w:r>
-        <w:t xml:space="preserve"> A. Algablan, R. Alshammari, and S. Alresaini, "Scoring Students’ Answers Using OCR and GPT," </w:t>
-      </w:r>
+        <w:t>arXiv</w:t>
+      </w:r>
+      <w:proofErr w:type="spellEnd"/>
       <w:r>
         <w:rPr>
           <w:i/>
           <w:iCs/>
         </w:rPr>
-        <w:t>in Proc. 2026 IEEE 5th International Conference on Computing and Machine Intelligence (ICMI)</w:t>
-      </w:r>
-      <w:r>
-        <w:t>, 2026, doi: 10.1109/ICMI68585.2026.11539856.</w:t>
-      </w:r>
-    </w:p>
-    <w:p>
-      <w:r>
-        <w:rPr>
-          <w:b/>
-          <w:bCs/>
-        </w:rPr>
-        <w:t>[22]</w:t>
-      </w:r>
-      <w:r>
-        <w:t xml:space="preserve"> J. Gao, Q. Yang, Y. Zhang, L. Zhang, and S. Wang, "A Bi-modal Automated Essay Scoring System for Handwritten Essays," in </w:t>
+        <w:t xml:space="preserve"> preprint arXiv:2505.13965</w:t>
+      </w:r>
+      <w:r>
+        <w:t>, 2025.</w:t>
+      </w:r>
+    </w:p>
+    <w:p>
+      <w:r>
+        <w:rPr>
+          <w:b/>
+          <w:bCs/>
+        </w:rPr>
+        <w:t>[21]</w:t>
+      </w:r>
+      <w:r>
+        <w:t xml:space="preserve"> A. </w:t>
+      </w:r>
+      <w:proofErr w:type="spellStart"/>
+      <w:r>
+        <w:t>Algablan</w:t>
+      </w:r>
+      <w:proofErr w:type="spellEnd"/>
+      <w:r>
+        <w:t xml:space="preserve">, R. Alshammari, and S. </w:t>
+      </w:r>
+      <w:proofErr w:type="spellStart"/>
+      <w:r>
+        <w:t>Alresaini</w:t>
+      </w:r>
+      <w:proofErr w:type="spellEnd"/>
+      <w:r>
+        <w:t xml:space="preserve">, "Scoring Students’ Answers Using OCR and GPT," </w:t>
       </w:r>
       <w:r>
         <w:rPr>
           <w:i/>
           <w:iCs/>
         </w:rPr>
-        <w:t>Proceedings of the 2021 International Joint Conference on Neural Networks (IJCNN)</w:t>
-      </w:r>
-      <w:r>
-        <w:t>, 2021, doi: 10.1109/IJCNN52387.2021.9533505.</w:t>
-      </w:r>
-    </w:p>
-    <w:p>
-      <w:r>
-        <w:rPr>
-          <w:b/>
-          <w:bCs/>
-        </w:rPr>
-        <w:t>[23]</w:t>
-      </w:r>
-      <w:r>
-        <w:t xml:space="preserve"> C. A. L. Baclayon, K. O. R. Costelo, J. J. L. Flores, and C. L. C. Sta. Romana, "Automated Handwritten Essay Evaluation in Moodle: Leveraging Google Vision OCR and Mistral 7B," in </w:t>
+        <w:t>in Proc. 2026 IEEE 5th International Conference on Computing and Machine Intelligence (ICMI)</w:t>
+      </w:r>
+      <w:r>
+        <w:t xml:space="preserve">, 2026, </w:t>
+      </w:r>
+      <w:proofErr w:type="spellStart"/>
+      <w:r>
+        <w:t>doi</w:t>
+      </w:r>
+      <w:proofErr w:type="spellEnd"/>
+      <w:r>
+        <w:t>: 10.1109/ICMI68585.2026.11539856.</w:t>
+      </w:r>
+    </w:p>
+    <w:p>
+      <w:r>
+        <w:rPr>
+          <w:b/>
+          <w:bCs/>
+        </w:rPr>
+        <w:t>[22]</w:t>
+      </w:r>
+      <w:r>
+        <w:t xml:space="preserve"> J. Gao, Q. Yang, Y. Zhang, L. Zhang, and S. Wang, "A Bi-modal Automated Essay Scoring System for Handwritten Essays," in </w:t>
       </w:r>
       <w:r>
         <w:rPr>
           <w:i/>
           <w:iCs/>
         </w:rPr>
-        <w:t>Proceedings of ICDTE 2024</w:t>
-      </w:r>
-      <w:r>
-        <w:t>, ACM, Berlin, Germany, Aug. 07–09, 2024, doi: 10.1145/3696230.3696256.</w:t>
-      </w:r>
-    </w:p>
-    <w:p>
-      <w:r>
-        <w:rPr>
-          <w:b/>
-          <w:bCs/>
-        </w:rPr>
-        <w:t>[24]</w:t>
-      </w:r>
-      <w:r>
-        <w:t xml:space="preserve"> Y. Wang, W. Qu, and X. Ye, “Selecting Between BERT and GPT for Text Classification in Political Science Research,” arXiv preprint arXiv:2411.05050, Nov. 2024. doi: 10.48550/arXiv.2411.05050.</w:t>
-      </w:r>
-    </w:p>
-    <w:p>
-      <w:r>
-        <w:rPr>
-          <w:b/>
-          <w:bCs/>
-        </w:rPr>
-        <w:t>[25]</w:t>
-      </w:r>
-      <w:r>
-        <w:t xml:space="preserve"> P. He, X. Liu, J. Gao, and W. Chen, “DeBERTa: Decoding-Enhanced BERT with Disentangled Attention,” in Proc. International Conference on Learning Representations (ICLR), 2021.</w:t>
-      </w:r>
-    </w:p>
-    <w:p>
-      <w:r>
-        <w:rPr>
-          <w:b/>
-          <w:bCs/>
-        </w:rPr>
-        <w:t>[26]</w:t>
-      </w:r>
-      <w:r>
-        <w:t xml:space="preserve"> A. K. Meghana, H. Gupta, and P. Dubey, “Enhanced Text Extraction from Low-Quality Legacy Documents Using TrOCR Assisted by Line Detection,” in Proc. 8th World Engineering Conference on Contemporary Technologies (WECON), 2025, doi: 10.1109/WECON68556.2025.11414621.</w:t>
-      </w:r>
-    </w:p>
-    <w:p>
-      <w:r>
-        <w:rPr>
-          <w:b/>
-          <w:bCs/>
-        </w:rPr>
-        <w:t>[27]</w:t>
-      </w:r>
-      <w:r>
-        <w:t xml:space="preserve"> D. K. A, A. V. S, R. Aravindan, and A. Balamurali, "Sound Sight-A TTS and STT Integrated Model using OCR and ASR," in </w:t>
+        <w:t>Proceedings of the 2021 International Joint Conference on Neural Networks (IJCNN)</w:t>
+      </w:r>
+      <w:r>
+        <w:t xml:space="preserve">, 2021, </w:t>
+      </w:r>
+      <w:proofErr w:type="spellStart"/>
+      <w:r>
+        <w:t>doi</w:t>
+      </w:r>
+      <w:proofErr w:type="spellEnd"/>
+      <w:r>
+        <w:t>: 10.1109/IJCNN52387.2021.9533505.</w:t>
+      </w:r>
+    </w:p>
+    <w:p>
+      <w:r>
+        <w:rPr>
+          <w:b/>
+          <w:bCs/>
+        </w:rPr>
+        <w:t>[23]</w:t>
+      </w:r>
+      <w:r>
+        <w:t xml:space="preserve"> C. A. L. Baclayon, K. O. R. Costelo, J. J. L. Flores, and C. L. C. Sta. Romana, "Automated Handwritten Essay Evaluation in Moodle: Leveraging Google Vision OCR and Mistral 7B," in </w:t>
       </w:r>
       <w:r>
         <w:rPr>
           <w:i/>
           <w:iCs/>
         </w:rPr>
-        <w:t>2024 International Conference on Innovative Computing, Intelligent Communication and Smart Electrical Systems (ICSES)</w:t>
-      </w:r>
-      <w:r>
-        <w:t>, Chennai, India, Dec. 2024, pp. 1–5. doi: 10.1109/ICSES63760.2024.10910492</w:t>
-      </w:r>
-    </w:p>
-    <w:p>
-      <w:r>
-        <w:rPr>
-          <w:b/>
-          <w:bCs/>
-        </w:rPr>
-        <w:t>[28]</w:t>
-      </w:r>
-      <w:r>
-        <w:t xml:space="preserve"> J. C. Obi, "A comparative study of several classification metrics and their performances on data," </w:t>
+        <w:t>Proceedings of ICDTE 2024</w:t>
+      </w:r>
+      <w:r>
+        <w:t xml:space="preserve">, ACM, Berlin, Germany, Aug. 07–09, 2024, </w:t>
+      </w:r>
+      <w:proofErr w:type="spellStart"/>
+      <w:r>
+        <w:t>doi</w:t>
+      </w:r>
+      <w:proofErr w:type="spellEnd"/>
+      <w:r>
+        <w:t>: 10.1145/3696230.3696256.</w:t>
+      </w:r>
+    </w:p>
+    <w:p>
+      <w:r>
+        <w:rPr>
+          <w:b/>
+          <w:bCs/>
+        </w:rPr>
+        <w:t>[24]</w:t>
+      </w:r>
+      <w:r>
+        <w:t xml:space="preserve"> Y. Wang, W. Qu, and X. Ye, “Selecting Between BERT and GPT for Text Classification in Political Science Research,” </w:t>
+      </w:r>
+      <w:proofErr w:type="spellStart"/>
+      <w:r>
+        <w:t>arXiv</w:t>
+      </w:r>
+      <w:proofErr w:type="spellEnd"/>
+      <w:r>
+        <w:t xml:space="preserve"> preprint arXiv:2411.05050, Nov. 2024. </w:t>
+      </w:r>
+      <w:proofErr w:type="spellStart"/>
+      <w:r>
+        <w:t>doi</w:t>
+      </w:r>
+      <w:proofErr w:type="spellEnd"/>
+      <w:r>
+        <w:t>: 10.48550/arXiv.2411.05050.</w:t>
+      </w:r>
+    </w:p>
+    <w:p>
+      <w:r>
+        <w:rPr>
+          <w:b/>
+          <w:bCs/>
+        </w:rPr>
+        <w:t>[25]</w:t>
+      </w:r>
+      <w:r>
+        <w:t xml:space="preserve"> P. He, X. Liu, J. Gao, and W. Chen, “</w:t>
+      </w:r>
+      <w:proofErr w:type="spellStart"/>
+      <w:r>
+        <w:t>DeBERTa</w:t>
+      </w:r>
+      <w:proofErr w:type="spellEnd"/>
+      <w:r>
+        <w:t>: Decoding-Enhanced BERT with Disentangled Attention,” in Proc. International Conference on Learning Representations (ICLR), 2021.</w:t>
+      </w:r>
+    </w:p>
+    <w:p>
+      <w:r>
+        <w:rPr>
+          <w:b/>
+          <w:bCs/>
+        </w:rPr>
+        <w:t>[26]</w:t>
+      </w:r>
+      <w:r>
+        <w:t xml:space="preserve"> A. K. Meghana, H. Gupta, and P. Dubey, “Enhanced Text Extraction from Low-Quality Legacy Documents Using </w:t>
+      </w:r>
+      <w:proofErr w:type="spellStart"/>
+      <w:r>
+        <w:t>TrOCR</w:t>
+      </w:r>
+      <w:proofErr w:type="spellEnd"/>
+      <w:r>
+        <w:t xml:space="preserve"> Assisted by Line Detection,” in Proc. 8th World Engineering Conference on Contemporary Technologies (WECON), 2025, </w:t>
+      </w:r>
+      <w:proofErr w:type="spellStart"/>
+      <w:r>
+        <w:t>doi</w:t>
+      </w:r>
+      <w:proofErr w:type="spellEnd"/>
+      <w:r>
+        <w:t>: 10.1109/WECON68556.2025.11414621.</w:t>
+      </w:r>
+    </w:p>
+    <w:p>
+      <w:r>
+        <w:rPr>
+          <w:b/>
+          <w:bCs/>
+        </w:rPr>
+        <w:t>[27]</w:t>
+      </w:r>
+      <w:r>
+        <w:t xml:space="preserve"> D. K. A, A. V. S, R. Aravindan, and A. Balamurali, "Sound Sight-A TTS and STT Integrated Model using OCR and ASR," in </w:t>
       </w:r>
       <w:r>
         <w:rPr>
           <w:i/>
           <w:iCs/>
         </w:rPr>
-        <w:t>World Journal of Advanced Engineering Technology and Sciences</w:t>
-      </w:r>
-      <w:r>
-        <w:t>, vol. 8, no. 1, pp. 308–314, Feb. 2023, doi: 10.30574/wjaets.2023.8.1.0054.</w:t>
-      </w:r>
-    </w:p>
-    <w:p>
-      <w:r>
-        <w:rPr>
-          <w:b/>
-          <w:bCs/>
-        </w:rPr>
-        <w:t>[29]</w:t>
-      </w:r>
-      <w:r>
-        <w:t xml:space="preserve"> S. Sathyanarayanan and B. R. Tantri, "Confusion matrix-based performance evaluation metrics," </w:t>
+        <w:t>2024 International Conference on Innovative Computing, Intelligent Communication and Smart Electrical Systems (ICSES)</w:t>
+      </w:r>
+      <w:r>
+        <w:t xml:space="preserve">, Chennai, India, Dec. 2024, pp. 1–5. </w:t>
+      </w:r>
+      <w:proofErr w:type="spellStart"/>
+      <w:r>
+        <w:t>doi</w:t>
+      </w:r>
+      <w:proofErr w:type="spellEnd"/>
+      <w:r>
+        <w:t>: 10.1109/ICSES63760.2024.10910492</w:t>
+      </w:r>
+    </w:p>
+    <w:p>
+      <w:r>
+        <w:rPr>
+          <w:b/>
+          <w:bCs/>
+        </w:rPr>
+        <w:t>[28]</w:t>
+      </w:r>
+      <w:r>
+        <w:t xml:space="preserve"> J. C. Obi, "A comparative study of several classification metrics and their performances on data," </w:t>
       </w:r>
       <w:r>
         <w:rPr>
           <w:i/>
           <w:iCs/>
         </w:rPr>
-        <w:t>African Journal of Biomedical Research</w:t>
-      </w:r>
-      <w:r>
-        <w:t>, vol. 27, no. 4S, pp. 4023–4031, Nov. 2024, doi: 10.53555/AJBR.v27i4S.4345</w:t>
-      </w:r>
-    </w:p>
-    <w:p>
-      <w:r>
-        <w:rPr>
-          <w:b/>
-          <w:bCs/>
-        </w:rPr>
-        <w:t>[30]</w:t>
-      </w:r>
-      <w:r>
-        <w:t xml:space="preserve"> G. M. Foody, "Challenges in the </w:t>
-      </w:r>
-      <w:r>
-        <w:t>real-world</w:t>
-      </w:r>
-      <w:r>
-        <w:t xml:space="preserve"> use of classification accuracy metrics: From recall and precision to the Matthews correlation coefficient," </w:t>
+        <w:t>World Journal of Advanced Engineering Technology and Sciences</w:t>
+      </w:r>
+      <w:r>
+        <w:t xml:space="preserve">, vol. 8, no. 1, pp. 308–314, Feb. 2023, </w:t>
+      </w:r>
+      <w:proofErr w:type="spellStart"/>
+      <w:r>
+        <w:t>doi</w:t>
+      </w:r>
+      <w:proofErr w:type="spellEnd"/>
+      <w:r>
+        <w:t>: 10.30574/wjaets.2023.8.1.0054.</w:t>
+      </w:r>
+    </w:p>
+    <w:p>
+      <w:r>
+        <w:rPr>
+          <w:b/>
+          <w:bCs/>
+        </w:rPr>
+        <w:t>[29]</w:t>
+      </w:r>
+      <w:r>
+        <w:t xml:space="preserve"> S. Sathyanarayanan and B. R. Tantri, "Confusion matrix-based performance evaluation metrics," </w:t>
       </w:r>
       <w:r>
         <w:rPr>
           <w:i/>
           <w:iCs/>
         </w:rPr>
-        <w:t>PLoS ONE</w:t>
-      </w:r>
-      <w:r>
-        <w:t>, vol. 18, no. 10, Art. no. e0291908, Oct. 2023, doi: 10.1371/journal.pone.0291908.</w:t>
+        <w:t>African Journal of Biomedical Research</w:t>
+      </w:r>
+      <w:r>
+        <w:t xml:space="preserve">, vol. 27, no. 4S, pp. 4023–4031, Nov. 2024, </w:t>
+      </w:r>
+      <w:proofErr w:type="spellStart"/>
+      <w:r>
+        <w:t>doi</w:t>
+      </w:r>
+      <w:proofErr w:type="spellEnd"/>
+      <w:r>
+        <w:t>: 10.53555/AJBR.v27i4S.4345</w:t>
+      </w:r>
+    </w:p>
+    <w:p>
+      <w:r>
+        <w:rPr>
+          <w:b/>
+          <w:bCs/>
+        </w:rPr>
+        <w:t>[30]</w:t>
+      </w:r>
+      <w:r>
+        <w:t xml:space="preserve"> G. M. Foody, "Challenges in the </w:t>
+      </w:r>
+      <w:r>
+        <w:t>real-world</w:t>
+      </w:r>
+      <w:r>
+        <w:t xml:space="preserve"> use of classification accuracy metrics: From recall and precision to the Matthews correlation coefficient," </w:t>
+      </w:r>
+      <w:proofErr w:type="spellStart"/>
+      <w:r>
+        <w:rPr>
+          <w:i/>
+          <w:iCs/>
+        </w:rPr>
+        <w:t>PLoS</w:t>
+      </w:r>
+      <w:proofErr w:type="spellEnd"/>
+      <w:r>
+        <w:rPr>
+          <w:i/>
+          <w:iCs/>
+        </w:rPr>
+        <w:t xml:space="preserve"> ONE</w:t>
+      </w:r>
+      <w:r>
+        <w:t xml:space="preserve">, vol. 18, no. 10, Art. no. e0291908, Oct. 2023, </w:t>
+      </w:r>
+      <w:proofErr w:type="spellStart"/>
+      <w:r>
+        <w:t>doi</w:t>
+      </w:r>
+      <w:proofErr w:type="spellEnd"/>
+      <w:r>
+        <w:t>: 10.1371/journal.pone.0291908.</w:t>
       </w:r>
     </w:p>
     <w:p>
@@ -20320,7 +22079,23 @@
         <w:t>[31]</w:t>
       </w:r>
       <w:r>
-        <w:t xml:space="preserve"> A. N. Chowdhury, S. Absar, A. A. Sami, F. Rahman, S. M. P. Mamun, and M. S. R. Kohinoor, "Performance analysis of Tesseract and EasyOCR for Bangla optical character recognition on the novel Bangla CrossHair dataset," in </w:t>
+        <w:t xml:space="preserve"> A. N. Chowdhury, S. Absar, A. A. Sami, F. Rahman, S. M. P. Mamun, and M. S. R. Kohinoor, "Performance analysis of Tesseract and </w:t>
+      </w:r>
+      <w:proofErr w:type="spellStart"/>
+      <w:r>
+        <w:t>EasyOCR</w:t>
+      </w:r>
+      <w:proofErr w:type="spellEnd"/>
+      <w:r>
+        <w:t xml:space="preserve"> for Bangla optical character recognition on the novel Bangla </w:t>
+      </w:r>
+      <w:proofErr w:type="spellStart"/>
+      <w:r>
+        <w:t>CrossHair</w:t>
+      </w:r>
+      <w:proofErr w:type="spellEnd"/>
+      <w:r>
+        <w:t xml:space="preserve"> dataset," in </w:t>
       </w:r>
       <w:r>
         <w:rPr>
@@ -20330,7 +22105,15 @@
         <w:t>Proc. 2025 3rd Int. Conf. on Intelligent Systems, Advanced Computing and Communication (ISACC)</w:t>
       </w:r>
       <w:r>
-        <w:t>, 2025, pp. 1–6, doi: 10.1109/ISACC65211.2025.10969286.</w:t>
+        <w:t xml:space="preserve">, 2025, pp. 1–6, </w:t>
+      </w:r>
+      <w:proofErr w:type="spellStart"/>
+      <w:r>
+        <w:t>doi</w:t>
+      </w:r>
+      <w:proofErr w:type="spellEnd"/>
+      <w:r>
+        <w:t>: 10.1109/ISACC65211.2025.10969286.</w:t>
       </w:r>
     </w:p>
     <w:p>
@@ -20342,7 +22125,23 @@
         <w:t>[32]</w:t>
       </w:r>
       <w:r>
-        <w:t xml:space="preserve"> M. A. N. Hadi, M. Gul, M. Khan, G. N. Alwakid, and N. Z. Jhanjhi, "Benchmarking performance analysis of optical character recognition techniques," in </w:t>
+        <w:t xml:space="preserve"> M. A. N. Hadi, M. Gul, M. Khan, G. N. </w:t>
+      </w:r>
+      <w:proofErr w:type="spellStart"/>
+      <w:r>
+        <w:t>Alwakid</w:t>
+      </w:r>
+      <w:proofErr w:type="spellEnd"/>
+      <w:r>
+        <w:t xml:space="preserve">, and N. Z. </w:t>
+      </w:r>
+      <w:proofErr w:type="spellStart"/>
+      <w:r>
+        <w:t>Jhanjhi</w:t>
+      </w:r>
+      <w:proofErr w:type="spellEnd"/>
+      <w:r>
+        <w:t xml:space="preserve">, "Benchmarking performance analysis of optical character recognition techniques," in </w:t>
       </w:r>
       <w:r>
         <w:rPr>
@@ -20352,7 +22151,15 @@
         <w:t>Proc. 26th Int. Multitopic Conf. (INMIC)</w:t>
       </w:r>
       <w:r>
-        <w:t>, Karachi, Pakistan, Dec. 2024, pp. 1–6, doi: 10.1109/INMIC64792.2024.11004392.</w:t>
+        <w:t xml:space="preserve">, Karachi, Pakistan, Dec. 2024, pp. 1–6, </w:t>
+      </w:r>
+      <w:proofErr w:type="spellStart"/>
+      <w:r>
+        <w:t>doi</w:t>
+      </w:r>
+      <w:proofErr w:type="spellEnd"/>
+      <w:r>
+        <w:t>: 10.1109/INMIC64792.2024.11004392.</w:t>
       </w:r>
     </w:p>
     <w:sectPr>

</xml_diff>